<commit_message>
Entrega 3: enlace del vídeo, fecha y guion final
Co-Authored-By: Claude Opus 5.5 <noreply@anthropic.com>
</commit_message>
<xml_diff>
--- a/docs/entrega-3/Entrega-3-Entrega-Final-Pulso-Digital.docx
+++ b/docs/entrega-3/Entrega-3-Entrega-Final-Pulso-Digital.docx
@@ -66,10 +66,10 @@
         <w:jc w:val="center"/>
       </w:pPr>
       <w:r>
-        <w:t xml:space="preserve">27 de </w:t>
-      </w:r>
-      <w:r>
-        <w:t>septiembre de 2026</w:t>
+        <w:t xml:space="preserve">4 de octubre de </w:t>
+      </w:r>
+      <w:r>
+        <w:t>2026</w:t>
       </w:r>
     </w:p>
     <w:p>
@@ -96,12 +96,7 @@
           <w:tab w:val="right" w:leader="dot" w:pos="9350"/>
         </w:tabs>
         <w:rPr>
-          <w:rFonts w:asciiTheme="minorHAnsi" w:eastAsiaTheme="minorEastAsia" w:hAnsiTheme="minorHAnsi"/>
           <w:noProof/>
-          <w:kern w:val="2"/>
-          <w:szCs w:val="24"/>
-          <w:lang w:val="es-CO" w:eastAsia="es-CO"/>
-          <w14:ligatures w14:val="standardContextual"/>
         </w:rPr>
       </w:pPr>
       <w:r>
@@ -113,7 +108,7 @@
       <w:r>
         <w:fldChar w:fldCharType="separate"/>
       </w:r>
-      <w:hyperlink w:anchor="_Toc241424167" w:history="1">
+      <w:hyperlink w:anchor="_Toc242002963" w:history="1">
         <w:r>
           <w:rPr>
             <w:rStyle w:val="Hipervnculo"/>
@@ -141,7 +136,7 @@
             <w:noProof/>
             <w:webHidden/>
           </w:rPr>
-          <w:instrText xml:space="preserve"> PAGEREF _Toc241424167 \h </w:instrText>
+          <w:instrText xml:space="preserve"> PAGEREF _Toc242002963 \h </w:instrText>
         </w:r>
         <w:r>
           <w:rPr>
@@ -179,15 +174,10 @@
           <w:tab w:val="right" w:leader="dot" w:pos="9350"/>
         </w:tabs>
         <w:rPr>
-          <w:rFonts w:asciiTheme="minorHAnsi" w:eastAsiaTheme="minorEastAsia" w:hAnsiTheme="minorHAnsi"/>
           <w:noProof/>
-          <w:kern w:val="2"/>
-          <w:szCs w:val="24"/>
-          <w:lang w:val="es-CO" w:eastAsia="es-CO"/>
-          <w14:ligatures w14:val="standardContextual"/>
-        </w:rPr>
-      </w:pPr>
-      <w:hyperlink w:anchor="_Toc241424168" w:history="1">
+        </w:rPr>
+      </w:pPr>
+      <w:hyperlink w:anchor="_Toc242002964" w:history="1">
         <w:r>
           <w:rPr>
             <w:rStyle w:val="Hipervnculo"/>
@@ -215,7 +205,7 @@
             <w:noProof/>
             <w:webHidden/>
           </w:rPr>
-          <w:instrText xml:space="preserve"> PAGEREF _Toc241424168 \h </w:instrText>
+          <w:instrText xml:space="preserve"> PAGEREF _Toc242002964 \h </w:instrText>
         </w:r>
         <w:r>
           <w:rPr>
@@ -253,15 +243,10 @@
           <w:tab w:val="right" w:leader="dot" w:pos="9350"/>
         </w:tabs>
         <w:rPr>
-          <w:rFonts w:asciiTheme="minorHAnsi" w:eastAsiaTheme="minorEastAsia" w:hAnsiTheme="minorHAnsi"/>
           <w:noProof/>
-          <w:kern w:val="2"/>
-          <w:szCs w:val="24"/>
-          <w:lang w:val="es-CO" w:eastAsia="es-CO"/>
-          <w14:ligatures w14:val="standardContextual"/>
-        </w:rPr>
-      </w:pPr>
-      <w:hyperlink w:anchor="_Toc241424169" w:history="1">
+        </w:rPr>
+      </w:pPr>
+      <w:hyperlink w:anchor="_Toc242002965" w:history="1">
         <w:r>
           <w:rPr>
             <w:rStyle w:val="Hipervnculo"/>
@@ -289,7 +274,7 @@
             <w:noProof/>
             <w:webHidden/>
           </w:rPr>
-          <w:instrText xml:space="preserve"> PAGEREF _Toc241424169 \h </w:instrText>
+          <w:instrText xml:space="preserve"> PAGEREF _Toc242002965 \h </w:instrText>
         </w:r>
         <w:r>
           <w:rPr>
@@ -327,15 +312,10 @@
           <w:tab w:val="right" w:leader="dot" w:pos="9350"/>
         </w:tabs>
         <w:rPr>
-          <w:rFonts w:asciiTheme="minorHAnsi" w:eastAsiaTheme="minorEastAsia" w:hAnsiTheme="minorHAnsi"/>
           <w:noProof/>
-          <w:kern w:val="2"/>
-          <w:szCs w:val="24"/>
-          <w:lang w:val="es-CO" w:eastAsia="es-CO"/>
-          <w14:ligatures w14:val="standardContextual"/>
-        </w:rPr>
-      </w:pPr>
-      <w:hyperlink w:anchor="_Toc241424170" w:history="1">
+        </w:rPr>
+      </w:pPr>
+      <w:hyperlink w:anchor="_Toc242002966" w:history="1">
         <w:r>
           <w:rPr>
             <w:rStyle w:val="Hipervnculo"/>
@@ -363,7 +343,7 @@
             <w:noProof/>
             <w:webHidden/>
           </w:rPr>
-          <w:instrText xml:space="preserve"> PAGEREF _Toc241424170 \h </w:instrText>
+          <w:instrText xml:space="preserve"> PAGEREF _Toc242002966 \h </w:instrText>
         </w:r>
         <w:r>
           <w:rPr>
@@ -401,15 +381,10 @@
           <w:tab w:val="right" w:leader="dot" w:pos="9350"/>
         </w:tabs>
         <w:rPr>
-          <w:rFonts w:asciiTheme="minorHAnsi" w:eastAsiaTheme="minorEastAsia" w:hAnsiTheme="minorHAnsi"/>
           <w:noProof/>
-          <w:kern w:val="2"/>
-          <w:szCs w:val="24"/>
-          <w:lang w:val="es-CO" w:eastAsia="es-CO"/>
-          <w14:ligatures w14:val="standardContextual"/>
-        </w:rPr>
-      </w:pPr>
-      <w:hyperlink w:anchor="_Toc241424171" w:history="1">
+        </w:rPr>
+      </w:pPr>
+      <w:hyperlink w:anchor="_Toc242002967" w:history="1">
         <w:r>
           <w:rPr>
             <w:rStyle w:val="Hipervnculo"/>
@@ -437,7 +412,7 @@
             <w:noProof/>
             <w:webHidden/>
           </w:rPr>
-          <w:instrText xml:space="preserve"> PAGEREF _Toc241424171 \h </w:instrText>
+          <w:instrText xml:space="preserve"> PAGEREF _Toc242002967 \h </w:instrText>
         </w:r>
         <w:r>
           <w:rPr>
@@ -475,15 +450,10 @@
           <w:tab w:val="right" w:leader="dot" w:pos="9350"/>
         </w:tabs>
         <w:rPr>
-          <w:rFonts w:asciiTheme="minorHAnsi" w:eastAsiaTheme="minorEastAsia" w:hAnsiTheme="minorHAnsi"/>
           <w:noProof/>
-          <w:kern w:val="2"/>
-          <w:szCs w:val="24"/>
-          <w:lang w:val="es-CO" w:eastAsia="es-CO"/>
-          <w14:ligatures w14:val="standardContextual"/>
-        </w:rPr>
-      </w:pPr>
-      <w:hyperlink w:anchor="_Toc241424172" w:history="1">
+        </w:rPr>
+      </w:pPr>
+      <w:hyperlink w:anchor="_Toc242002968" w:history="1">
         <w:r>
           <w:rPr>
             <w:rStyle w:val="Hipervnculo"/>
@@ -511,7 +481,7 @@
             <w:noProof/>
             <w:webHidden/>
           </w:rPr>
-          <w:instrText xml:space="preserve"> PAGEREF _Toc241424172 \h </w:instrText>
+          <w:instrText xml:space="preserve"> PAGEREF _Toc242002968 \h </w:instrText>
         </w:r>
         <w:r>
           <w:rPr>
@@ -549,15 +519,10 @@
           <w:tab w:val="right" w:leader="dot" w:pos="9350"/>
         </w:tabs>
         <w:rPr>
-          <w:rFonts w:asciiTheme="minorHAnsi" w:eastAsiaTheme="minorEastAsia" w:hAnsiTheme="minorHAnsi"/>
           <w:noProof/>
-          <w:kern w:val="2"/>
-          <w:szCs w:val="24"/>
-          <w:lang w:val="es-CO" w:eastAsia="es-CO"/>
-          <w14:ligatures w14:val="standardContextual"/>
-        </w:rPr>
-      </w:pPr>
-      <w:hyperlink w:anchor="_Toc241424173" w:history="1">
+        </w:rPr>
+      </w:pPr>
+      <w:hyperlink w:anchor="_Toc242002969" w:history="1">
         <w:r>
           <w:rPr>
             <w:rStyle w:val="Hipervnculo"/>
@@ -585,7 +550,7 @@
             <w:noProof/>
             <w:webHidden/>
           </w:rPr>
-          <w:instrText xml:space="preserve"> PAGEREF _Toc241424173 \h </w:instrText>
+          <w:instrText xml:space="preserve"> PAGEREF _Toc242002969 \h </w:instrText>
         </w:r>
         <w:r>
           <w:rPr>
@@ -623,15 +588,10 @@
           <w:tab w:val="right" w:leader="dot" w:pos="9350"/>
         </w:tabs>
         <w:rPr>
-          <w:rFonts w:asciiTheme="minorHAnsi" w:eastAsiaTheme="minorEastAsia" w:hAnsiTheme="minorHAnsi"/>
           <w:noProof/>
-          <w:kern w:val="2"/>
-          <w:szCs w:val="24"/>
-          <w:lang w:val="es-CO" w:eastAsia="es-CO"/>
-          <w14:ligatures w14:val="standardContextual"/>
-        </w:rPr>
-      </w:pPr>
-      <w:hyperlink w:anchor="_Toc241424174" w:history="1">
+        </w:rPr>
+      </w:pPr>
+      <w:hyperlink w:anchor="_Toc242002970" w:history="1">
         <w:r>
           <w:rPr>
             <w:rStyle w:val="Hipervnculo"/>
@@ -659,7 +619,7 @@
             <w:noProof/>
             <w:webHidden/>
           </w:rPr>
-          <w:instrText xml:space="preserve"> PAGEREF _Toc241424174 \h </w:instrText>
+          <w:instrText xml:space="preserve"> PAGEREF _Toc242002970 \h </w:instrText>
         </w:r>
         <w:r>
           <w:rPr>
@@ -697,15 +657,10 @@
           <w:tab w:val="right" w:leader="dot" w:pos="9350"/>
         </w:tabs>
         <w:rPr>
-          <w:rFonts w:asciiTheme="minorHAnsi" w:eastAsiaTheme="minorEastAsia" w:hAnsiTheme="minorHAnsi"/>
           <w:noProof/>
-          <w:kern w:val="2"/>
-          <w:szCs w:val="24"/>
-          <w:lang w:val="es-CO" w:eastAsia="es-CO"/>
-          <w14:ligatures w14:val="standardContextual"/>
-        </w:rPr>
-      </w:pPr>
-      <w:hyperlink w:anchor="_Toc241424175" w:history="1">
+        </w:rPr>
+      </w:pPr>
+      <w:hyperlink w:anchor="_Toc242002971" w:history="1">
         <w:r>
           <w:rPr>
             <w:rStyle w:val="Hipervnculo"/>
@@ -733,7 +688,7 @@
             <w:noProof/>
             <w:webHidden/>
           </w:rPr>
-          <w:instrText xml:space="preserve"> PAGEREF _Toc241424175 \h </w:instrText>
+          <w:instrText xml:space="preserve"> PAGEREF _Toc242002971 \h </w:instrText>
         </w:r>
         <w:r>
           <w:rPr>
@@ -771,15 +726,10 @@
           <w:tab w:val="right" w:leader="dot" w:pos="9350"/>
         </w:tabs>
         <w:rPr>
-          <w:rFonts w:asciiTheme="minorHAnsi" w:eastAsiaTheme="minorEastAsia" w:hAnsiTheme="minorHAnsi"/>
           <w:noProof/>
-          <w:kern w:val="2"/>
-          <w:szCs w:val="24"/>
-          <w:lang w:val="es-CO" w:eastAsia="es-CO"/>
-          <w14:ligatures w14:val="standardContextual"/>
-        </w:rPr>
-      </w:pPr>
-      <w:hyperlink w:anchor="_Toc241424176" w:history="1">
+        </w:rPr>
+      </w:pPr>
+      <w:hyperlink w:anchor="_Toc242002972" w:history="1">
         <w:r>
           <w:rPr>
             <w:rStyle w:val="Hipervnculo"/>
@@ -807,7 +757,7 @@
             <w:noProof/>
             <w:webHidden/>
           </w:rPr>
-          <w:instrText xml:space="preserve"> PAGEREF _Toc241424176 \h </w:instrText>
+          <w:instrText xml:space="preserve"> PAGEREF _Toc242002972 \h </w:instrText>
         </w:r>
         <w:r>
           <w:rPr>
@@ -845,15 +795,10 @@
           <w:tab w:val="right" w:leader="dot" w:pos="9350"/>
         </w:tabs>
         <w:rPr>
-          <w:rFonts w:asciiTheme="minorHAnsi" w:eastAsiaTheme="minorEastAsia" w:hAnsiTheme="minorHAnsi"/>
           <w:noProof/>
-          <w:kern w:val="2"/>
-          <w:szCs w:val="24"/>
-          <w:lang w:val="es-CO" w:eastAsia="es-CO"/>
-          <w14:ligatures w14:val="standardContextual"/>
-        </w:rPr>
-      </w:pPr>
-      <w:hyperlink w:anchor="_Toc241424177" w:history="1">
+        </w:rPr>
+      </w:pPr>
+      <w:hyperlink w:anchor="_Toc242002973" w:history="1">
         <w:r>
           <w:rPr>
             <w:rStyle w:val="Hipervnculo"/>
@@ -881,7 +826,7 @@
             <w:noProof/>
             <w:webHidden/>
           </w:rPr>
-          <w:instrText xml:space="preserve"> PAGEREF _Toc241424177 \h </w:instrText>
+          <w:instrText xml:space="preserve"> PAGEREF _Toc242002973 \h </w:instrText>
         </w:r>
         <w:r>
           <w:rPr>
@@ -919,15 +864,10 @@
           <w:tab w:val="right" w:leader="dot" w:pos="9350"/>
         </w:tabs>
         <w:rPr>
-          <w:rFonts w:asciiTheme="minorHAnsi" w:eastAsiaTheme="minorEastAsia" w:hAnsiTheme="minorHAnsi"/>
           <w:noProof/>
-          <w:kern w:val="2"/>
-          <w:szCs w:val="24"/>
-          <w:lang w:val="es-CO" w:eastAsia="es-CO"/>
-          <w14:ligatures w14:val="standardContextual"/>
-        </w:rPr>
-      </w:pPr>
-      <w:hyperlink w:anchor="_Toc241424178" w:history="1">
+        </w:rPr>
+      </w:pPr>
+      <w:hyperlink w:anchor="_Toc242002974" w:history="1">
         <w:r>
           <w:rPr>
             <w:rStyle w:val="Hipervnculo"/>
@@ -955,7 +895,7 @@
             <w:noProof/>
             <w:webHidden/>
           </w:rPr>
-          <w:instrText xml:space="preserve"> PAGEREF _Toc241424178 \h </w:instrText>
+          <w:instrText xml:space="preserve"> PAGEREF _Toc242002974 \h </w:instrText>
         </w:r>
         <w:r>
           <w:rPr>
@@ -993,15 +933,10 @@
           <w:tab w:val="right" w:leader="dot" w:pos="9350"/>
         </w:tabs>
         <w:rPr>
-          <w:rFonts w:asciiTheme="minorHAnsi" w:eastAsiaTheme="minorEastAsia" w:hAnsiTheme="minorHAnsi"/>
           <w:noProof/>
-          <w:kern w:val="2"/>
-          <w:szCs w:val="24"/>
-          <w:lang w:val="es-CO" w:eastAsia="es-CO"/>
-          <w14:ligatures w14:val="standardContextual"/>
-        </w:rPr>
-      </w:pPr>
-      <w:hyperlink w:anchor="_Toc241424179" w:history="1">
+        </w:rPr>
+      </w:pPr>
+      <w:hyperlink w:anchor="_Toc242002975" w:history="1">
         <w:r>
           <w:rPr>
             <w:rStyle w:val="Hipervnculo"/>
@@ -1029,7 +964,7 @@
             <w:noProof/>
             <w:webHidden/>
           </w:rPr>
-          <w:instrText xml:space="preserve"> PAGEREF _Toc241424179 \h </w:instrText>
+          <w:instrText xml:space="preserve"> PAGEREF _Toc242002975 \h </w:instrText>
         </w:r>
         <w:r>
           <w:rPr>
@@ -1067,15 +1002,10 @@
           <w:tab w:val="right" w:leader="dot" w:pos="9350"/>
         </w:tabs>
         <w:rPr>
-          <w:rFonts w:asciiTheme="minorHAnsi" w:eastAsiaTheme="minorEastAsia" w:hAnsiTheme="minorHAnsi"/>
           <w:noProof/>
-          <w:kern w:val="2"/>
-          <w:szCs w:val="24"/>
-          <w:lang w:val="es-CO" w:eastAsia="es-CO"/>
-          <w14:ligatures w14:val="standardContextual"/>
-        </w:rPr>
-      </w:pPr>
-      <w:hyperlink w:anchor="_Toc241424180" w:history="1">
+        </w:rPr>
+      </w:pPr>
+      <w:hyperlink w:anchor="_Toc242002976" w:history="1">
         <w:r>
           <w:rPr>
             <w:rStyle w:val="Hipervnculo"/>
@@ -1103,7 +1033,7 @@
             <w:noProof/>
             <w:webHidden/>
           </w:rPr>
-          <w:instrText xml:space="preserve"> PAGEREF _Toc241424180 \h </w:instrText>
+          <w:instrText xml:space="preserve"> PAGEREF _Toc242002976 \h </w:instrText>
         </w:r>
         <w:r>
           <w:rPr>
@@ -1141,15 +1071,10 @@
           <w:tab w:val="right" w:leader="dot" w:pos="9350"/>
         </w:tabs>
         <w:rPr>
-          <w:rFonts w:asciiTheme="minorHAnsi" w:eastAsiaTheme="minorEastAsia" w:hAnsiTheme="minorHAnsi"/>
           <w:noProof/>
-          <w:kern w:val="2"/>
-          <w:szCs w:val="24"/>
-          <w:lang w:val="es-CO" w:eastAsia="es-CO"/>
-          <w14:ligatures w14:val="standardContextual"/>
-        </w:rPr>
-      </w:pPr>
-      <w:hyperlink w:anchor="_Toc241424181" w:history="1">
+        </w:rPr>
+      </w:pPr>
+      <w:hyperlink w:anchor="_Toc242002977" w:history="1">
         <w:r>
           <w:rPr>
             <w:rStyle w:val="Hipervnculo"/>
@@ -1177,7 +1102,7 @@
             <w:noProof/>
             <w:webHidden/>
           </w:rPr>
-          <w:instrText xml:space="preserve"> PAGEREF _Toc241424181 \h </w:instrText>
+          <w:instrText xml:space="preserve"> PAGEREF _Toc242002977 \h </w:instrText>
         </w:r>
         <w:r>
           <w:rPr>
@@ -1215,15 +1140,10 @@
           <w:tab w:val="right" w:leader="dot" w:pos="9350"/>
         </w:tabs>
         <w:rPr>
-          <w:rFonts w:asciiTheme="minorHAnsi" w:eastAsiaTheme="minorEastAsia" w:hAnsiTheme="minorHAnsi"/>
           <w:noProof/>
-          <w:kern w:val="2"/>
-          <w:szCs w:val="24"/>
-          <w:lang w:val="es-CO" w:eastAsia="es-CO"/>
-          <w14:ligatures w14:val="standardContextual"/>
-        </w:rPr>
-      </w:pPr>
-      <w:hyperlink w:anchor="_Toc241424182" w:history="1">
+        </w:rPr>
+      </w:pPr>
+      <w:hyperlink w:anchor="_Toc242002978" w:history="1">
         <w:r>
           <w:rPr>
             <w:rStyle w:val="Hipervnculo"/>
@@ -1251,7 +1171,7 @@
             <w:noProof/>
             <w:webHidden/>
           </w:rPr>
-          <w:instrText xml:space="preserve"> PAGEREF _Toc241424182 \h </w:instrText>
+          <w:instrText xml:space="preserve"> PAGEREF _Toc242002978 \h </w:instrText>
         </w:r>
         <w:r>
           <w:rPr>
@@ -1289,15 +1209,10 @@
           <w:tab w:val="right" w:leader="dot" w:pos="9350"/>
         </w:tabs>
         <w:rPr>
-          <w:rFonts w:asciiTheme="minorHAnsi" w:eastAsiaTheme="minorEastAsia" w:hAnsiTheme="minorHAnsi"/>
           <w:noProof/>
-          <w:kern w:val="2"/>
-          <w:szCs w:val="24"/>
-          <w:lang w:val="es-CO" w:eastAsia="es-CO"/>
-          <w14:ligatures w14:val="standardContextual"/>
-        </w:rPr>
-      </w:pPr>
-      <w:hyperlink w:anchor="_Toc241424183" w:history="1">
+        </w:rPr>
+      </w:pPr>
+      <w:hyperlink w:anchor="_Toc242002979" w:history="1">
         <w:r>
           <w:rPr>
             <w:rStyle w:val="Hipervnculo"/>
@@ -1325,7 +1240,7 @@
             <w:noProof/>
             <w:webHidden/>
           </w:rPr>
-          <w:instrText xml:space="preserve"> PAGEREF _Toc241424183 \h </w:instrText>
+          <w:instrText xml:space="preserve"> PAGEREF _Toc242002979 \h </w:instrText>
         </w:r>
         <w:r>
           <w:rPr>
@@ -1363,15 +1278,10 @@
           <w:tab w:val="right" w:leader="dot" w:pos="9350"/>
         </w:tabs>
         <w:rPr>
-          <w:rFonts w:asciiTheme="minorHAnsi" w:eastAsiaTheme="minorEastAsia" w:hAnsiTheme="minorHAnsi"/>
           <w:noProof/>
-          <w:kern w:val="2"/>
-          <w:szCs w:val="24"/>
-          <w:lang w:val="es-CO" w:eastAsia="es-CO"/>
-          <w14:ligatures w14:val="standardContextual"/>
-        </w:rPr>
-      </w:pPr>
-      <w:hyperlink w:anchor="_Toc241424184" w:history="1">
+        </w:rPr>
+      </w:pPr>
+      <w:hyperlink w:anchor="_Toc242002980" w:history="1">
         <w:r>
           <w:rPr>
             <w:rStyle w:val="Hipervnculo"/>
@@ -1399,7 +1309,7 @@
             <w:noProof/>
             <w:webHidden/>
           </w:rPr>
-          <w:instrText xml:space="preserve"> PAGEREF _Toc241424184 \h </w:instrText>
+          <w:instrText xml:space="preserve"> PAGEREF _Toc242002980 \h </w:instrText>
         </w:r>
         <w:r>
           <w:rPr>
@@ -1437,15 +1347,10 @@
           <w:tab w:val="right" w:leader="dot" w:pos="9350"/>
         </w:tabs>
         <w:rPr>
-          <w:rFonts w:asciiTheme="minorHAnsi" w:eastAsiaTheme="minorEastAsia" w:hAnsiTheme="minorHAnsi"/>
           <w:noProof/>
-          <w:kern w:val="2"/>
-          <w:szCs w:val="24"/>
-          <w:lang w:val="es-CO" w:eastAsia="es-CO"/>
-          <w14:ligatures w14:val="standardContextual"/>
-        </w:rPr>
-      </w:pPr>
-      <w:hyperlink w:anchor="_Toc241424185" w:history="1">
+        </w:rPr>
+      </w:pPr>
+      <w:hyperlink w:anchor="_Toc242002981" w:history="1">
         <w:r>
           <w:rPr>
             <w:rStyle w:val="Hipervnculo"/>
@@ -1473,7 +1378,7 @@
             <w:noProof/>
             <w:webHidden/>
           </w:rPr>
-          <w:instrText xml:space="preserve"> PAGEREF _Toc241424185 \h </w:instrText>
+          <w:instrText xml:space="preserve"> PAGEREF _Toc242002981 \h </w:instrText>
         </w:r>
         <w:r>
           <w:rPr>
@@ -1511,15 +1416,10 @@
           <w:tab w:val="right" w:leader="dot" w:pos="9350"/>
         </w:tabs>
         <w:rPr>
-          <w:rFonts w:asciiTheme="minorHAnsi" w:eastAsiaTheme="minorEastAsia" w:hAnsiTheme="minorHAnsi"/>
           <w:noProof/>
-          <w:kern w:val="2"/>
-          <w:szCs w:val="24"/>
-          <w:lang w:val="es-CO" w:eastAsia="es-CO"/>
-          <w14:ligatures w14:val="standardContextual"/>
-        </w:rPr>
-      </w:pPr>
-      <w:hyperlink w:anchor="_Toc241424186" w:history="1">
+        </w:rPr>
+      </w:pPr>
+      <w:hyperlink w:anchor="_Toc242002982" w:history="1">
         <w:r>
           <w:rPr>
             <w:rStyle w:val="Hipervnculo"/>
@@ -1547,7 +1447,7 @@
             <w:noProof/>
             <w:webHidden/>
           </w:rPr>
-          <w:instrText xml:space="preserve"> PAGEREF _Toc241424186 \h </w:instrText>
+          <w:instrText xml:space="preserve"> PAGEREF _Toc242002982 \h </w:instrText>
         </w:r>
         <w:r>
           <w:rPr>
@@ -1585,15 +1485,10 @@
           <w:tab w:val="right" w:leader="dot" w:pos="9350"/>
         </w:tabs>
         <w:rPr>
-          <w:rFonts w:asciiTheme="minorHAnsi" w:eastAsiaTheme="minorEastAsia" w:hAnsiTheme="minorHAnsi"/>
           <w:noProof/>
-          <w:kern w:val="2"/>
-          <w:szCs w:val="24"/>
-          <w:lang w:val="es-CO" w:eastAsia="es-CO"/>
-          <w14:ligatures w14:val="standardContextual"/>
-        </w:rPr>
-      </w:pPr>
-      <w:hyperlink w:anchor="_Toc241424187" w:history="1">
+        </w:rPr>
+      </w:pPr>
+      <w:hyperlink w:anchor="_Toc242002983" w:history="1">
         <w:r>
           <w:rPr>
             <w:rStyle w:val="Hipervnculo"/>
@@ -1621,7 +1516,7 @@
             <w:noProof/>
             <w:webHidden/>
           </w:rPr>
-          <w:instrText xml:space="preserve"> PAGEREF _Toc241424187 \h </w:instrText>
+          <w:instrText xml:space="preserve"> PAGEREF _Toc242002983 \h </w:instrText>
         </w:r>
         <w:r>
           <w:rPr>
@@ -1659,15 +1554,10 @@
           <w:tab w:val="right" w:leader="dot" w:pos="9350"/>
         </w:tabs>
         <w:rPr>
-          <w:rFonts w:asciiTheme="minorHAnsi" w:eastAsiaTheme="minorEastAsia" w:hAnsiTheme="minorHAnsi"/>
           <w:noProof/>
-          <w:kern w:val="2"/>
-          <w:szCs w:val="24"/>
-          <w:lang w:val="es-CO" w:eastAsia="es-CO"/>
-          <w14:ligatures w14:val="standardContextual"/>
-        </w:rPr>
-      </w:pPr>
-      <w:hyperlink w:anchor="_Toc241424188" w:history="1">
+        </w:rPr>
+      </w:pPr>
+      <w:hyperlink w:anchor="_Toc242002984" w:history="1">
         <w:r>
           <w:rPr>
             <w:rStyle w:val="Hipervnculo"/>
@@ -1695,7 +1585,7 @@
             <w:noProof/>
             <w:webHidden/>
           </w:rPr>
-          <w:instrText xml:space="preserve"> PAGEREF _Toc241424188 \h </w:instrText>
+          <w:instrText xml:space="preserve"> PAGEREF _Toc242002984 \h </w:instrText>
         </w:r>
         <w:r>
           <w:rPr>
@@ -1733,15 +1623,10 @@
           <w:tab w:val="right" w:leader="dot" w:pos="9350"/>
         </w:tabs>
         <w:rPr>
-          <w:rFonts w:asciiTheme="minorHAnsi" w:eastAsiaTheme="minorEastAsia" w:hAnsiTheme="minorHAnsi"/>
           <w:noProof/>
-          <w:kern w:val="2"/>
-          <w:szCs w:val="24"/>
-          <w:lang w:val="es-CO" w:eastAsia="es-CO"/>
-          <w14:ligatures w14:val="standardContextual"/>
-        </w:rPr>
-      </w:pPr>
-      <w:hyperlink w:anchor="_Toc241424189" w:history="1">
+        </w:rPr>
+      </w:pPr>
+      <w:hyperlink w:anchor="_Toc242002985" w:history="1">
         <w:r>
           <w:rPr>
             <w:rStyle w:val="Hipervnculo"/>
@@ -1769,7 +1654,7 @@
             <w:noProof/>
             <w:webHidden/>
           </w:rPr>
-          <w:instrText xml:space="preserve"> PAGEREF _Toc241424189 \h </w:instrText>
+          <w:instrText xml:space="preserve"> PAGEREF _Toc242002985 \h </w:instrText>
         </w:r>
         <w:r>
           <w:rPr>
@@ -1807,15 +1692,10 @@
           <w:tab w:val="right" w:leader="dot" w:pos="9350"/>
         </w:tabs>
         <w:rPr>
-          <w:rFonts w:asciiTheme="minorHAnsi" w:eastAsiaTheme="minorEastAsia" w:hAnsiTheme="minorHAnsi"/>
           <w:noProof/>
-          <w:kern w:val="2"/>
-          <w:szCs w:val="24"/>
-          <w:lang w:val="es-CO" w:eastAsia="es-CO"/>
-          <w14:ligatures w14:val="standardContextual"/>
-        </w:rPr>
-      </w:pPr>
-      <w:hyperlink w:anchor="_Toc241424190" w:history="1">
+        </w:rPr>
+      </w:pPr>
+      <w:hyperlink w:anchor="_Toc242002986" w:history="1">
         <w:r>
           <w:rPr>
             <w:rStyle w:val="Hipervnculo"/>
@@ -1843,7 +1723,7 @@
             <w:noProof/>
             <w:webHidden/>
           </w:rPr>
-          <w:instrText xml:space="preserve"> PAGEREF _Toc241424190 \h </w:instrText>
+          <w:instrText xml:space="preserve"> PAGEREF _Toc242002986 \h </w:instrText>
         </w:r>
         <w:r>
           <w:rPr>
@@ -1881,15 +1761,10 @@
           <w:tab w:val="right" w:leader="dot" w:pos="9350"/>
         </w:tabs>
         <w:rPr>
-          <w:rFonts w:asciiTheme="minorHAnsi" w:eastAsiaTheme="minorEastAsia" w:hAnsiTheme="minorHAnsi"/>
           <w:noProof/>
-          <w:kern w:val="2"/>
-          <w:szCs w:val="24"/>
-          <w:lang w:val="es-CO" w:eastAsia="es-CO"/>
-          <w14:ligatures w14:val="standardContextual"/>
-        </w:rPr>
-      </w:pPr>
-      <w:hyperlink w:anchor="_Toc241424191" w:history="1">
+        </w:rPr>
+      </w:pPr>
+      <w:hyperlink w:anchor="_Toc242002987" w:history="1">
         <w:r>
           <w:rPr>
             <w:rStyle w:val="Hipervnculo"/>
@@ -1917,7 +1792,7 @@
             <w:noProof/>
             <w:webHidden/>
           </w:rPr>
-          <w:instrText xml:space="preserve"> PAGEREF _Toc241424191 \h </w:instrText>
+          <w:instrText xml:space="preserve"> PAGEREF _Toc242002987 \h </w:instrText>
         </w:r>
         <w:r>
           <w:rPr>
@@ -1955,15 +1830,10 @@
           <w:tab w:val="right" w:leader="dot" w:pos="9350"/>
         </w:tabs>
         <w:rPr>
-          <w:rFonts w:asciiTheme="minorHAnsi" w:eastAsiaTheme="minorEastAsia" w:hAnsiTheme="minorHAnsi"/>
           <w:noProof/>
-          <w:kern w:val="2"/>
-          <w:szCs w:val="24"/>
-          <w:lang w:val="es-CO" w:eastAsia="es-CO"/>
-          <w14:ligatures w14:val="standardContextual"/>
-        </w:rPr>
-      </w:pPr>
-      <w:hyperlink w:anchor="_Toc241424192" w:history="1">
+        </w:rPr>
+      </w:pPr>
+      <w:hyperlink w:anchor="_Toc242002988" w:history="1">
         <w:r>
           <w:rPr>
             <w:rStyle w:val="Hipervnculo"/>
@@ -1991,7 +1861,7 @@
             <w:noProof/>
             <w:webHidden/>
           </w:rPr>
-          <w:instrText xml:space="preserve"> PAGEREF _Toc241424192 \h </w:instrText>
+          <w:instrText xml:space="preserve"> PAGEREF _Toc242002988 \h </w:instrText>
         </w:r>
         <w:r>
           <w:rPr>
@@ -2029,15 +1899,10 @@
           <w:tab w:val="right" w:leader="dot" w:pos="9350"/>
         </w:tabs>
         <w:rPr>
-          <w:rFonts w:asciiTheme="minorHAnsi" w:eastAsiaTheme="minorEastAsia" w:hAnsiTheme="minorHAnsi"/>
           <w:noProof/>
-          <w:kern w:val="2"/>
-          <w:szCs w:val="24"/>
-          <w:lang w:val="es-CO" w:eastAsia="es-CO"/>
-          <w14:ligatures w14:val="standardContextual"/>
-        </w:rPr>
-      </w:pPr>
-      <w:hyperlink w:anchor="_Toc241424193" w:history="1">
+        </w:rPr>
+      </w:pPr>
+      <w:hyperlink w:anchor="_Toc242002989" w:history="1">
         <w:r>
           <w:rPr>
             <w:rStyle w:val="Hipervnculo"/>
@@ -2065,7 +1930,7 @@
             <w:noProof/>
             <w:webHidden/>
           </w:rPr>
-          <w:instrText xml:space="preserve"> PAGEREF _Toc241424193 \h </w:instrText>
+          <w:instrText xml:space="preserve"> PAGEREF _Toc242002989 \h </w:instrText>
         </w:r>
         <w:r>
           <w:rPr>
@@ -2103,15 +1968,10 @@
           <w:tab w:val="right" w:leader="dot" w:pos="9350"/>
         </w:tabs>
         <w:rPr>
-          <w:rFonts w:asciiTheme="minorHAnsi" w:eastAsiaTheme="minorEastAsia" w:hAnsiTheme="minorHAnsi"/>
           <w:noProof/>
-          <w:kern w:val="2"/>
-          <w:szCs w:val="24"/>
-          <w:lang w:val="es-CO" w:eastAsia="es-CO"/>
-          <w14:ligatures w14:val="standardContextual"/>
-        </w:rPr>
-      </w:pPr>
-      <w:hyperlink w:anchor="_Toc241424194" w:history="1">
+        </w:rPr>
+      </w:pPr>
+      <w:hyperlink w:anchor="_Toc242002990" w:history="1">
         <w:r>
           <w:rPr>
             <w:rStyle w:val="Hipervnculo"/>
@@ -2139,7 +1999,7 @@
             <w:noProof/>
             <w:webHidden/>
           </w:rPr>
-          <w:instrText xml:space="preserve"> PAGEREF _Toc241424194 \h </w:instrText>
+          <w:instrText xml:space="preserve"> PAGEREF _Toc242002990 \h </w:instrText>
         </w:r>
         <w:r>
           <w:rPr>
@@ -2177,15 +2037,10 @@
           <w:tab w:val="right" w:leader="dot" w:pos="9350"/>
         </w:tabs>
         <w:rPr>
-          <w:rFonts w:asciiTheme="minorHAnsi" w:eastAsiaTheme="minorEastAsia" w:hAnsiTheme="minorHAnsi"/>
           <w:noProof/>
-          <w:kern w:val="2"/>
-          <w:szCs w:val="24"/>
-          <w:lang w:val="es-CO" w:eastAsia="es-CO"/>
-          <w14:ligatures w14:val="standardContextual"/>
-        </w:rPr>
-      </w:pPr>
-      <w:hyperlink w:anchor="_Toc241424195" w:history="1">
+        </w:rPr>
+      </w:pPr>
+      <w:hyperlink w:anchor="_Toc242002991" w:history="1">
         <w:r>
           <w:rPr>
             <w:rStyle w:val="Hipervnculo"/>
@@ -2213,7 +2068,7 @@
             <w:noProof/>
             <w:webHidden/>
           </w:rPr>
-          <w:instrText xml:space="preserve"> PAGEREF _Toc241424195 \h </w:instrText>
+          <w:instrText xml:space="preserve"> PAGEREF _Toc242002991 \h </w:instrText>
         </w:r>
         <w:r>
           <w:rPr>
@@ -2251,15 +2106,10 @@
           <w:tab w:val="right" w:leader="dot" w:pos="9350"/>
         </w:tabs>
         <w:rPr>
-          <w:rFonts w:asciiTheme="minorHAnsi" w:eastAsiaTheme="minorEastAsia" w:hAnsiTheme="minorHAnsi"/>
           <w:noProof/>
-          <w:kern w:val="2"/>
-          <w:szCs w:val="24"/>
-          <w:lang w:val="es-CO" w:eastAsia="es-CO"/>
-          <w14:ligatures w14:val="standardContextual"/>
-        </w:rPr>
-      </w:pPr>
-      <w:hyperlink w:anchor="_Toc241424196" w:history="1">
+        </w:rPr>
+      </w:pPr>
+      <w:hyperlink w:anchor="_Toc242002992" w:history="1">
         <w:r>
           <w:rPr>
             <w:rStyle w:val="Hipervnculo"/>
@@ -2287,7 +2137,7 @@
             <w:noProof/>
             <w:webHidden/>
           </w:rPr>
-          <w:instrText xml:space="preserve"> PAGEREF _Toc241424196 \h </w:instrText>
+          <w:instrText xml:space="preserve"> PAGEREF _Toc242002992 \h </w:instrText>
         </w:r>
         <w:r>
           <w:rPr>
@@ -2325,15 +2175,10 @@
           <w:tab w:val="right" w:leader="dot" w:pos="9350"/>
         </w:tabs>
         <w:rPr>
-          <w:rFonts w:asciiTheme="minorHAnsi" w:eastAsiaTheme="minorEastAsia" w:hAnsiTheme="minorHAnsi"/>
           <w:noProof/>
-          <w:kern w:val="2"/>
-          <w:szCs w:val="24"/>
-          <w:lang w:val="es-CO" w:eastAsia="es-CO"/>
-          <w14:ligatures w14:val="standardContextual"/>
-        </w:rPr>
-      </w:pPr>
-      <w:hyperlink w:anchor="_Toc241424197" w:history="1">
+        </w:rPr>
+      </w:pPr>
+      <w:hyperlink w:anchor="_Toc242002993" w:history="1">
         <w:r>
           <w:rPr>
             <w:rStyle w:val="Hipervnculo"/>
@@ -2361,7 +2206,7 @@
             <w:noProof/>
             <w:webHidden/>
           </w:rPr>
-          <w:instrText xml:space="preserve"> PAGEREF _Toc241424197 \h </w:instrText>
+          <w:instrText xml:space="preserve"> PAGEREF _Toc242002993 \h </w:instrText>
         </w:r>
         <w:r>
           <w:rPr>
@@ -2399,15 +2244,10 @@
           <w:tab w:val="right" w:leader="dot" w:pos="9350"/>
         </w:tabs>
         <w:rPr>
-          <w:rFonts w:asciiTheme="minorHAnsi" w:eastAsiaTheme="minorEastAsia" w:hAnsiTheme="minorHAnsi"/>
           <w:noProof/>
-          <w:kern w:val="2"/>
-          <w:szCs w:val="24"/>
-          <w:lang w:val="es-CO" w:eastAsia="es-CO"/>
-          <w14:ligatures w14:val="standardContextual"/>
-        </w:rPr>
-      </w:pPr>
-      <w:hyperlink w:anchor="_Toc241424198" w:history="1">
+        </w:rPr>
+      </w:pPr>
+      <w:hyperlink w:anchor="_Toc242002994" w:history="1">
         <w:r>
           <w:rPr>
             <w:rStyle w:val="Hipervnculo"/>
@@ -2435,7 +2275,7 @@
             <w:noProof/>
             <w:webHidden/>
           </w:rPr>
-          <w:instrText xml:space="preserve"> PAGEREF _Toc241424198 \h </w:instrText>
+          <w:instrText xml:space="preserve"> PAGEREF _Toc242002994 \h </w:instrText>
         </w:r>
         <w:r>
           <w:rPr>
@@ -2473,15 +2313,10 @@
           <w:tab w:val="right" w:leader="dot" w:pos="9350"/>
         </w:tabs>
         <w:rPr>
-          <w:rFonts w:asciiTheme="minorHAnsi" w:eastAsiaTheme="minorEastAsia" w:hAnsiTheme="minorHAnsi"/>
           <w:noProof/>
-          <w:kern w:val="2"/>
-          <w:szCs w:val="24"/>
-          <w:lang w:val="es-CO" w:eastAsia="es-CO"/>
-          <w14:ligatures w14:val="standardContextual"/>
-        </w:rPr>
-      </w:pPr>
-      <w:hyperlink w:anchor="_Toc241424199" w:history="1">
+        </w:rPr>
+      </w:pPr>
+      <w:hyperlink w:anchor="_Toc242002995" w:history="1">
         <w:r>
           <w:rPr>
             <w:rStyle w:val="Hipervnculo"/>
@@ -2509,7 +2344,7 @@
             <w:noProof/>
             <w:webHidden/>
           </w:rPr>
-          <w:instrText xml:space="preserve"> PAGEREF _Toc241424199 \h </w:instrText>
+          <w:instrText xml:space="preserve"> PAGEREF _Toc242002995 \h </w:instrText>
         </w:r>
         <w:r>
           <w:rPr>
@@ -2547,15 +2382,10 @@
           <w:tab w:val="right" w:leader="dot" w:pos="9350"/>
         </w:tabs>
         <w:rPr>
-          <w:rFonts w:asciiTheme="minorHAnsi" w:eastAsiaTheme="minorEastAsia" w:hAnsiTheme="minorHAnsi"/>
           <w:noProof/>
-          <w:kern w:val="2"/>
-          <w:szCs w:val="24"/>
-          <w:lang w:val="es-CO" w:eastAsia="es-CO"/>
-          <w14:ligatures w14:val="standardContextual"/>
-        </w:rPr>
-      </w:pPr>
-      <w:hyperlink w:anchor="_Toc241424200" w:history="1">
+        </w:rPr>
+      </w:pPr>
+      <w:hyperlink w:anchor="_Toc242002996" w:history="1">
         <w:r>
           <w:rPr>
             <w:rStyle w:val="Hipervnculo"/>
@@ -2583,7 +2413,7 @@
             <w:noProof/>
             <w:webHidden/>
           </w:rPr>
-          <w:instrText xml:space="preserve"> PAGEREF _Toc241424200 \h </w:instrText>
+          <w:instrText xml:space="preserve"> PAGEREF _Toc242002996 \h </w:instrText>
         </w:r>
         <w:r>
           <w:rPr>
@@ -2621,15 +2451,10 @@
           <w:tab w:val="right" w:leader="dot" w:pos="9350"/>
         </w:tabs>
         <w:rPr>
-          <w:rFonts w:asciiTheme="minorHAnsi" w:eastAsiaTheme="minorEastAsia" w:hAnsiTheme="minorHAnsi"/>
           <w:noProof/>
-          <w:kern w:val="2"/>
-          <w:szCs w:val="24"/>
-          <w:lang w:val="es-CO" w:eastAsia="es-CO"/>
-          <w14:ligatures w14:val="standardContextual"/>
-        </w:rPr>
-      </w:pPr>
-      <w:hyperlink w:anchor="_Toc241424201" w:history="1">
+        </w:rPr>
+      </w:pPr>
+      <w:hyperlink w:anchor="_Toc242002997" w:history="1">
         <w:r>
           <w:rPr>
             <w:rStyle w:val="Hipervnculo"/>
@@ -2657,7 +2482,7 @@
             <w:noProof/>
             <w:webHidden/>
           </w:rPr>
-          <w:instrText xml:space="preserve"> PAGEREF _Toc241424201 \h </w:instrText>
+          <w:instrText xml:space="preserve"> PAGEREF _Toc242002997 \h </w:instrText>
         </w:r>
         <w:r>
           <w:rPr>
@@ -2695,15 +2520,10 @@
           <w:tab w:val="right" w:leader="dot" w:pos="9350"/>
         </w:tabs>
         <w:rPr>
-          <w:rFonts w:asciiTheme="minorHAnsi" w:eastAsiaTheme="minorEastAsia" w:hAnsiTheme="minorHAnsi"/>
           <w:noProof/>
-          <w:kern w:val="2"/>
-          <w:szCs w:val="24"/>
-          <w:lang w:val="es-CO" w:eastAsia="es-CO"/>
-          <w14:ligatures w14:val="standardContextual"/>
-        </w:rPr>
-      </w:pPr>
-      <w:hyperlink w:anchor="_Toc241424202" w:history="1">
+        </w:rPr>
+      </w:pPr>
+      <w:hyperlink w:anchor="_Toc242002998" w:history="1">
         <w:r>
           <w:rPr>
             <w:rStyle w:val="Hipervnculo"/>
@@ -2731,7 +2551,7 @@
             <w:noProof/>
             <w:webHidden/>
           </w:rPr>
-          <w:instrText xml:space="preserve"> PAGEREF _Toc241424202 \h </w:instrText>
+          <w:instrText xml:space="preserve"> PAGEREF _Toc242002998 \h </w:instrText>
         </w:r>
         <w:r>
           <w:rPr>
@@ -2769,15 +2589,10 @@
           <w:tab w:val="right" w:leader="dot" w:pos="9350"/>
         </w:tabs>
         <w:rPr>
-          <w:rFonts w:asciiTheme="minorHAnsi" w:eastAsiaTheme="minorEastAsia" w:hAnsiTheme="minorHAnsi"/>
           <w:noProof/>
-          <w:kern w:val="2"/>
-          <w:szCs w:val="24"/>
-          <w:lang w:val="es-CO" w:eastAsia="es-CO"/>
-          <w14:ligatures w14:val="standardContextual"/>
-        </w:rPr>
-      </w:pPr>
-      <w:hyperlink w:anchor="_Toc241424203" w:history="1">
+        </w:rPr>
+      </w:pPr>
+      <w:hyperlink w:anchor="_Toc242002999" w:history="1">
         <w:r>
           <w:rPr>
             <w:rStyle w:val="Hipervnculo"/>
@@ -2805,7 +2620,7 @@
             <w:noProof/>
             <w:webHidden/>
           </w:rPr>
-          <w:instrText xml:space="preserve"> PAGEREF _Toc241424203 \h </w:instrText>
+          <w:instrText xml:space="preserve"> PAGEREF _Toc242002999 \h </w:instrText>
         </w:r>
         <w:r>
           <w:rPr>
@@ -2843,15 +2658,10 @@
           <w:tab w:val="right" w:leader="dot" w:pos="9350"/>
         </w:tabs>
         <w:rPr>
-          <w:rFonts w:asciiTheme="minorHAnsi" w:eastAsiaTheme="minorEastAsia" w:hAnsiTheme="minorHAnsi"/>
           <w:noProof/>
-          <w:kern w:val="2"/>
-          <w:szCs w:val="24"/>
-          <w:lang w:val="es-CO" w:eastAsia="es-CO"/>
-          <w14:ligatures w14:val="standardContextual"/>
-        </w:rPr>
-      </w:pPr>
-      <w:hyperlink w:anchor="_Toc241424204" w:history="1">
+        </w:rPr>
+      </w:pPr>
+      <w:hyperlink w:anchor="_Toc242003000" w:history="1">
         <w:r>
           <w:rPr>
             <w:rStyle w:val="Hipervnculo"/>
@@ -2879,7 +2689,7 @@
             <w:noProof/>
             <w:webHidden/>
           </w:rPr>
-          <w:instrText xml:space="preserve"> PAGEREF _Toc241424204 \h </w:instrText>
+          <w:instrText xml:space="preserve"> PAGEREF _Toc242003000 \h </w:instrText>
         </w:r>
         <w:r>
           <w:rPr>
@@ -2917,15 +2727,10 @@
           <w:tab w:val="right" w:leader="dot" w:pos="9350"/>
         </w:tabs>
         <w:rPr>
-          <w:rFonts w:asciiTheme="minorHAnsi" w:eastAsiaTheme="minorEastAsia" w:hAnsiTheme="minorHAnsi"/>
           <w:noProof/>
-          <w:kern w:val="2"/>
-          <w:szCs w:val="24"/>
-          <w:lang w:val="es-CO" w:eastAsia="es-CO"/>
-          <w14:ligatures w14:val="standardContextual"/>
-        </w:rPr>
-      </w:pPr>
-      <w:hyperlink w:anchor="_Toc241424205" w:history="1">
+        </w:rPr>
+      </w:pPr>
+      <w:hyperlink w:anchor="_Toc242003001" w:history="1">
         <w:r>
           <w:rPr>
             <w:rStyle w:val="Hipervnculo"/>
@@ -2953,7 +2758,7 @@
             <w:noProof/>
             <w:webHidden/>
           </w:rPr>
-          <w:instrText xml:space="preserve"> PAGEREF _Toc241424205 \h </w:instrText>
+          <w:instrText xml:space="preserve"> PAGEREF _Toc242003001 \h </w:instrText>
         </w:r>
         <w:r>
           <w:rPr>
@@ -2991,15 +2796,10 @@
           <w:tab w:val="right" w:leader="dot" w:pos="9350"/>
         </w:tabs>
         <w:rPr>
-          <w:rFonts w:asciiTheme="minorHAnsi" w:eastAsiaTheme="minorEastAsia" w:hAnsiTheme="minorHAnsi"/>
           <w:noProof/>
-          <w:kern w:val="2"/>
-          <w:szCs w:val="24"/>
-          <w:lang w:val="es-CO" w:eastAsia="es-CO"/>
-          <w14:ligatures w14:val="standardContextual"/>
-        </w:rPr>
-      </w:pPr>
-      <w:hyperlink w:anchor="_Toc241424206" w:history="1">
+        </w:rPr>
+      </w:pPr>
+      <w:hyperlink w:anchor="_Toc242003002" w:history="1">
         <w:r>
           <w:rPr>
             <w:rStyle w:val="Hipervnculo"/>
@@ -3027,7 +2827,7 @@
             <w:noProof/>
             <w:webHidden/>
           </w:rPr>
-          <w:instrText xml:space="preserve"> PAGEREF _Toc241424206 \h </w:instrText>
+          <w:instrText xml:space="preserve"> PAGEREF _Toc242003002 \h </w:instrText>
         </w:r>
         <w:r>
           <w:rPr>
@@ -3065,15 +2865,10 @@
           <w:tab w:val="right" w:leader="dot" w:pos="9350"/>
         </w:tabs>
         <w:rPr>
-          <w:rFonts w:asciiTheme="minorHAnsi" w:eastAsiaTheme="minorEastAsia" w:hAnsiTheme="minorHAnsi"/>
           <w:noProof/>
-          <w:kern w:val="2"/>
-          <w:szCs w:val="24"/>
-          <w:lang w:val="es-CO" w:eastAsia="es-CO"/>
-          <w14:ligatures w14:val="standardContextual"/>
-        </w:rPr>
-      </w:pPr>
-      <w:hyperlink w:anchor="_Toc241424207" w:history="1">
+        </w:rPr>
+      </w:pPr>
+      <w:hyperlink w:anchor="_Toc242003003" w:history="1">
         <w:r>
           <w:rPr>
             <w:rStyle w:val="Hipervnculo"/>
@@ -3101,7 +2896,7 @@
             <w:noProof/>
             <w:webHidden/>
           </w:rPr>
-          <w:instrText xml:space="preserve"> PAGEREF _Toc241424207 \h </w:instrText>
+          <w:instrText xml:space="preserve"> PAGEREF _Toc242003003 \h </w:instrText>
         </w:r>
         <w:r>
           <w:rPr>
@@ -3139,15 +2934,10 @@
           <w:tab w:val="right" w:leader="dot" w:pos="9350"/>
         </w:tabs>
         <w:rPr>
-          <w:rFonts w:asciiTheme="minorHAnsi" w:eastAsiaTheme="minorEastAsia" w:hAnsiTheme="minorHAnsi"/>
           <w:noProof/>
-          <w:kern w:val="2"/>
-          <w:szCs w:val="24"/>
-          <w:lang w:val="es-CO" w:eastAsia="es-CO"/>
-          <w14:ligatures w14:val="standardContextual"/>
-        </w:rPr>
-      </w:pPr>
-      <w:hyperlink w:anchor="_Toc241424208" w:history="1">
+        </w:rPr>
+      </w:pPr>
+      <w:hyperlink w:anchor="_Toc242003004" w:history="1">
         <w:r>
           <w:rPr>
             <w:rStyle w:val="Hipervnculo"/>
@@ -3175,7 +2965,7 @@
             <w:noProof/>
             <w:webHidden/>
           </w:rPr>
-          <w:instrText xml:space="preserve"> PAGEREF _Toc241424208 \h </w:instrText>
+          <w:instrText xml:space="preserve"> PAGEREF _Toc242003004 \h </w:instrText>
         </w:r>
         <w:r>
           <w:rPr>
@@ -3213,15 +3003,10 @@
           <w:tab w:val="right" w:leader="dot" w:pos="9350"/>
         </w:tabs>
         <w:rPr>
-          <w:rFonts w:asciiTheme="minorHAnsi" w:eastAsiaTheme="minorEastAsia" w:hAnsiTheme="minorHAnsi"/>
           <w:noProof/>
-          <w:kern w:val="2"/>
-          <w:szCs w:val="24"/>
-          <w:lang w:val="es-CO" w:eastAsia="es-CO"/>
-          <w14:ligatures w14:val="standardContextual"/>
-        </w:rPr>
-      </w:pPr>
-      <w:hyperlink w:anchor="_Toc241424209" w:history="1">
+        </w:rPr>
+      </w:pPr>
+      <w:hyperlink w:anchor="_Toc242003005" w:history="1">
         <w:r>
           <w:rPr>
             <w:rStyle w:val="Hipervnculo"/>
@@ -3249,7 +3034,7 @@
             <w:noProof/>
             <w:webHidden/>
           </w:rPr>
-          <w:instrText xml:space="preserve"> PAGEREF _Toc241424209 \h </w:instrText>
+          <w:instrText xml:space="preserve"> PAGEREF _Toc242003005 \h </w:instrText>
         </w:r>
         <w:r>
           <w:rPr>
@@ -3287,15 +3072,10 @@
           <w:tab w:val="right" w:leader="dot" w:pos="9350"/>
         </w:tabs>
         <w:rPr>
-          <w:rFonts w:asciiTheme="minorHAnsi" w:eastAsiaTheme="minorEastAsia" w:hAnsiTheme="minorHAnsi"/>
           <w:noProof/>
-          <w:kern w:val="2"/>
-          <w:szCs w:val="24"/>
-          <w:lang w:val="es-CO" w:eastAsia="es-CO"/>
-          <w14:ligatures w14:val="standardContextual"/>
-        </w:rPr>
-      </w:pPr>
-      <w:hyperlink w:anchor="_Toc241424210" w:history="1">
+        </w:rPr>
+      </w:pPr>
+      <w:hyperlink w:anchor="_Toc242003006" w:history="1">
         <w:r>
           <w:rPr>
             <w:rStyle w:val="Hipervnculo"/>
@@ -3323,7 +3103,7 @@
             <w:noProof/>
             <w:webHidden/>
           </w:rPr>
-          <w:instrText xml:space="preserve"> PAGEREF _Toc241424210 \h </w:instrText>
+          <w:instrText xml:space="preserve"> PAGEREF _Toc242003006 \h </w:instrText>
         </w:r>
         <w:r>
           <w:rPr>
@@ -3368,7 +3148,7 @@
       <w:pPr>
         <w:pStyle w:val="Ttulo1"/>
       </w:pPr>
-      <w:bookmarkStart w:id="0" w:name="_Toc241424167"/>
+      <w:bookmarkStart w:id="0" w:name="_Toc242002963"/>
       <w:r>
         <w:rPr>
           <w:rFonts w:ascii="Times New Roman" w:hAnsi="Times New Roman"/>
@@ -3424,7 +3204,7 @@
       <w:pPr>
         <w:pStyle w:val="Ttulo1"/>
       </w:pPr>
-      <w:bookmarkStart w:id="1" w:name="_Toc241424168"/>
+      <w:bookmarkStart w:id="1" w:name="_Toc242002964"/>
       <w:r>
         <w:rPr>
           <w:rFonts w:ascii="Times New Roman" w:hAnsi="Times New Roman"/>
@@ -3712,13 +3492,7 @@
               <w:rPr>
                 <w:sz w:val="18"/>
               </w:rPr>
-              <w:t xml:space="preserve">URL del proyecto desplegado en el </w:t>
-            </w:r>
-            <w:r>
-              <w:rPr>
-                <w:sz w:val="18"/>
-              </w:rPr>
-              <w:t>documento</w:t>
+              <w:t>URL del proyecto desplegado en el documento</w:t>
             </w:r>
           </w:p>
         </w:tc>
@@ -4195,7 +3969,7 @@
       <w:pPr>
         <w:pStyle w:val="Ttulo1"/>
       </w:pPr>
-      <w:bookmarkStart w:id="2" w:name="_Toc241424169"/>
+      <w:bookmarkStart w:id="2" w:name="_Toc242002965"/>
       <w:r>
         <w:rPr>
           <w:rFonts w:ascii="Times New Roman" w:hAnsi="Times New Roman"/>
@@ -4208,7 +3982,7 @@
       <w:pPr>
         <w:pStyle w:val="Ttulo2"/>
       </w:pPr>
-      <w:bookmarkStart w:id="3" w:name="_Toc241424170"/>
+      <w:bookmarkStart w:id="3" w:name="_Toc242002966"/>
       <w:r>
         <w:rPr>
           <w:rFonts w:ascii="Times New Roman" w:hAnsi="Times New Roman"/>
@@ -4222,10 +3996,10 @@
         <w:ind w:firstLine="720"/>
       </w:pPr>
       <w:r>
-        <w:t xml:space="preserve">El </w:t>
-      </w:r>
-      <w:r>
-        <w:t>aplicativo está publicado y en funcionamiento en:</w:t>
+        <w:t xml:space="preserve">El aplicativo está </w:t>
+      </w:r>
+      <w:r>
+        <w:t>publicado y en funcionamiento en:</w:t>
       </w:r>
     </w:p>
     <w:p>
@@ -4270,7 +4044,7 @@
       <w:pPr>
         <w:pStyle w:val="Ttulo2"/>
       </w:pPr>
-      <w:bookmarkStart w:id="4" w:name="_Toc241424171"/>
+      <w:bookmarkStart w:id="4" w:name="_Toc242002967"/>
       <w:r>
         <w:rPr>
           <w:rFonts w:ascii="Times New Roman" w:hAnsi="Times New Roman"/>
@@ -4458,13 +4232,7 @@
               <w:rPr>
                 <w:sz w:val="18"/>
               </w:rPr>
-              <w:t xml:space="preserve">Ver las noticias destacadas y las más </w:t>
-            </w:r>
-            <w:r>
-              <w:rPr>
-                <w:sz w:val="18"/>
-              </w:rPr>
-              <w:t>recientes</w:t>
+              <w:t>Ver las noticias destacadas y las más recientes</w:t>
             </w:r>
           </w:p>
         </w:tc>
@@ -4740,13 +4508,13 @@
               <w:rPr>
                 <w:sz w:val="18"/>
               </w:rPr>
-              <w:t xml:space="preserve">Crear una </w:t>
+              <w:t xml:space="preserve">Crear una noticia nueva y </w:t>
             </w:r>
             <w:r>
               <w:rPr>
                 <w:sz w:val="18"/>
               </w:rPr>
-              <w:t>noticia nueva y eliminar existentes</w:t>
+              <w:t>eliminar existentes</w:t>
             </w:r>
           </w:p>
         </w:tc>
@@ -4998,7 +4766,7 @@
       <w:pPr>
         <w:pStyle w:val="Ttulo1"/>
       </w:pPr>
-      <w:bookmarkStart w:id="5" w:name="_Toc241424172"/>
+      <w:bookmarkStart w:id="5" w:name="_Toc242002968"/>
       <w:r>
         <w:rPr>
           <w:rFonts w:ascii="Times New Roman" w:hAnsi="Times New Roman"/>
@@ -5019,7 +4787,7 @@
       <w:pPr>
         <w:pStyle w:val="Ttulo2"/>
       </w:pPr>
-      <w:bookmarkStart w:id="6" w:name="_Toc241424173"/>
+      <w:bookmarkStart w:id="6" w:name="_Toc242002969"/>
       <w:r>
         <w:rPr>
           <w:rFonts w:ascii="Times New Roman" w:hAnsi="Times New Roman"/>
@@ -5072,7 +4840,7 @@
           <w:noProof/>
         </w:rPr>
         <w:drawing>
-          <wp:inline distT="0" distB="0" distL="0" distR="0" wp14:anchorId="06489323" wp14:editId="29415AFE">
+          <wp:inline distT="0" distB="0" distL="0" distR="0" wp14:anchorId="4F2CE73B" wp14:editId="08AF9B61">
             <wp:extent cx="5940000" cy="5980838"/>
             <wp:effectExtent l="0" t="0" r="0" b="0"/>
             <wp:docPr id="1" name="Picture 1"/>
@@ -5127,7 +4895,7 @@
       <w:pPr>
         <w:pStyle w:val="Ttulo2"/>
       </w:pPr>
-      <w:bookmarkStart w:id="7" w:name="_Toc241424174"/>
+      <w:bookmarkStart w:id="7" w:name="_Toc242002970"/>
       <w:r>
         <w:rPr>
           <w:rFonts w:ascii="Times New Roman" w:hAnsi="Times New Roman"/>
@@ -5181,7 +4949,7 @@
           <w:noProof/>
         </w:rPr>
         <w:drawing>
-          <wp:inline distT="0" distB="0" distL="0" distR="0" wp14:anchorId="4B4C7B5E" wp14:editId="5025AEB9">
+          <wp:inline distT="0" distB="0" distL="0" distR="0" wp14:anchorId="53E87CA7" wp14:editId="1902F726">
             <wp:extent cx="5940000" cy="5980838"/>
             <wp:effectExtent l="0" t="0" r="0" b="0"/>
             <wp:docPr id="2" name="Picture 2"/>
@@ -5236,7 +5004,7 @@
       <w:pPr>
         <w:pStyle w:val="Ttulo2"/>
       </w:pPr>
-      <w:bookmarkStart w:id="8" w:name="_Toc241424175"/>
+      <w:bookmarkStart w:id="8" w:name="_Toc242002971"/>
       <w:r>
         <w:rPr>
           <w:rFonts w:ascii="Times New Roman" w:hAnsi="Times New Roman"/>
@@ -5290,7 +5058,7 @@
           <w:noProof/>
         </w:rPr>
         <w:drawing>
-          <wp:inline distT="0" distB="0" distL="0" distR="0" wp14:anchorId="50ACC66C" wp14:editId="0F450790">
+          <wp:inline distT="0" distB="0" distL="0" distR="0" wp14:anchorId="21D03689" wp14:editId="4BC8F56B">
             <wp:extent cx="5940000" cy="5980838"/>
             <wp:effectExtent l="0" t="0" r="0" b="0"/>
             <wp:docPr id="3" name="Picture 3"/>
@@ -5345,7 +5113,7 @@
       <w:pPr>
         <w:pStyle w:val="Ttulo2"/>
       </w:pPr>
-      <w:bookmarkStart w:id="9" w:name="_Toc241424176"/>
+      <w:bookmarkStart w:id="9" w:name="_Toc242002972"/>
       <w:r>
         <w:rPr>
           <w:rFonts w:ascii="Times New Roman" w:hAnsi="Times New Roman"/>
@@ -5399,7 +5167,7 @@
           <w:noProof/>
         </w:rPr>
         <w:drawing>
-          <wp:inline distT="0" distB="0" distL="0" distR="0" wp14:anchorId="663FC91F" wp14:editId="381391BD">
+          <wp:inline distT="0" distB="0" distL="0" distR="0" wp14:anchorId="777BE6EE" wp14:editId="6757293A">
             <wp:extent cx="5940000" cy="4744575"/>
             <wp:effectExtent l="0" t="0" r="0" b="0"/>
             <wp:docPr id="4" name="Picture 4"/>
@@ -5454,7 +5222,7 @@
       <w:pPr>
         <w:pStyle w:val="Ttulo2"/>
       </w:pPr>
-      <w:bookmarkStart w:id="10" w:name="_Toc241424177"/>
+      <w:bookmarkStart w:id="10" w:name="_Toc242002973"/>
       <w:r>
         <w:rPr>
           <w:rFonts w:ascii="Times New Roman" w:hAnsi="Times New Roman"/>
@@ -5525,7 +5293,7 @@
           <w:noProof/>
         </w:rPr>
         <w:drawing>
-          <wp:inline distT="0" distB="0" distL="0" distR="0" wp14:anchorId="61CAD394" wp14:editId="3D23BF64">
+          <wp:inline distT="0" distB="0" distL="0" distR="0" wp14:anchorId="15D57E26" wp14:editId="3A5536BF">
             <wp:extent cx="5940000" cy="5980838"/>
             <wp:effectExtent l="0" t="0" r="0" b="0"/>
             <wp:docPr id="5" name="Picture 5"/>
@@ -5580,7 +5348,7 @@
       <w:pPr>
         <w:pStyle w:val="Ttulo2"/>
       </w:pPr>
-      <w:bookmarkStart w:id="11" w:name="_Toc241424178"/>
+      <w:bookmarkStart w:id="11" w:name="_Toc242002974"/>
       <w:r>
         <w:rPr>
           <w:rFonts w:ascii="Times New Roman" w:hAnsi="Times New Roman"/>
@@ -5634,7 +5402,7 @@
           <w:noProof/>
         </w:rPr>
         <w:drawing>
-          <wp:inline distT="0" distB="0" distL="0" distR="0" wp14:anchorId="1F722504" wp14:editId="7902BB14">
+          <wp:inline distT="0" distB="0" distL="0" distR="0" wp14:anchorId="7222070A" wp14:editId="1E74F9AE">
             <wp:extent cx="5940000" cy="5568750"/>
             <wp:effectExtent l="0" t="0" r="0" b="0"/>
             <wp:docPr id="6" name="Picture 6"/>
@@ -5689,7 +5457,7 @@
       <w:pPr>
         <w:pStyle w:val="Ttulo2"/>
       </w:pPr>
-      <w:bookmarkStart w:id="12" w:name="_Toc241424179"/>
+      <w:bookmarkStart w:id="12" w:name="_Toc242002975"/>
       <w:r>
         <w:rPr>
           <w:rFonts w:ascii="Times New Roman" w:hAnsi="Times New Roman"/>
@@ -5742,7 +5510,7 @@
           <w:noProof/>
         </w:rPr>
         <w:drawing>
-          <wp:inline distT="0" distB="0" distL="0" distR="0" wp14:anchorId="78CFEA0B" wp14:editId="5B52AAE5">
+          <wp:inline distT="0" distB="0" distL="0" distR="0" wp14:anchorId="089B432F" wp14:editId="476D13AD">
             <wp:extent cx="5940000" cy="5156662"/>
             <wp:effectExtent l="0" t="0" r="0" b="0"/>
             <wp:docPr id="7" name="Picture 7"/>
@@ -5843,7 +5611,7 @@
           <w:noProof/>
         </w:rPr>
         <w:drawing>
-          <wp:inline distT="0" distB="0" distL="0" distR="0" wp14:anchorId="0D72F99F" wp14:editId="0EDF07DB">
+          <wp:inline distT="0" distB="0" distL="0" distR="0" wp14:anchorId="3E98B721" wp14:editId="03B63A51">
             <wp:extent cx="5940000" cy="5156662"/>
             <wp:effectExtent l="0" t="0" r="0" b="0"/>
             <wp:docPr id="8" name="Picture 8"/>
@@ -5898,7 +5666,7 @@
       <w:pPr>
         <w:pStyle w:val="Ttulo2"/>
       </w:pPr>
-      <w:bookmarkStart w:id="13" w:name="_Toc241424180"/>
+      <w:bookmarkStart w:id="13" w:name="_Toc242002976"/>
       <w:r>
         <w:rPr>
           <w:rFonts w:ascii="Times New Roman" w:hAnsi="Times New Roman"/>
@@ -6336,7 +6104,7 @@
       <w:pPr>
         <w:pStyle w:val="Ttulo1"/>
       </w:pPr>
-      <w:bookmarkStart w:id="14" w:name="_Toc241424181"/>
+      <w:bookmarkStart w:id="14" w:name="_Toc242002977"/>
       <w:r>
         <w:rPr>
           <w:rFonts w:ascii="Times New Roman" w:hAnsi="Times New Roman"/>
@@ -7321,7 +7089,7 @@
       <w:pPr>
         <w:pStyle w:val="Ttulo2"/>
       </w:pPr>
-      <w:bookmarkStart w:id="15" w:name="_Toc241424182"/>
+      <w:bookmarkStart w:id="15" w:name="_Toc242002978"/>
       <w:r>
         <w:rPr>
           <w:rFonts w:ascii="Times New Roman" w:hAnsi="Times New Roman"/>
@@ -7387,7 +7155,7 @@
       <w:pPr>
         <w:pStyle w:val="Ttulo2"/>
       </w:pPr>
-      <w:bookmarkStart w:id="16" w:name="_Toc241424183"/>
+      <w:bookmarkStart w:id="16" w:name="_Toc242002979"/>
       <w:r>
         <w:rPr>
           <w:rFonts w:ascii="Times New Roman" w:hAnsi="Times New Roman"/>
@@ -7438,7 +7206,7 @@
       <w:pPr>
         <w:pStyle w:val="Ttulo2"/>
       </w:pPr>
-      <w:bookmarkStart w:id="17" w:name="_Toc241424184"/>
+      <w:bookmarkStart w:id="17" w:name="_Toc242002980"/>
       <w:r>
         <w:rPr>
           <w:rFonts w:ascii="Times New Roman" w:hAnsi="Times New Roman"/>
@@ -7480,7 +7248,7 @@
       <w:pPr>
         <w:pStyle w:val="Ttulo2"/>
       </w:pPr>
-      <w:bookmarkStart w:id="18" w:name="_Toc241424185"/>
+      <w:bookmarkStart w:id="18" w:name="_Toc242002981"/>
       <w:r>
         <w:rPr>
           <w:rFonts w:ascii="Times New Roman" w:hAnsi="Times New Roman"/>
@@ -7519,7 +7287,7 @@
       <w:pPr>
         <w:pStyle w:val="Ttulo2"/>
       </w:pPr>
-      <w:bookmarkStart w:id="19" w:name="_Toc241424186"/>
+      <w:bookmarkStart w:id="19" w:name="_Toc242002982"/>
       <w:r>
         <w:rPr>
           <w:rFonts w:ascii="Times New Roman" w:hAnsi="Times New Roman"/>
@@ -7540,7 +7308,7 @@
       <w:pPr>
         <w:pStyle w:val="Ttulo2"/>
       </w:pPr>
-      <w:bookmarkStart w:id="20" w:name="_Toc241424187"/>
+      <w:bookmarkStart w:id="20" w:name="_Toc242002983"/>
       <w:r>
         <w:rPr>
           <w:rFonts w:ascii="Times New Roman" w:hAnsi="Times New Roman"/>
@@ -7564,7 +7332,7 @@
       <w:pPr>
         <w:pStyle w:val="Ttulo1"/>
       </w:pPr>
-      <w:bookmarkStart w:id="21" w:name="_Toc241424188"/>
+      <w:bookmarkStart w:id="21" w:name="_Toc242002984"/>
       <w:r>
         <w:rPr>
           <w:rFonts w:ascii="Times New Roman" w:hAnsi="Times New Roman"/>
@@ -7578,7 +7346,7 @@
       <w:pPr>
         <w:pStyle w:val="Ttulo2"/>
       </w:pPr>
-      <w:bookmarkStart w:id="22" w:name="_Toc241424189"/>
+      <w:bookmarkStart w:id="22" w:name="_Toc242002985"/>
       <w:r>
         <w:rPr>
           <w:rFonts w:ascii="Times New Roman" w:hAnsi="Times New Roman"/>
@@ -8218,7 +7986,7 @@
       <w:pPr>
         <w:pStyle w:val="Ttulo2"/>
       </w:pPr>
-      <w:bookmarkStart w:id="23" w:name="_Toc241424190"/>
+      <w:bookmarkStart w:id="23" w:name="_Toc242002986"/>
       <w:r>
         <w:rPr>
           <w:rFonts w:ascii="Times New Roman" w:hAnsi="Times New Roman"/>
@@ -8615,7 +8383,7 @@
       <w:pPr>
         <w:pStyle w:val="Ttulo2"/>
       </w:pPr>
-      <w:bookmarkStart w:id="24" w:name="_Toc241424191"/>
+      <w:bookmarkStart w:id="24" w:name="_Toc242002987"/>
       <w:r>
         <w:rPr>
           <w:rFonts w:ascii="Times New Roman" w:hAnsi="Times New Roman"/>
@@ -8825,7 +8593,7 @@
       <w:pPr>
         <w:pStyle w:val="Ttulo2"/>
       </w:pPr>
-      <w:bookmarkStart w:id="25" w:name="_Toc241424192"/>
+      <w:bookmarkStart w:id="25" w:name="_Toc242002988"/>
       <w:r>
         <w:rPr>
           <w:rFonts w:ascii="Times New Roman" w:hAnsi="Times New Roman"/>
@@ -9327,7 +9095,7 @@
       <w:pPr>
         <w:pStyle w:val="Ttulo2"/>
       </w:pPr>
-      <w:bookmarkStart w:id="26" w:name="_Toc241424193"/>
+      <w:bookmarkStart w:id="26" w:name="_Toc242002989"/>
       <w:r>
         <w:rPr>
           <w:rFonts w:ascii="Times New Roman" w:hAnsi="Times New Roman"/>
@@ -9914,7 +9682,7 @@
       <w:pPr>
         <w:pStyle w:val="Ttulo2"/>
       </w:pPr>
-      <w:bookmarkStart w:id="27" w:name="_Toc241424194"/>
+      <w:bookmarkStart w:id="27" w:name="_Toc242002990"/>
       <w:r>
         <w:rPr>
           <w:rFonts w:ascii="Times New Roman" w:hAnsi="Times New Roman"/>
@@ -10039,7 +9807,7 @@
       <w:pPr>
         <w:pStyle w:val="Ttulo2"/>
       </w:pPr>
-      <w:bookmarkStart w:id="28" w:name="_Toc241424195"/>
+      <w:bookmarkStart w:id="28" w:name="_Toc242002991"/>
       <w:r>
         <w:rPr>
           <w:rFonts w:ascii="Times New Roman" w:hAnsi="Times New Roman"/>
@@ -10412,7 +10180,7 @@
       <w:pPr>
         <w:pStyle w:val="Ttulo2"/>
       </w:pPr>
-      <w:bookmarkStart w:id="29" w:name="_Toc241424196"/>
+      <w:bookmarkStart w:id="29" w:name="_Toc242002992"/>
       <w:r>
         <w:rPr>
           <w:rFonts w:ascii="Times New Roman" w:hAnsi="Times New Roman"/>
@@ -10451,7 +10219,7 @@
       <w:pPr>
         <w:pStyle w:val="Ttulo1"/>
       </w:pPr>
-      <w:bookmarkStart w:id="30" w:name="_Toc241424197"/>
+      <w:bookmarkStart w:id="30" w:name="_Toc242002993"/>
       <w:r>
         <w:rPr>
           <w:rFonts w:ascii="Times New Roman" w:hAnsi="Times New Roman"/>
@@ -10464,7 +10232,7 @@
       <w:pPr>
         <w:pStyle w:val="Ttulo2"/>
       </w:pPr>
-      <w:bookmarkStart w:id="31" w:name="_Toc241424198"/>
+      <w:bookmarkStart w:id="31" w:name="_Toc242002994"/>
       <w:r>
         <w:rPr>
           <w:rFonts w:ascii="Times New Roman" w:hAnsi="Times New Roman"/>
@@ -10506,7 +10274,7 @@
       <w:pPr>
         <w:pStyle w:val="Ttulo2"/>
       </w:pPr>
-      <w:bookmarkStart w:id="32" w:name="_Toc241424199"/>
+      <w:bookmarkStart w:id="32" w:name="_Toc242002995"/>
       <w:r>
         <w:rPr>
           <w:rFonts w:ascii="Times New Roman" w:hAnsi="Times New Roman"/>
@@ -11134,7 +10902,7 @@
       <w:pPr>
         <w:pStyle w:val="Ttulo2"/>
       </w:pPr>
-      <w:bookmarkStart w:id="33" w:name="_Toc241424200"/>
+      <w:bookmarkStart w:id="33" w:name="_Toc242002996"/>
       <w:r>
         <w:rPr>
           <w:rFonts w:ascii="Times New Roman" w:hAnsi="Times New Roman"/>
@@ -11660,7 +11428,7 @@
       <w:pPr>
         <w:pStyle w:val="Ttulo1"/>
       </w:pPr>
-      <w:bookmarkStart w:id="34" w:name="_Toc241424201"/>
+      <w:bookmarkStart w:id="34" w:name="_Toc242002997"/>
       <w:r>
         <w:rPr>
           <w:rFonts w:ascii="Times New Roman" w:hAnsi="Times New Roman"/>
@@ -11673,7 +11441,7 @@
       <w:pPr>
         <w:pStyle w:val="Ttulo2"/>
       </w:pPr>
-      <w:bookmarkStart w:id="35" w:name="_Toc241424202"/>
+      <w:bookmarkStart w:id="35" w:name="_Toc242002998"/>
       <w:r>
         <w:rPr>
           <w:rFonts w:ascii="Times New Roman" w:hAnsi="Times New Roman"/>
@@ -11694,7 +11462,7 @@
       <w:pPr>
         <w:pStyle w:val="Ttulo2"/>
       </w:pPr>
-      <w:bookmarkStart w:id="36" w:name="_Toc241424203"/>
+      <w:bookmarkStart w:id="36" w:name="_Toc242002999"/>
       <w:r>
         <w:rPr>
           <w:rFonts w:ascii="Times New Roman" w:hAnsi="Times New Roman"/>
@@ -12248,7 +12016,7 @@
       <w:pPr>
         <w:pStyle w:val="Ttulo2"/>
       </w:pPr>
-      <w:bookmarkStart w:id="37" w:name="_Toc241424204"/>
+      <w:bookmarkStart w:id="37" w:name="_Toc242003000"/>
       <w:r>
         <w:rPr>
           <w:rFonts w:ascii="Times New Roman" w:hAnsi="Times New Roman"/>
@@ -12559,7 +12327,7 @@
       <w:pPr>
         <w:pStyle w:val="Ttulo2"/>
       </w:pPr>
-      <w:bookmarkStart w:id="38" w:name="_Toc241424205"/>
+      <w:bookmarkStart w:id="38" w:name="_Toc242003001"/>
       <w:r>
         <w:rPr>
           <w:rFonts w:ascii="Times New Roman" w:hAnsi="Times New Roman"/>
@@ -13409,7 +13177,7 @@
       <w:pPr>
         <w:pStyle w:val="Ttulo1"/>
       </w:pPr>
-      <w:bookmarkStart w:id="39" w:name="_Toc241424206"/>
+      <w:bookmarkStart w:id="39" w:name="_Toc242003002"/>
       <w:r>
         <w:rPr>
           <w:rFonts w:ascii="Times New Roman" w:hAnsi="Times New Roman"/>
@@ -13422,7 +13190,7 @@
       <w:pPr>
         <w:pStyle w:val="Ttulo2"/>
       </w:pPr>
-      <w:bookmarkStart w:id="40" w:name="_Toc241424207"/>
+      <w:bookmarkStart w:id="40" w:name="_Toc242003003"/>
       <w:r>
         <w:rPr>
           <w:rFonts w:ascii="Times New Roman" w:hAnsi="Times New Roman"/>
@@ -13478,14 +13246,14 @@
         <w:t>docs/</w:t>
       </w:r>
       <w:r>
-        <w:t xml:space="preserve"> reúne la maquetación, las capturas y los informes de las tres. El historial tiene siete envíos, uno por hito, con mensajes que describen el cambio.</w:t>
+        <w:t xml:space="preserve"> reúne la maquetación, las capturas y los informes de las tres. El historial tiene un envío por hito, con mensajes que describen el cambio.</w:t>
       </w:r>
     </w:p>
     <w:p>
       <w:pPr>
         <w:pStyle w:val="Ttulo2"/>
       </w:pPr>
-      <w:bookmarkStart w:id="41" w:name="_Toc241424208"/>
+      <w:bookmarkStart w:id="41" w:name="_Toc242003004"/>
       <w:r>
         <w:rPr>
           <w:rFonts w:ascii="Times New Roman" w:hAnsi="Times New Roman"/>
@@ -13499,7 +13267,10 @@
         <w:ind w:firstLine="720"/>
       </w:pPr>
       <w:r>
-        <w:t>El vídeo de presentación, de duración inferior a tres minutos, recorre el aplicativo desplegado: muestra la portada, el filtrado del listado, la lectura de una noticia, el guardado en favoritos con el contador de la cabecera actualizándose, la creación de una noticia con su vista previa en vivo y el formulario de contacto, y termina explicando la arquitectura de componentes y el despliegue automático.</w:t>
+        <w:t>El vídeo de presentación, de duración inferior a tres minutos, recorre el aplicativo desplegado en GitHub Pages: la portada, el listado de noticias, la lectura de una noticia, el formulario para publicar, la página de favoritos y el formulario de contacto. Termina en el editor, con el componente de la tarjeta de noticia, para explicar cómo se arma la interfaz con componentes reutilizables, cómo la tarjeta recibe los datos y avisa a la página al marcar un favorito, y cómo el despliegue se actualiza automátic</w:t>
+      </w:r>
+      <w:r>
+        <w:t>amente con cada cambio enviado a GitHub.</w:t>
       </w:r>
     </w:p>
     <w:p>
@@ -13518,14 +13289,14 @@
         <w:rPr>
           <w:b/>
         </w:rPr>
-        <w:t>[PEGAR AQUÍ EL ENLACE DE YOUTUBE ANTES DE GENERAR EL PDF]</w:t>
+        <w:t>https://youtu.be/7ltYDqaxYc0</w:t>
       </w:r>
     </w:p>
     <w:p>
       <w:pPr>
         <w:pStyle w:val="Ttulo1"/>
       </w:pPr>
-      <w:bookmarkStart w:id="42" w:name="_Toc241424209"/>
+      <w:bookmarkStart w:id="42" w:name="_Toc242003005"/>
       <w:r>
         <w:rPr>
           <w:rFonts w:ascii="Times New Roman" w:hAnsi="Times New Roman"/>
@@ -13562,11 +13333,11 @@
         <w:t>El coste del framework es real y conviene medirlo.</w:t>
       </w:r>
       <w:r>
-        <w:t xml:space="preserve"> El aplicativo entrega 393 KB de JavaScript compilado donde el prototipo entregaba 73,5 KB, y el fragmento mayor —254 KB de Angular, enrutador y formularios— pesa varias veces más que toda la lógica propia. Para este </w:t>
+        <w:t xml:space="preserve"> El aplicativo entrega 393 KB de JavaScript compilado donde el prototipo entregaba 73,5 KB, y el fragmento mayor —254 KB de </w:t>
       </w:r>
       <w:r>
         <w:lastRenderedPageBreak/>
-        <w:t>proyecto la carga diferida por vista y la facilidad de mantenimiento lo compensan; para una página de tres pantallas que no va a cambiar, no lo compensaría. Aprender a usar una herramienta incluye saber cuándo no usarla.</w:t>
+        <w:t>Angular, enrutador y formularios— pesa varias veces más que toda la lógica propia. Para este proyecto la carga diferida por vista y la facilidad de mantenimiento lo compensan; para una página de tres pantallas que no va a cambiar, no lo compensaría. Aprender a usar una herramienta incluye saber cuándo no usarla.</w:t>
       </w:r>
     </w:p>
     <w:p>
@@ -13632,7 +13403,11 @@
         <w:t>Las tres entregas describen un orden que resultó ser el correcto.</w:t>
       </w:r>
       <w:r>
-        <w:t xml:space="preserve"> Definir primero el aspecto, después el comportamiento y solo al final la tecnología permitió que cada etapa se apoyara en algo ya decidido. Al migrar no hubo que discutir cómo debía verse una tarjeta ni cuántas noticias caben en una página: esas preguntas estaban cerradas, y el trabajo pudo concentrarse en el </w:t>
+        <w:t xml:space="preserve"> Definir primero el aspecto, después el comportamiento y solo al final la tecnología permitió que cada etapa se apoyara en algo ya decidido. Al migrar no hubo que discutir cómo debía verse una tarjeta ni </w:t>
+      </w:r>
+      <w:r>
+        <w:lastRenderedPageBreak/>
+        <w:t xml:space="preserve">cuántas noticias caben en una página: esas preguntas estaban cerradas, y el trabajo pudo concentrarse en el </w:t>
       </w:r>
       <w:r>
         <w:rPr>
@@ -13648,12 +13423,11 @@
       <w:pPr>
         <w:pStyle w:val="Ttulo1"/>
       </w:pPr>
-      <w:bookmarkStart w:id="43" w:name="_Toc241424210"/>
+      <w:bookmarkStart w:id="43" w:name="_Toc242003006"/>
       <w:r>
         <w:rPr>
           <w:rFonts w:ascii="Times New Roman" w:hAnsi="Times New Roman"/>
         </w:rPr>
-        <w:lastRenderedPageBreak/>
         <w:t>11. Referencias</w:t>
       </w:r>
       <w:bookmarkEnd w:id="43"/>
@@ -14091,31 +13865,31 @@
       </w:rPr>
     </w:lvl>
   </w:abstractNum>
-  <w:num w:numId="1" w16cid:durableId="1178732499">
+  <w:num w:numId="1" w16cid:durableId="548685061">
     <w:abstractNumId w:val="8"/>
   </w:num>
-  <w:num w:numId="2" w16cid:durableId="577834731">
+  <w:num w:numId="2" w16cid:durableId="2130935126">
     <w:abstractNumId w:val="6"/>
   </w:num>
-  <w:num w:numId="3" w16cid:durableId="1218275556">
+  <w:num w:numId="3" w16cid:durableId="379937746">
     <w:abstractNumId w:val="5"/>
   </w:num>
-  <w:num w:numId="4" w16cid:durableId="1916622471">
+  <w:num w:numId="4" w16cid:durableId="1748069011">
     <w:abstractNumId w:val="4"/>
   </w:num>
-  <w:num w:numId="5" w16cid:durableId="665060664">
+  <w:num w:numId="5" w16cid:durableId="2060352613">
     <w:abstractNumId w:val="7"/>
   </w:num>
-  <w:num w:numId="6" w16cid:durableId="423721563">
+  <w:num w:numId="6" w16cid:durableId="532839166">
     <w:abstractNumId w:val="3"/>
   </w:num>
-  <w:num w:numId="7" w16cid:durableId="1523320888">
+  <w:num w:numId="7" w16cid:durableId="1727336067">
     <w:abstractNumId w:val="2"/>
   </w:num>
-  <w:num w:numId="8" w16cid:durableId="969625964">
+  <w:num w:numId="8" w16cid:durableId="1354572880">
     <w:abstractNumId w:val="1"/>
   </w:num>
-  <w:num w:numId="9" w16cid:durableId="861436753">
+  <w:num w:numId="9" w16cid:durableId="2085376144">
     <w:abstractNumId w:val="0"/>
   </w:num>
 </w:numbering>
@@ -25511,7 +25285,7 @@
     <w:autoRedefine/>
     <w:uiPriority w:val="39"/>
     <w:unhideWhenUsed/>
-    <w:rsid w:val="00F6469F"/>
+    <w:rsid w:val="001468CD"/>
     <w:pPr>
       <w:spacing w:after="100"/>
     </w:pPr>
@@ -25523,7 +25297,7 @@
     <w:autoRedefine/>
     <w:uiPriority w:val="39"/>
     <w:unhideWhenUsed/>
-    <w:rsid w:val="00F6469F"/>
+    <w:rsid w:val="001468CD"/>
     <w:pPr>
       <w:spacing w:after="100"/>
       <w:ind w:left="240"/>
@@ -25534,7 +25308,7 @@
     <w:basedOn w:val="Fuentedeprrafopredeter"/>
     <w:uiPriority w:val="99"/>
     <w:unhideWhenUsed/>
-    <w:rsid w:val="00F6469F"/>
+    <w:rsid w:val="001468CD"/>
     <w:rPr>
       <w:color w:val="0000FF" w:themeColor="hyperlink"/>
       <w:u w:val="single"/>

</xml_diff>

<commit_message>
Entrega 3: fecha de entrega en la portada
Co-Authored-By: Claude Opus 5.5 <noreply@anthropic.com>
</commit_message>
<xml_diff>
--- a/docs/entrega-3/Entrega-3-Entrega-Final-Pulso-Digital.docx
+++ b/docs/entrega-3/Entrega-3-Entrega-Final-Pulso-Digital.docx
@@ -108,7 +108,7 @@
       <w:r>
         <w:fldChar w:fldCharType="separate"/>
       </w:r>
-      <w:hyperlink w:anchor="_Toc242002963" w:history="1">
+      <w:hyperlink w:anchor="_Toc242003138" w:history="1">
         <w:r>
           <w:rPr>
             <w:rStyle w:val="Hipervnculo"/>
@@ -136,7 +136,7 @@
             <w:noProof/>
             <w:webHidden/>
           </w:rPr>
-          <w:instrText xml:space="preserve"> PAGEREF _Toc242002963 \h </w:instrText>
+          <w:instrText xml:space="preserve"> PAGEREF _Toc242003138 \h </w:instrText>
         </w:r>
         <w:r>
           <w:rPr>
@@ -177,7 +177,7 @@
           <w:noProof/>
         </w:rPr>
       </w:pPr>
-      <w:hyperlink w:anchor="_Toc242002964" w:history="1">
+      <w:hyperlink w:anchor="_Toc242003139" w:history="1">
         <w:r>
           <w:rPr>
             <w:rStyle w:val="Hipervnculo"/>
@@ -205,7 +205,7 @@
             <w:noProof/>
             <w:webHidden/>
           </w:rPr>
-          <w:instrText xml:space="preserve"> PAGEREF _Toc242002964 \h </w:instrText>
+          <w:instrText xml:space="preserve"> PAGEREF _Toc242003139 \h </w:instrText>
         </w:r>
         <w:r>
           <w:rPr>
@@ -246,7 +246,7 @@
           <w:noProof/>
         </w:rPr>
       </w:pPr>
-      <w:hyperlink w:anchor="_Toc242002965" w:history="1">
+      <w:hyperlink w:anchor="_Toc242003140" w:history="1">
         <w:r>
           <w:rPr>
             <w:rStyle w:val="Hipervnculo"/>
@@ -274,7 +274,7 @@
             <w:noProof/>
             <w:webHidden/>
           </w:rPr>
-          <w:instrText xml:space="preserve"> PAGEREF _Toc242002965 \h </w:instrText>
+          <w:instrText xml:space="preserve"> PAGEREF _Toc242003140 \h </w:instrText>
         </w:r>
         <w:r>
           <w:rPr>
@@ -315,7 +315,7 @@
           <w:noProof/>
         </w:rPr>
       </w:pPr>
-      <w:hyperlink w:anchor="_Toc242002966" w:history="1">
+      <w:hyperlink w:anchor="_Toc242003141" w:history="1">
         <w:r>
           <w:rPr>
             <w:rStyle w:val="Hipervnculo"/>
@@ -343,7 +343,7 @@
             <w:noProof/>
             <w:webHidden/>
           </w:rPr>
-          <w:instrText xml:space="preserve"> PAGEREF _Toc242002966 \h </w:instrText>
+          <w:instrText xml:space="preserve"> PAGEREF _Toc242003141 \h </w:instrText>
         </w:r>
         <w:r>
           <w:rPr>
@@ -384,7 +384,7 @@
           <w:noProof/>
         </w:rPr>
       </w:pPr>
-      <w:hyperlink w:anchor="_Toc242002967" w:history="1">
+      <w:hyperlink w:anchor="_Toc242003142" w:history="1">
         <w:r>
           <w:rPr>
             <w:rStyle w:val="Hipervnculo"/>
@@ -412,7 +412,7 @@
             <w:noProof/>
             <w:webHidden/>
           </w:rPr>
-          <w:instrText xml:space="preserve"> PAGEREF _Toc242002967 \h </w:instrText>
+          <w:instrText xml:space="preserve"> PAGEREF _Toc242003142 \h </w:instrText>
         </w:r>
         <w:r>
           <w:rPr>
@@ -453,7 +453,7 @@
           <w:noProof/>
         </w:rPr>
       </w:pPr>
-      <w:hyperlink w:anchor="_Toc242002968" w:history="1">
+      <w:hyperlink w:anchor="_Toc242003143" w:history="1">
         <w:r>
           <w:rPr>
             <w:rStyle w:val="Hipervnculo"/>
@@ -481,7 +481,7 @@
             <w:noProof/>
             <w:webHidden/>
           </w:rPr>
-          <w:instrText xml:space="preserve"> PAGEREF _Toc242002968 \h </w:instrText>
+          <w:instrText xml:space="preserve"> PAGEREF _Toc242003143 \h </w:instrText>
         </w:r>
         <w:r>
           <w:rPr>
@@ -522,7 +522,7 @@
           <w:noProof/>
         </w:rPr>
       </w:pPr>
-      <w:hyperlink w:anchor="_Toc242002969" w:history="1">
+      <w:hyperlink w:anchor="_Toc242003144" w:history="1">
         <w:r>
           <w:rPr>
             <w:rStyle w:val="Hipervnculo"/>
@@ -550,7 +550,7 @@
             <w:noProof/>
             <w:webHidden/>
           </w:rPr>
-          <w:instrText xml:space="preserve"> PAGEREF _Toc242002969 \h </w:instrText>
+          <w:instrText xml:space="preserve"> PAGEREF _Toc242003144 \h </w:instrText>
         </w:r>
         <w:r>
           <w:rPr>
@@ -591,7 +591,7 @@
           <w:noProof/>
         </w:rPr>
       </w:pPr>
-      <w:hyperlink w:anchor="_Toc242002970" w:history="1">
+      <w:hyperlink w:anchor="_Toc242003145" w:history="1">
         <w:r>
           <w:rPr>
             <w:rStyle w:val="Hipervnculo"/>
@@ -619,7 +619,7 @@
             <w:noProof/>
             <w:webHidden/>
           </w:rPr>
-          <w:instrText xml:space="preserve"> PAGEREF _Toc242002970 \h </w:instrText>
+          <w:instrText xml:space="preserve"> PAGEREF _Toc242003145 \h </w:instrText>
         </w:r>
         <w:r>
           <w:rPr>
@@ -660,7 +660,7 @@
           <w:noProof/>
         </w:rPr>
       </w:pPr>
-      <w:hyperlink w:anchor="_Toc242002971" w:history="1">
+      <w:hyperlink w:anchor="_Toc242003146" w:history="1">
         <w:r>
           <w:rPr>
             <w:rStyle w:val="Hipervnculo"/>
@@ -688,7 +688,7 @@
             <w:noProof/>
             <w:webHidden/>
           </w:rPr>
-          <w:instrText xml:space="preserve"> PAGEREF _Toc242002971 \h </w:instrText>
+          <w:instrText xml:space="preserve"> PAGEREF _Toc242003146 \h </w:instrText>
         </w:r>
         <w:r>
           <w:rPr>
@@ -729,7 +729,7 @@
           <w:noProof/>
         </w:rPr>
       </w:pPr>
-      <w:hyperlink w:anchor="_Toc242002972" w:history="1">
+      <w:hyperlink w:anchor="_Toc242003147" w:history="1">
         <w:r>
           <w:rPr>
             <w:rStyle w:val="Hipervnculo"/>
@@ -757,7 +757,7 @@
             <w:noProof/>
             <w:webHidden/>
           </w:rPr>
-          <w:instrText xml:space="preserve"> PAGEREF _Toc242002972 \h </w:instrText>
+          <w:instrText xml:space="preserve"> PAGEREF _Toc242003147 \h </w:instrText>
         </w:r>
         <w:r>
           <w:rPr>
@@ -798,7 +798,7 @@
           <w:noProof/>
         </w:rPr>
       </w:pPr>
-      <w:hyperlink w:anchor="_Toc242002973" w:history="1">
+      <w:hyperlink w:anchor="_Toc242003148" w:history="1">
         <w:r>
           <w:rPr>
             <w:rStyle w:val="Hipervnculo"/>
@@ -826,7 +826,7 @@
             <w:noProof/>
             <w:webHidden/>
           </w:rPr>
-          <w:instrText xml:space="preserve"> PAGEREF _Toc242002973 \h </w:instrText>
+          <w:instrText xml:space="preserve"> PAGEREF _Toc242003148 \h </w:instrText>
         </w:r>
         <w:r>
           <w:rPr>
@@ -867,7 +867,7 @@
           <w:noProof/>
         </w:rPr>
       </w:pPr>
-      <w:hyperlink w:anchor="_Toc242002974" w:history="1">
+      <w:hyperlink w:anchor="_Toc242003149" w:history="1">
         <w:r>
           <w:rPr>
             <w:rStyle w:val="Hipervnculo"/>
@@ -895,7 +895,7 @@
             <w:noProof/>
             <w:webHidden/>
           </w:rPr>
-          <w:instrText xml:space="preserve"> PAGEREF _Toc242002974 \h </w:instrText>
+          <w:instrText xml:space="preserve"> PAGEREF _Toc242003149 \h </w:instrText>
         </w:r>
         <w:r>
           <w:rPr>
@@ -936,7 +936,7 @@
           <w:noProof/>
         </w:rPr>
       </w:pPr>
-      <w:hyperlink w:anchor="_Toc242002975" w:history="1">
+      <w:hyperlink w:anchor="_Toc242003150" w:history="1">
         <w:r>
           <w:rPr>
             <w:rStyle w:val="Hipervnculo"/>
@@ -964,7 +964,7 @@
             <w:noProof/>
             <w:webHidden/>
           </w:rPr>
-          <w:instrText xml:space="preserve"> PAGEREF _Toc242002975 \h </w:instrText>
+          <w:instrText xml:space="preserve"> PAGEREF _Toc242003150 \h </w:instrText>
         </w:r>
         <w:r>
           <w:rPr>
@@ -1005,7 +1005,7 @@
           <w:noProof/>
         </w:rPr>
       </w:pPr>
-      <w:hyperlink w:anchor="_Toc242002976" w:history="1">
+      <w:hyperlink w:anchor="_Toc242003151" w:history="1">
         <w:r>
           <w:rPr>
             <w:rStyle w:val="Hipervnculo"/>
@@ -1033,7 +1033,7 @@
             <w:noProof/>
             <w:webHidden/>
           </w:rPr>
-          <w:instrText xml:space="preserve"> PAGEREF _Toc242002976 \h </w:instrText>
+          <w:instrText xml:space="preserve"> PAGEREF _Toc242003151 \h </w:instrText>
         </w:r>
         <w:r>
           <w:rPr>
@@ -1074,7 +1074,7 @@
           <w:noProof/>
         </w:rPr>
       </w:pPr>
-      <w:hyperlink w:anchor="_Toc242002977" w:history="1">
+      <w:hyperlink w:anchor="_Toc242003152" w:history="1">
         <w:r>
           <w:rPr>
             <w:rStyle w:val="Hipervnculo"/>
@@ -1102,7 +1102,7 @@
             <w:noProof/>
             <w:webHidden/>
           </w:rPr>
-          <w:instrText xml:space="preserve"> PAGEREF _Toc242002977 \h </w:instrText>
+          <w:instrText xml:space="preserve"> PAGEREF _Toc242003152 \h </w:instrText>
         </w:r>
         <w:r>
           <w:rPr>
@@ -1143,7 +1143,7 @@
           <w:noProof/>
         </w:rPr>
       </w:pPr>
-      <w:hyperlink w:anchor="_Toc242002978" w:history="1">
+      <w:hyperlink w:anchor="_Toc242003153" w:history="1">
         <w:r>
           <w:rPr>
             <w:rStyle w:val="Hipervnculo"/>
@@ -1171,7 +1171,7 @@
             <w:noProof/>
             <w:webHidden/>
           </w:rPr>
-          <w:instrText xml:space="preserve"> PAGEREF _Toc242002978 \h </w:instrText>
+          <w:instrText xml:space="preserve"> PAGEREF _Toc242003153 \h </w:instrText>
         </w:r>
         <w:r>
           <w:rPr>
@@ -1212,7 +1212,7 @@
           <w:noProof/>
         </w:rPr>
       </w:pPr>
-      <w:hyperlink w:anchor="_Toc242002979" w:history="1">
+      <w:hyperlink w:anchor="_Toc242003154" w:history="1">
         <w:r>
           <w:rPr>
             <w:rStyle w:val="Hipervnculo"/>
@@ -1240,7 +1240,7 @@
             <w:noProof/>
             <w:webHidden/>
           </w:rPr>
-          <w:instrText xml:space="preserve"> PAGEREF _Toc242002979 \h </w:instrText>
+          <w:instrText xml:space="preserve"> PAGEREF _Toc242003154 \h </w:instrText>
         </w:r>
         <w:r>
           <w:rPr>
@@ -1281,7 +1281,7 @@
           <w:noProof/>
         </w:rPr>
       </w:pPr>
-      <w:hyperlink w:anchor="_Toc242002980" w:history="1">
+      <w:hyperlink w:anchor="_Toc242003155" w:history="1">
         <w:r>
           <w:rPr>
             <w:rStyle w:val="Hipervnculo"/>
@@ -1309,7 +1309,7 @@
             <w:noProof/>
             <w:webHidden/>
           </w:rPr>
-          <w:instrText xml:space="preserve"> PAGEREF _Toc242002980 \h </w:instrText>
+          <w:instrText xml:space="preserve"> PAGEREF _Toc242003155 \h </w:instrText>
         </w:r>
         <w:r>
           <w:rPr>
@@ -1350,7 +1350,7 @@
           <w:noProof/>
         </w:rPr>
       </w:pPr>
-      <w:hyperlink w:anchor="_Toc242002981" w:history="1">
+      <w:hyperlink w:anchor="_Toc242003156" w:history="1">
         <w:r>
           <w:rPr>
             <w:rStyle w:val="Hipervnculo"/>
@@ -1378,7 +1378,7 @@
             <w:noProof/>
             <w:webHidden/>
           </w:rPr>
-          <w:instrText xml:space="preserve"> PAGEREF _Toc242002981 \h </w:instrText>
+          <w:instrText xml:space="preserve"> PAGEREF _Toc242003156 \h </w:instrText>
         </w:r>
         <w:r>
           <w:rPr>
@@ -1419,7 +1419,7 @@
           <w:noProof/>
         </w:rPr>
       </w:pPr>
-      <w:hyperlink w:anchor="_Toc242002982" w:history="1">
+      <w:hyperlink w:anchor="_Toc242003157" w:history="1">
         <w:r>
           <w:rPr>
             <w:rStyle w:val="Hipervnculo"/>
@@ -1447,7 +1447,7 @@
             <w:noProof/>
             <w:webHidden/>
           </w:rPr>
-          <w:instrText xml:space="preserve"> PAGEREF _Toc242002982 \h </w:instrText>
+          <w:instrText xml:space="preserve"> PAGEREF _Toc242003157 \h </w:instrText>
         </w:r>
         <w:r>
           <w:rPr>
@@ -1488,7 +1488,7 @@
           <w:noProof/>
         </w:rPr>
       </w:pPr>
-      <w:hyperlink w:anchor="_Toc242002983" w:history="1">
+      <w:hyperlink w:anchor="_Toc242003158" w:history="1">
         <w:r>
           <w:rPr>
             <w:rStyle w:val="Hipervnculo"/>
@@ -1516,7 +1516,7 @@
             <w:noProof/>
             <w:webHidden/>
           </w:rPr>
-          <w:instrText xml:space="preserve"> PAGEREF _Toc242002983 \h </w:instrText>
+          <w:instrText xml:space="preserve"> PAGEREF _Toc242003158 \h </w:instrText>
         </w:r>
         <w:r>
           <w:rPr>
@@ -1557,7 +1557,7 @@
           <w:noProof/>
         </w:rPr>
       </w:pPr>
-      <w:hyperlink w:anchor="_Toc242002984" w:history="1">
+      <w:hyperlink w:anchor="_Toc242003159" w:history="1">
         <w:r>
           <w:rPr>
             <w:rStyle w:val="Hipervnculo"/>
@@ -1585,7 +1585,7 @@
             <w:noProof/>
             <w:webHidden/>
           </w:rPr>
-          <w:instrText xml:space="preserve"> PAGEREF _Toc242002984 \h </w:instrText>
+          <w:instrText xml:space="preserve"> PAGEREF _Toc242003159 \h </w:instrText>
         </w:r>
         <w:r>
           <w:rPr>
@@ -1626,7 +1626,7 @@
           <w:noProof/>
         </w:rPr>
       </w:pPr>
-      <w:hyperlink w:anchor="_Toc242002985" w:history="1">
+      <w:hyperlink w:anchor="_Toc242003160" w:history="1">
         <w:r>
           <w:rPr>
             <w:rStyle w:val="Hipervnculo"/>
@@ -1654,7 +1654,7 @@
             <w:noProof/>
             <w:webHidden/>
           </w:rPr>
-          <w:instrText xml:space="preserve"> PAGEREF _Toc242002985 \h </w:instrText>
+          <w:instrText xml:space="preserve"> PAGEREF _Toc242003160 \h </w:instrText>
         </w:r>
         <w:r>
           <w:rPr>
@@ -1695,7 +1695,7 @@
           <w:noProof/>
         </w:rPr>
       </w:pPr>
-      <w:hyperlink w:anchor="_Toc242002986" w:history="1">
+      <w:hyperlink w:anchor="_Toc242003161" w:history="1">
         <w:r>
           <w:rPr>
             <w:rStyle w:val="Hipervnculo"/>
@@ -1723,7 +1723,7 @@
             <w:noProof/>
             <w:webHidden/>
           </w:rPr>
-          <w:instrText xml:space="preserve"> PAGEREF _Toc242002986 \h </w:instrText>
+          <w:instrText xml:space="preserve"> PAGEREF _Toc242003161 \h </w:instrText>
         </w:r>
         <w:r>
           <w:rPr>
@@ -1764,7 +1764,7 @@
           <w:noProof/>
         </w:rPr>
       </w:pPr>
-      <w:hyperlink w:anchor="_Toc242002987" w:history="1">
+      <w:hyperlink w:anchor="_Toc242003162" w:history="1">
         <w:r>
           <w:rPr>
             <w:rStyle w:val="Hipervnculo"/>
@@ -1792,7 +1792,7 @@
             <w:noProof/>
             <w:webHidden/>
           </w:rPr>
-          <w:instrText xml:space="preserve"> PAGEREF _Toc242002987 \h </w:instrText>
+          <w:instrText xml:space="preserve"> PAGEREF _Toc242003162 \h </w:instrText>
         </w:r>
         <w:r>
           <w:rPr>
@@ -1833,7 +1833,7 @@
           <w:noProof/>
         </w:rPr>
       </w:pPr>
-      <w:hyperlink w:anchor="_Toc242002988" w:history="1">
+      <w:hyperlink w:anchor="_Toc242003163" w:history="1">
         <w:r>
           <w:rPr>
             <w:rStyle w:val="Hipervnculo"/>
@@ -1861,7 +1861,7 @@
             <w:noProof/>
             <w:webHidden/>
           </w:rPr>
-          <w:instrText xml:space="preserve"> PAGEREF _Toc242002988 \h </w:instrText>
+          <w:instrText xml:space="preserve"> PAGEREF _Toc242003163 \h </w:instrText>
         </w:r>
         <w:r>
           <w:rPr>
@@ -1902,7 +1902,7 @@
           <w:noProof/>
         </w:rPr>
       </w:pPr>
-      <w:hyperlink w:anchor="_Toc242002989" w:history="1">
+      <w:hyperlink w:anchor="_Toc242003164" w:history="1">
         <w:r>
           <w:rPr>
             <w:rStyle w:val="Hipervnculo"/>
@@ -1930,7 +1930,7 @@
             <w:noProof/>
             <w:webHidden/>
           </w:rPr>
-          <w:instrText xml:space="preserve"> PAGEREF _Toc242002989 \h </w:instrText>
+          <w:instrText xml:space="preserve"> PAGEREF _Toc242003164 \h </w:instrText>
         </w:r>
         <w:r>
           <w:rPr>
@@ -1971,7 +1971,7 @@
           <w:noProof/>
         </w:rPr>
       </w:pPr>
-      <w:hyperlink w:anchor="_Toc242002990" w:history="1">
+      <w:hyperlink w:anchor="_Toc242003165" w:history="1">
         <w:r>
           <w:rPr>
             <w:rStyle w:val="Hipervnculo"/>
@@ -1999,7 +1999,7 @@
             <w:noProof/>
             <w:webHidden/>
           </w:rPr>
-          <w:instrText xml:space="preserve"> PAGEREF _Toc242002990 \h </w:instrText>
+          <w:instrText xml:space="preserve"> PAGEREF _Toc242003165 \h </w:instrText>
         </w:r>
         <w:r>
           <w:rPr>
@@ -2040,7 +2040,7 @@
           <w:noProof/>
         </w:rPr>
       </w:pPr>
-      <w:hyperlink w:anchor="_Toc242002991" w:history="1">
+      <w:hyperlink w:anchor="_Toc242003166" w:history="1">
         <w:r>
           <w:rPr>
             <w:rStyle w:val="Hipervnculo"/>
@@ -2068,7 +2068,7 @@
             <w:noProof/>
             <w:webHidden/>
           </w:rPr>
-          <w:instrText xml:space="preserve"> PAGEREF _Toc242002991 \h </w:instrText>
+          <w:instrText xml:space="preserve"> PAGEREF _Toc242003166 \h </w:instrText>
         </w:r>
         <w:r>
           <w:rPr>
@@ -2109,7 +2109,7 @@
           <w:noProof/>
         </w:rPr>
       </w:pPr>
-      <w:hyperlink w:anchor="_Toc242002992" w:history="1">
+      <w:hyperlink w:anchor="_Toc242003167" w:history="1">
         <w:r>
           <w:rPr>
             <w:rStyle w:val="Hipervnculo"/>
@@ -2137,7 +2137,7 @@
             <w:noProof/>
             <w:webHidden/>
           </w:rPr>
-          <w:instrText xml:space="preserve"> PAGEREF _Toc242002992 \h </w:instrText>
+          <w:instrText xml:space="preserve"> PAGEREF _Toc242003167 \h </w:instrText>
         </w:r>
         <w:r>
           <w:rPr>
@@ -2178,7 +2178,7 @@
           <w:noProof/>
         </w:rPr>
       </w:pPr>
-      <w:hyperlink w:anchor="_Toc242002993" w:history="1">
+      <w:hyperlink w:anchor="_Toc242003168" w:history="1">
         <w:r>
           <w:rPr>
             <w:rStyle w:val="Hipervnculo"/>
@@ -2206,7 +2206,7 @@
             <w:noProof/>
             <w:webHidden/>
           </w:rPr>
-          <w:instrText xml:space="preserve"> PAGEREF _Toc242002993 \h </w:instrText>
+          <w:instrText xml:space="preserve"> PAGEREF _Toc242003168 \h </w:instrText>
         </w:r>
         <w:r>
           <w:rPr>
@@ -2247,7 +2247,7 @@
           <w:noProof/>
         </w:rPr>
       </w:pPr>
-      <w:hyperlink w:anchor="_Toc242002994" w:history="1">
+      <w:hyperlink w:anchor="_Toc242003169" w:history="1">
         <w:r>
           <w:rPr>
             <w:rStyle w:val="Hipervnculo"/>
@@ -2275,7 +2275,7 @@
             <w:noProof/>
             <w:webHidden/>
           </w:rPr>
-          <w:instrText xml:space="preserve"> PAGEREF _Toc242002994 \h </w:instrText>
+          <w:instrText xml:space="preserve"> PAGEREF _Toc242003169 \h </w:instrText>
         </w:r>
         <w:r>
           <w:rPr>
@@ -2316,7 +2316,7 @@
           <w:noProof/>
         </w:rPr>
       </w:pPr>
-      <w:hyperlink w:anchor="_Toc242002995" w:history="1">
+      <w:hyperlink w:anchor="_Toc242003170" w:history="1">
         <w:r>
           <w:rPr>
             <w:rStyle w:val="Hipervnculo"/>
@@ -2344,7 +2344,7 @@
             <w:noProof/>
             <w:webHidden/>
           </w:rPr>
-          <w:instrText xml:space="preserve"> PAGEREF _Toc242002995 \h </w:instrText>
+          <w:instrText xml:space="preserve"> PAGEREF _Toc242003170 \h </w:instrText>
         </w:r>
         <w:r>
           <w:rPr>
@@ -2385,7 +2385,7 @@
           <w:noProof/>
         </w:rPr>
       </w:pPr>
-      <w:hyperlink w:anchor="_Toc242002996" w:history="1">
+      <w:hyperlink w:anchor="_Toc242003171" w:history="1">
         <w:r>
           <w:rPr>
             <w:rStyle w:val="Hipervnculo"/>
@@ -2413,7 +2413,7 @@
             <w:noProof/>
             <w:webHidden/>
           </w:rPr>
-          <w:instrText xml:space="preserve"> PAGEREF _Toc242002996 \h </w:instrText>
+          <w:instrText xml:space="preserve"> PAGEREF _Toc242003171 \h </w:instrText>
         </w:r>
         <w:r>
           <w:rPr>
@@ -2454,7 +2454,7 @@
           <w:noProof/>
         </w:rPr>
       </w:pPr>
-      <w:hyperlink w:anchor="_Toc242002997" w:history="1">
+      <w:hyperlink w:anchor="_Toc242003172" w:history="1">
         <w:r>
           <w:rPr>
             <w:rStyle w:val="Hipervnculo"/>
@@ -2482,7 +2482,7 @@
             <w:noProof/>
             <w:webHidden/>
           </w:rPr>
-          <w:instrText xml:space="preserve"> PAGEREF _Toc242002997 \h </w:instrText>
+          <w:instrText xml:space="preserve"> PAGEREF _Toc242003172 \h </w:instrText>
         </w:r>
         <w:r>
           <w:rPr>
@@ -2523,7 +2523,7 @@
           <w:noProof/>
         </w:rPr>
       </w:pPr>
-      <w:hyperlink w:anchor="_Toc242002998" w:history="1">
+      <w:hyperlink w:anchor="_Toc242003173" w:history="1">
         <w:r>
           <w:rPr>
             <w:rStyle w:val="Hipervnculo"/>
@@ -2551,7 +2551,7 @@
             <w:noProof/>
             <w:webHidden/>
           </w:rPr>
-          <w:instrText xml:space="preserve"> PAGEREF _Toc242002998 \h </w:instrText>
+          <w:instrText xml:space="preserve"> PAGEREF _Toc242003173 \h </w:instrText>
         </w:r>
         <w:r>
           <w:rPr>
@@ -2592,7 +2592,7 @@
           <w:noProof/>
         </w:rPr>
       </w:pPr>
-      <w:hyperlink w:anchor="_Toc242002999" w:history="1">
+      <w:hyperlink w:anchor="_Toc242003174" w:history="1">
         <w:r>
           <w:rPr>
             <w:rStyle w:val="Hipervnculo"/>
@@ -2620,7 +2620,7 @@
             <w:noProof/>
             <w:webHidden/>
           </w:rPr>
-          <w:instrText xml:space="preserve"> PAGEREF _Toc242002999 \h </w:instrText>
+          <w:instrText xml:space="preserve"> PAGEREF _Toc242003174 \h </w:instrText>
         </w:r>
         <w:r>
           <w:rPr>
@@ -2661,7 +2661,7 @@
           <w:noProof/>
         </w:rPr>
       </w:pPr>
-      <w:hyperlink w:anchor="_Toc242003000" w:history="1">
+      <w:hyperlink w:anchor="_Toc242003175" w:history="1">
         <w:r>
           <w:rPr>
             <w:rStyle w:val="Hipervnculo"/>
@@ -2689,7 +2689,7 @@
             <w:noProof/>
             <w:webHidden/>
           </w:rPr>
-          <w:instrText xml:space="preserve"> PAGEREF _Toc242003000 \h </w:instrText>
+          <w:instrText xml:space="preserve"> PAGEREF _Toc242003175 \h </w:instrText>
         </w:r>
         <w:r>
           <w:rPr>
@@ -2730,7 +2730,7 @@
           <w:noProof/>
         </w:rPr>
       </w:pPr>
-      <w:hyperlink w:anchor="_Toc242003001" w:history="1">
+      <w:hyperlink w:anchor="_Toc242003176" w:history="1">
         <w:r>
           <w:rPr>
             <w:rStyle w:val="Hipervnculo"/>
@@ -2758,7 +2758,7 @@
             <w:noProof/>
             <w:webHidden/>
           </w:rPr>
-          <w:instrText xml:space="preserve"> PAGEREF _Toc242003001 \h </w:instrText>
+          <w:instrText xml:space="preserve"> PAGEREF _Toc242003176 \h </w:instrText>
         </w:r>
         <w:r>
           <w:rPr>
@@ -2799,7 +2799,7 @@
           <w:noProof/>
         </w:rPr>
       </w:pPr>
-      <w:hyperlink w:anchor="_Toc242003002" w:history="1">
+      <w:hyperlink w:anchor="_Toc242003177" w:history="1">
         <w:r>
           <w:rPr>
             <w:rStyle w:val="Hipervnculo"/>
@@ -2827,7 +2827,7 @@
             <w:noProof/>
             <w:webHidden/>
           </w:rPr>
-          <w:instrText xml:space="preserve"> PAGEREF _Toc242003002 \h </w:instrText>
+          <w:instrText xml:space="preserve"> PAGEREF _Toc242003177 \h </w:instrText>
         </w:r>
         <w:r>
           <w:rPr>
@@ -2868,7 +2868,7 @@
           <w:noProof/>
         </w:rPr>
       </w:pPr>
-      <w:hyperlink w:anchor="_Toc242003003" w:history="1">
+      <w:hyperlink w:anchor="_Toc242003178" w:history="1">
         <w:r>
           <w:rPr>
             <w:rStyle w:val="Hipervnculo"/>
@@ -2896,7 +2896,7 @@
             <w:noProof/>
             <w:webHidden/>
           </w:rPr>
-          <w:instrText xml:space="preserve"> PAGEREF _Toc242003003 \h </w:instrText>
+          <w:instrText xml:space="preserve"> PAGEREF _Toc242003178 \h </w:instrText>
         </w:r>
         <w:r>
           <w:rPr>
@@ -2937,7 +2937,7 @@
           <w:noProof/>
         </w:rPr>
       </w:pPr>
-      <w:hyperlink w:anchor="_Toc242003004" w:history="1">
+      <w:hyperlink w:anchor="_Toc242003179" w:history="1">
         <w:r>
           <w:rPr>
             <w:rStyle w:val="Hipervnculo"/>
@@ -2965,7 +2965,7 @@
             <w:noProof/>
             <w:webHidden/>
           </w:rPr>
-          <w:instrText xml:space="preserve"> PAGEREF _Toc242003004 \h </w:instrText>
+          <w:instrText xml:space="preserve"> PAGEREF _Toc242003179 \h </w:instrText>
         </w:r>
         <w:r>
           <w:rPr>
@@ -3006,7 +3006,7 @@
           <w:noProof/>
         </w:rPr>
       </w:pPr>
-      <w:hyperlink w:anchor="_Toc242003005" w:history="1">
+      <w:hyperlink w:anchor="_Toc242003180" w:history="1">
         <w:r>
           <w:rPr>
             <w:rStyle w:val="Hipervnculo"/>
@@ -3034,7 +3034,7 @@
             <w:noProof/>
             <w:webHidden/>
           </w:rPr>
-          <w:instrText xml:space="preserve"> PAGEREF _Toc242003005 \h </w:instrText>
+          <w:instrText xml:space="preserve"> PAGEREF _Toc242003180 \h </w:instrText>
         </w:r>
         <w:r>
           <w:rPr>
@@ -3075,7 +3075,7 @@
           <w:noProof/>
         </w:rPr>
       </w:pPr>
-      <w:hyperlink w:anchor="_Toc242003006" w:history="1">
+      <w:hyperlink w:anchor="_Toc242003181" w:history="1">
         <w:r>
           <w:rPr>
             <w:rStyle w:val="Hipervnculo"/>
@@ -3103,7 +3103,7 @@
             <w:noProof/>
             <w:webHidden/>
           </w:rPr>
-          <w:instrText xml:space="preserve"> PAGEREF _Toc242003006 \h </w:instrText>
+          <w:instrText xml:space="preserve"> PAGEREF _Toc242003181 \h </w:instrText>
         </w:r>
         <w:r>
           <w:rPr>
@@ -3148,7 +3148,7 @@
       <w:pPr>
         <w:pStyle w:val="Ttulo1"/>
       </w:pPr>
-      <w:bookmarkStart w:id="0" w:name="_Toc242002963"/>
+      <w:bookmarkStart w:id="0" w:name="_Toc242003138"/>
       <w:r>
         <w:rPr>
           <w:rFonts w:ascii="Times New Roman" w:hAnsi="Times New Roman"/>
@@ -3204,7 +3204,7 @@
       <w:pPr>
         <w:pStyle w:val="Ttulo1"/>
       </w:pPr>
-      <w:bookmarkStart w:id="1" w:name="_Toc242002964"/>
+      <w:bookmarkStart w:id="1" w:name="_Toc242003139"/>
       <w:r>
         <w:rPr>
           <w:rFonts w:ascii="Times New Roman" w:hAnsi="Times New Roman"/>
@@ -3969,7 +3969,7 @@
       <w:pPr>
         <w:pStyle w:val="Ttulo1"/>
       </w:pPr>
-      <w:bookmarkStart w:id="2" w:name="_Toc242002965"/>
+      <w:bookmarkStart w:id="2" w:name="_Toc242003140"/>
       <w:r>
         <w:rPr>
           <w:rFonts w:ascii="Times New Roman" w:hAnsi="Times New Roman"/>
@@ -3982,7 +3982,7 @@
       <w:pPr>
         <w:pStyle w:val="Ttulo2"/>
       </w:pPr>
-      <w:bookmarkStart w:id="3" w:name="_Toc242002966"/>
+      <w:bookmarkStart w:id="3" w:name="_Toc242003141"/>
       <w:r>
         <w:rPr>
           <w:rFonts w:ascii="Times New Roman" w:hAnsi="Times New Roman"/>
@@ -4044,7 +4044,7 @@
       <w:pPr>
         <w:pStyle w:val="Ttulo2"/>
       </w:pPr>
-      <w:bookmarkStart w:id="4" w:name="_Toc242002967"/>
+      <w:bookmarkStart w:id="4" w:name="_Toc242003142"/>
       <w:r>
         <w:rPr>
           <w:rFonts w:ascii="Times New Roman" w:hAnsi="Times New Roman"/>
@@ -4766,7 +4766,7 @@
       <w:pPr>
         <w:pStyle w:val="Ttulo1"/>
       </w:pPr>
-      <w:bookmarkStart w:id="5" w:name="_Toc242002968"/>
+      <w:bookmarkStart w:id="5" w:name="_Toc242003143"/>
       <w:r>
         <w:rPr>
           <w:rFonts w:ascii="Times New Roman" w:hAnsi="Times New Roman"/>
@@ -4787,7 +4787,7 @@
       <w:pPr>
         <w:pStyle w:val="Ttulo2"/>
       </w:pPr>
-      <w:bookmarkStart w:id="6" w:name="_Toc242002969"/>
+      <w:bookmarkStart w:id="6" w:name="_Toc242003144"/>
       <w:r>
         <w:rPr>
           <w:rFonts w:ascii="Times New Roman" w:hAnsi="Times New Roman"/>
@@ -4840,7 +4840,7 @@
           <w:noProof/>
         </w:rPr>
         <w:drawing>
-          <wp:inline distT="0" distB="0" distL="0" distR="0" wp14:anchorId="4F2CE73B" wp14:editId="08AF9B61">
+          <wp:inline distT="0" distB="0" distL="0" distR="0" wp14:anchorId="5F479037" wp14:editId="5774856A">
             <wp:extent cx="5940000" cy="5980838"/>
             <wp:effectExtent l="0" t="0" r="0" b="0"/>
             <wp:docPr id="1" name="Picture 1"/>
@@ -4895,7 +4895,7 @@
       <w:pPr>
         <w:pStyle w:val="Ttulo2"/>
       </w:pPr>
-      <w:bookmarkStart w:id="7" w:name="_Toc242002970"/>
+      <w:bookmarkStart w:id="7" w:name="_Toc242003145"/>
       <w:r>
         <w:rPr>
           <w:rFonts w:ascii="Times New Roman" w:hAnsi="Times New Roman"/>
@@ -4949,7 +4949,7 @@
           <w:noProof/>
         </w:rPr>
         <w:drawing>
-          <wp:inline distT="0" distB="0" distL="0" distR="0" wp14:anchorId="53E87CA7" wp14:editId="1902F726">
+          <wp:inline distT="0" distB="0" distL="0" distR="0" wp14:anchorId="2C2F21E1" wp14:editId="27337D92">
             <wp:extent cx="5940000" cy="5980838"/>
             <wp:effectExtent l="0" t="0" r="0" b="0"/>
             <wp:docPr id="2" name="Picture 2"/>
@@ -5004,7 +5004,7 @@
       <w:pPr>
         <w:pStyle w:val="Ttulo2"/>
       </w:pPr>
-      <w:bookmarkStart w:id="8" w:name="_Toc242002971"/>
+      <w:bookmarkStart w:id="8" w:name="_Toc242003146"/>
       <w:r>
         <w:rPr>
           <w:rFonts w:ascii="Times New Roman" w:hAnsi="Times New Roman"/>
@@ -5058,7 +5058,7 @@
           <w:noProof/>
         </w:rPr>
         <w:drawing>
-          <wp:inline distT="0" distB="0" distL="0" distR="0" wp14:anchorId="21D03689" wp14:editId="4BC8F56B">
+          <wp:inline distT="0" distB="0" distL="0" distR="0" wp14:anchorId="7D6512CA" wp14:editId="298EDDE6">
             <wp:extent cx="5940000" cy="5980838"/>
             <wp:effectExtent l="0" t="0" r="0" b="0"/>
             <wp:docPr id="3" name="Picture 3"/>
@@ -5113,7 +5113,7 @@
       <w:pPr>
         <w:pStyle w:val="Ttulo2"/>
       </w:pPr>
-      <w:bookmarkStart w:id="9" w:name="_Toc242002972"/>
+      <w:bookmarkStart w:id="9" w:name="_Toc242003147"/>
       <w:r>
         <w:rPr>
           <w:rFonts w:ascii="Times New Roman" w:hAnsi="Times New Roman"/>
@@ -5167,7 +5167,7 @@
           <w:noProof/>
         </w:rPr>
         <w:drawing>
-          <wp:inline distT="0" distB="0" distL="0" distR="0" wp14:anchorId="777BE6EE" wp14:editId="6757293A">
+          <wp:inline distT="0" distB="0" distL="0" distR="0" wp14:anchorId="68E3869C" wp14:editId="7BB00881">
             <wp:extent cx="5940000" cy="4744575"/>
             <wp:effectExtent l="0" t="0" r="0" b="0"/>
             <wp:docPr id="4" name="Picture 4"/>
@@ -5222,7 +5222,7 @@
       <w:pPr>
         <w:pStyle w:val="Ttulo2"/>
       </w:pPr>
-      <w:bookmarkStart w:id="10" w:name="_Toc242002973"/>
+      <w:bookmarkStart w:id="10" w:name="_Toc242003148"/>
       <w:r>
         <w:rPr>
           <w:rFonts w:ascii="Times New Roman" w:hAnsi="Times New Roman"/>
@@ -5293,7 +5293,7 @@
           <w:noProof/>
         </w:rPr>
         <w:drawing>
-          <wp:inline distT="0" distB="0" distL="0" distR="0" wp14:anchorId="15D57E26" wp14:editId="3A5536BF">
+          <wp:inline distT="0" distB="0" distL="0" distR="0" wp14:anchorId="2B43240B" wp14:editId="49CA721E">
             <wp:extent cx="5940000" cy="5980838"/>
             <wp:effectExtent l="0" t="0" r="0" b="0"/>
             <wp:docPr id="5" name="Picture 5"/>
@@ -5348,7 +5348,7 @@
       <w:pPr>
         <w:pStyle w:val="Ttulo2"/>
       </w:pPr>
-      <w:bookmarkStart w:id="11" w:name="_Toc242002974"/>
+      <w:bookmarkStart w:id="11" w:name="_Toc242003149"/>
       <w:r>
         <w:rPr>
           <w:rFonts w:ascii="Times New Roman" w:hAnsi="Times New Roman"/>
@@ -5402,7 +5402,7 @@
           <w:noProof/>
         </w:rPr>
         <w:drawing>
-          <wp:inline distT="0" distB="0" distL="0" distR="0" wp14:anchorId="7222070A" wp14:editId="1E74F9AE">
+          <wp:inline distT="0" distB="0" distL="0" distR="0" wp14:anchorId="7688C49C" wp14:editId="77EB7B19">
             <wp:extent cx="5940000" cy="5568750"/>
             <wp:effectExtent l="0" t="0" r="0" b="0"/>
             <wp:docPr id="6" name="Picture 6"/>
@@ -5457,7 +5457,7 @@
       <w:pPr>
         <w:pStyle w:val="Ttulo2"/>
       </w:pPr>
-      <w:bookmarkStart w:id="12" w:name="_Toc242002975"/>
+      <w:bookmarkStart w:id="12" w:name="_Toc242003150"/>
       <w:r>
         <w:rPr>
           <w:rFonts w:ascii="Times New Roman" w:hAnsi="Times New Roman"/>
@@ -5510,7 +5510,7 @@
           <w:noProof/>
         </w:rPr>
         <w:drawing>
-          <wp:inline distT="0" distB="0" distL="0" distR="0" wp14:anchorId="089B432F" wp14:editId="476D13AD">
+          <wp:inline distT="0" distB="0" distL="0" distR="0" wp14:anchorId="1FDE539D" wp14:editId="2F3A664F">
             <wp:extent cx="5940000" cy="5156662"/>
             <wp:effectExtent l="0" t="0" r="0" b="0"/>
             <wp:docPr id="7" name="Picture 7"/>
@@ -5611,7 +5611,7 @@
           <w:noProof/>
         </w:rPr>
         <w:drawing>
-          <wp:inline distT="0" distB="0" distL="0" distR="0" wp14:anchorId="3E98B721" wp14:editId="03B63A51">
+          <wp:inline distT="0" distB="0" distL="0" distR="0" wp14:anchorId="6E73A7FB" wp14:editId="66004CBB">
             <wp:extent cx="5940000" cy="5156662"/>
             <wp:effectExtent l="0" t="0" r="0" b="0"/>
             <wp:docPr id="8" name="Picture 8"/>
@@ -5666,7 +5666,7 @@
       <w:pPr>
         <w:pStyle w:val="Ttulo2"/>
       </w:pPr>
-      <w:bookmarkStart w:id="13" w:name="_Toc242002976"/>
+      <w:bookmarkStart w:id="13" w:name="_Toc242003151"/>
       <w:r>
         <w:rPr>
           <w:rFonts w:ascii="Times New Roman" w:hAnsi="Times New Roman"/>
@@ -6104,7 +6104,7 @@
       <w:pPr>
         <w:pStyle w:val="Ttulo1"/>
       </w:pPr>
-      <w:bookmarkStart w:id="14" w:name="_Toc242002977"/>
+      <w:bookmarkStart w:id="14" w:name="_Toc242003152"/>
       <w:r>
         <w:rPr>
           <w:rFonts w:ascii="Times New Roman" w:hAnsi="Times New Roman"/>
@@ -7089,7 +7089,7 @@
       <w:pPr>
         <w:pStyle w:val="Ttulo2"/>
       </w:pPr>
-      <w:bookmarkStart w:id="15" w:name="_Toc242002978"/>
+      <w:bookmarkStart w:id="15" w:name="_Toc242003153"/>
       <w:r>
         <w:rPr>
           <w:rFonts w:ascii="Times New Roman" w:hAnsi="Times New Roman"/>
@@ -7155,7 +7155,7 @@
       <w:pPr>
         <w:pStyle w:val="Ttulo2"/>
       </w:pPr>
-      <w:bookmarkStart w:id="16" w:name="_Toc242002979"/>
+      <w:bookmarkStart w:id="16" w:name="_Toc242003154"/>
       <w:r>
         <w:rPr>
           <w:rFonts w:ascii="Times New Roman" w:hAnsi="Times New Roman"/>
@@ -7206,7 +7206,7 @@
       <w:pPr>
         <w:pStyle w:val="Ttulo2"/>
       </w:pPr>
-      <w:bookmarkStart w:id="17" w:name="_Toc242002980"/>
+      <w:bookmarkStart w:id="17" w:name="_Toc242003155"/>
       <w:r>
         <w:rPr>
           <w:rFonts w:ascii="Times New Roman" w:hAnsi="Times New Roman"/>
@@ -7248,7 +7248,7 @@
       <w:pPr>
         <w:pStyle w:val="Ttulo2"/>
       </w:pPr>
-      <w:bookmarkStart w:id="18" w:name="_Toc242002981"/>
+      <w:bookmarkStart w:id="18" w:name="_Toc242003156"/>
       <w:r>
         <w:rPr>
           <w:rFonts w:ascii="Times New Roman" w:hAnsi="Times New Roman"/>
@@ -7287,7 +7287,7 @@
       <w:pPr>
         <w:pStyle w:val="Ttulo2"/>
       </w:pPr>
-      <w:bookmarkStart w:id="19" w:name="_Toc242002982"/>
+      <w:bookmarkStart w:id="19" w:name="_Toc242003157"/>
       <w:r>
         <w:rPr>
           <w:rFonts w:ascii="Times New Roman" w:hAnsi="Times New Roman"/>
@@ -7308,7 +7308,7 @@
       <w:pPr>
         <w:pStyle w:val="Ttulo2"/>
       </w:pPr>
-      <w:bookmarkStart w:id="20" w:name="_Toc242002983"/>
+      <w:bookmarkStart w:id="20" w:name="_Toc242003158"/>
       <w:r>
         <w:rPr>
           <w:rFonts w:ascii="Times New Roman" w:hAnsi="Times New Roman"/>
@@ -7332,7 +7332,7 @@
       <w:pPr>
         <w:pStyle w:val="Ttulo1"/>
       </w:pPr>
-      <w:bookmarkStart w:id="21" w:name="_Toc242002984"/>
+      <w:bookmarkStart w:id="21" w:name="_Toc242003159"/>
       <w:r>
         <w:rPr>
           <w:rFonts w:ascii="Times New Roman" w:hAnsi="Times New Roman"/>
@@ -7346,7 +7346,7 @@
       <w:pPr>
         <w:pStyle w:val="Ttulo2"/>
       </w:pPr>
-      <w:bookmarkStart w:id="22" w:name="_Toc242002985"/>
+      <w:bookmarkStart w:id="22" w:name="_Toc242003160"/>
       <w:r>
         <w:rPr>
           <w:rFonts w:ascii="Times New Roman" w:hAnsi="Times New Roman"/>
@@ -7986,7 +7986,7 @@
       <w:pPr>
         <w:pStyle w:val="Ttulo2"/>
       </w:pPr>
-      <w:bookmarkStart w:id="23" w:name="_Toc242002986"/>
+      <w:bookmarkStart w:id="23" w:name="_Toc242003161"/>
       <w:r>
         <w:rPr>
           <w:rFonts w:ascii="Times New Roman" w:hAnsi="Times New Roman"/>
@@ -8383,7 +8383,7 @@
       <w:pPr>
         <w:pStyle w:val="Ttulo2"/>
       </w:pPr>
-      <w:bookmarkStart w:id="24" w:name="_Toc242002987"/>
+      <w:bookmarkStart w:id="24" w:name="_Toc242003162"/>
       <w:r>
         <w:rPr>
           <w:rFonts w:ascii="Times New Roman" w:hAnsi="Times New Roman"/>
@@ -8593,7 +8593,7 @@
       <w:pPr>
         <w:pStyle w:val="Ttulo2"/>
       </w:pPr>
-      <w:bookmarkStart w:id="25" w:name="_Toc242002988"/>
+      <w:bookmarkStart w:id="25" w:name="_Toc242003163"/>
       <w:r>
         <w:rPr>
           <w:rFonts w:ascii="Times New Roman" w:hAnsi="Times New Roman"/>
@@ -9095,7 +9095,7 @@
       <w:pPr>
         <w:pStyle w:val="Ttulo2"/>
       </w:pPr>
-      <w:bookmarkStart w:id="26" w:name="_Toc242002989"/>
+      <w:bookmarkStart w:id="26" w:name="_Toc242003164"/>
       <w:r>
         <w:rPr>
           <w:rFonts w:ascii="Times New Roman" w:hAnsi="Times New Roman"/>
@@ -9682,7 +9682,7 @@
       <w:pPr>
         <w:pStyle w:val="Ttulo2"/>
       </w:pPr>
-      <w:bookmarkStart w:id="27" w:name="_Toc242002990"/>
+      <w:bookmarkStart w:id="27" w:name="_Toc242003165"/>
       <w:r>
         <w:rPr>
           <w:rFonts w:ascii="Times New Roman" w:hAnsi="Times New Roman"/>
@@ -9807,7 +9807,7 @@
       <w:pPr>
         <w:pStyle w:val="Ttulo2"/>
       </w:pPr>
-      <w:bookmarkStart w:id="28" w:name="_Toc242002991"/>
+      <w:bookmarkStart w:id="28" w:name="_Toc242003166"/>
       <w:r>
         <w:rPr>
           <w:rFonts w:ascii="Times New Roman" w:hAnsi="Times New Roman"/>
@@ -10180,7 +10180,7 @@
       <w:pPr>
         <w:pStyle w:val="Ttulo2"/>
       </w:pPr>
-      <w:bookmarkStart w:id="29" w:name="_Toc242002992"/>
+      <w:bookmarkStart w:id="29" w:name="_Toc242003167"/>
       <w:r>
         <w:rPr>
           <w:rFonts w:ascii="Times New Roman" w:hAnsi="Times New Roman"/>
@@ -10219,7 +10219,7 @@
       <w:pPr>
         <w:pStyle w:val="Ttulo1"/>
       </w:pPr>
-      <w:bookmarkStart w:id="30" w:name="_Toc242002993"/>
+      <w:bookmarkStart w:id="30" w:name="_Toc242003168"/>
       <w:r>
         <w:rPr>
           <w:rFonts w:ascii="Times New Roman" w:hAnsi="Times New Roman"/>
@@ -10232,7 +10232,7 @@
       <w:pPr>
         <w:pStyle w:val="Ttulo2"/>
       </w:pPr>
-      <w:bookmarkStart w:id="31" w:name="_Toc242002994"/>
+      <w:bookmarkStart w:id="31" w:name="_Toc242003169"/>
       <w:r>
         <w:rPr>
           <w:rFonts w:ascii="Times New Roman" w:hAnsi="Times New Roman"/>
@@ -10274,7 +10274,7 @@
       <w:pPr>
         <w:pStyle w:val="Ttulo2"/>
       </w:pPr>
-      <w:bookmarkStart w:id="32" w:name="_Toc242002995"/>
+      <w:bookmarkStart w:id="32" w:name="_Toc242003170"/>
       <w:r>
         <w:rPr>
           <w:rFonts w:ascii="Times New Roman" w:hAnsi="Times New Roman"/>
@@ -10902,7 +10902,7 @@
       <w:pPr>
         <w:pStyle w:val="Ttulo2"/>
       </w:pPr>
-      <w:bookmarkStart w:id="33" w:name="_Toc242002996"/>
+      <w:bookmarkStart w:id="33" w:name="_Toc242003171"/>
       <w:r>
         <w:rPr>
           <w:rFonts w:ascii="Times New Roman" w:hAnsi="Times New Roman"/>
@@ -11428,7 +11428,7 @@
       <w:pPr>
         <w:pStyle w:val="Ttulo1"/>
       </w:pPr>
-      <w:bookmarkStart w:id="34" w:name="_Toc242002997"/>
+      <w:bookmarkStart w:id="34" w:name="_Toc242003172"/>
       <w:r>
         <w:rPr>
           <w:rFonts w:ascii="Times New Roman" w:hAnsi="Times New Roman"/>
@@ -11441,7 +11441,7 @@
       <w:pPr>
         <w:pStyle w:val="Ttulo2"/>
       </w:pPr>
-      <w:bookmarkStart w:id="35" w:name="_Toc242002998"/>
+      <w:bookmarkStart w:id="35" w:name="_Toc242003173"/>
       <w:r>
         <w:rPr>
           <w:rFonts w:ascii="Times New Roman" w:hAnsi="Times New Roman"/>
@@ -11462,7 +11462,7 @@
       <w:pPr>
         <w:pStyle w:val="Ttulo2"/>
       </w:pPr>
-      <w:bookmarkStart w:id="36" w:name="_Toc242002999"/>
+      <w:bookmarkStart w:id="36" w:name="_Toc242003174"/>
       <w:r>
         <w:rPr>
           <w:rFonts w:ascii="Times New Roman" w:hAnsi="Times New Roman"/>
@@ -12016,7 +12016,7 @@
       <w:pPr>
         <w:pStyle w:val="Ttulo2"/>
       </w:pPr>
-      <w:bookmarkStart w:id="37" w:name="_Toc242003000"/>
+      <w:bookmarkStart w:id="37" w:name="_Toc242003175"/>
       <w:r>
         <w:rPr>
           <w:rFonts w:ascii="Times New Roman" w:hAnsi="Times New Roman"/>
@@ -12327,7 +12327,7 @@
       <w:pPr>
         <w:pStyle w:val="Ttulo2"/>
       </w:pPr>
-      <w:bookmarkStart w:id="38" w:name="_Toc242003001"/>
+      <w:bookmarkStart w:id="38" w:name="_Toc242003176"/>
       <w:r>
         <w:rPr>
           <w:rFonts w:ascii="Times New Roman" w:hAnsi="Times New Roman"/>
@@ -13177,7 +13177,7 @@
       <w:pPr>
         <w:pStyle w:val="Ttulo1"/>
       </w:pPr>
-      <w:bookmarkStart w:id="39" w:name="_Toc242003002"/>
+      <w:bookmarkStart w:id="39" w:name="_Toc242003177"/>
       <w:r>
         <w:rPr>
           <w:rFonts w:ascii="Times New Roman" w:hAnsi="Times New Roman"/>
@@ -13190,7 +13190,7 @@
       <w:pPr>
         <w:pStyle w:val="Ttulo2"/>
       </w:pPr>
-      <w:bookmarkStart w:id="40" w:name="_Toc242003003"/>
+      <w:bookmarkStart w:id="40" w:name="_Toc242003178"/>
       <w:r>
         <w:rPr>
           <w:rFonts w:ascii="Times New Roman" w:hAnsi="Times New Roman"/>
@@ -13253,7 +13253,7 @@
       <w:pPr>
         <w:pStyle w:val="Ttulo2"/>
       </w:pPr>
-      <w:bookmarkStart w:id="41" w:name="_Toc242003004"/>
+      <w:bookmarkStart w:id="41" w:name="_Toc242003179"/>
       <w:r>
         <w:rPr>
           <w:rFonts w:ascii="Times New Roman" w:hAnsi="Times New Roman"/>
@@ -13296,7 +13296,7 @@
       <w:pPr>
         <w:pStyle w:val="Ttulo1"/>
       </w:pPr>
-      <w:bookmarkStart w:id="42" w:name="_Toc242003005"/>
+      <w:bookmarkStart w:id="42" w:name="_Toc242003180"/>
       <w:r>
         <w:rPr>
           <w:rFonts w:ascii="Times New Roman" w:hAnsi="Times New Roman"/>
@@ -13423,7 +13423,7 @@
       <w:pPr>
         <w:pStyle w:val="Ttulo1"/>
       </w:pPr>
-      <w:bookmarkStart w:id="43" w:name="_Toc242003006"/>
+      <w:bookmarkStart w:id="43" w:name="_Toc242003181"/>
       <w:r>
         <w:rPr>
           <w:rFonts w:ascii="Times New Roman" w:hAnsi="Times New Roman"/>
@@ -13865,31 +13865,31 @@
       </w:rPr>
     </w:lvl>
   </w:abstractNum>
-  <w:num w:numId="1" w16cid:durableId="548685061">
+  <w:num w:numId="1" w16cid:durableId="1555585090">
     <w:abstractNumId w:val="8"/>
   </w:num>
-  <w:num w:numId="2" w16cid:durableId="2130935126">
+  <w:num w:numId="2" w16cid:durableId="1588224558">
     <w:abstractNumId w:val="6"/>
   </w:num>
-  <w:num w:numId="3" w16cid:durableId="379937746">
+  <w:num w:numId="3" w16cid:durableId="102112107">
     <w:abstractNumId w:val="5"/>
   </w:num>
-  <w:num w:numId="4" w16cid:durableId="1748069011">
+  <w:num w:numId="4" w16cid:durableId="265115190">
     <w:abstractNumId w:val="4"/>
   </w:num>
-  <w:num w:numId="5" w16cid:durableId="2060352613">
+  <w:num w:numId="5" w16cid:durableId="574632420">
     <w:abstractNumId w:val="7"/>
   </w:num>
-  <w:num w:numId="6" w16cid:durableId="532839166">
+  <w:num w:numId="6" w16cid:durableId="92673974">
     <w:abstractNumId w:val="3"/>
   </w:num>
-  <w:num w:numId="7" w16cid:durableId="1727336067">
+  <w:num w:numId="7" w16cid:durableId="868372701">
     <w:abstractNumId w:val="2"/>
   </w:num>
-  <w:num w:numId="8" w16cid:durableId="1354572880">
+  <w:num w:numId="8" w16cid:durableId="1487167598">
     <w:abstractNumId w:val="1"/>
   </w:num>
-  <w:num w:numId="9" w16cid:durableId="2085376144">
+  <w:num w:numId="9" w16cid:durableId="1506823887">
     <w:abstractNumId w:val="0"/>
   </w:num>
 </w:numbering>
@@ -25285,7 +25285,7 @@
     <w:autoRedefine/>
     <w:uiPriority w:val="39"/>
     <w:unhideWhenUsed/>
-    <w:rsid w:val="001468CD"/>
+    <w:rsid w:val="00040F9B"/>
     <w:pPr>
       <w:spacing w:after="100"/>
     </w:pPr>
@@ -25297,7 +25297,7 @@
     <w:autoRedefine/>
     <w:uiPriority w:val="39"/>
     <w:unhideWhenUsed/>
-    <w:rsid w:val="001468CD"/>
+    <w:rsid w:val="00040F9B"/>
     <w:pPr>
       <w:spacing w:after="100"/>
       <w:ind w:left="240"/>
@@ -25308,7 +25308,7 @@
     <w:basedOn w:val="Fuentedeprrafopredeter"/>
     <w:uiPriority w:val="99"/>
     <w:unhideWhenUsed/>
-    <w:rsid w:val="001468CD"/>
+    <w:rsid w:val="00040F9B"/>
     <w:rPr>
       <w:color w:val="0000FF" w:themeColor="hyperlink"/>
       <w:u w:val="single"/>

</xml_diff>

<commit_message>
Entrega 3: fecha de entrega también en la portada del Word
Co-Authored-By: Claude Opus 5.5 <noreply@anthropic.com>
</commit_message>
<xml_diff>
--- a/docs/entrega-3/Entrega-3-Entrega-Final-Pulso-Digital.docx
+++ b/docs/entrega-3/Entrega-3-Entrega-Final-Pulso-Digital.docx
@@ -66,7 +66,7 @@
         <w:jc w:val="center"/>
       </w:pPr>
       <w:r>
-        <w:t xml:space="preserve">4 de octubre de </w:t>
+        <w:t xml:space="preserve">10 de octubre de </w:t>
       </w:r>
       <w:r>
         <w:t>2026</w:t>
@@ -108,7 +108,7 @@
       <w:r>
         <w:fldChar w:fldCharType="separate"/>
       </w:r>
-      <w:hyperlink w:anchor="_Toc242003138" w:history="1">
+      <w:hyperlink w:anchor="_Toc242003179" w:history="1">
         <w:r>
           <w:rPr>
             <w:rStyle w:val="Hipervnculo"/>
@@ -136,7 +136,7 @@
             <w:noProof/>
             <w:webHidden/>
           </w:rPr>
-          <w:instrText xml:space="preserve"> PAGEREF _Toc242003138 \h </w:instrText>
+          <w:instrText xml:space="preserve"> PAGEREF _Toc242003179 \h </w:instrText>
         </w:r>
         <w:r>
           <w:rPr>
@@ -177,7 +177,7 @@
           <w:noProof/>
         </w:rPr>
       </w:pPr>
-      <w:hyperlink w:anchor="_Toc242003139" w:history="1">
+      <w:hyperlink w:anchor="_Toc242003180" w:history="1">
         <w:r>
           <w:rPr>
             <w:rStyle w:val="Hipervnculo"/>
@@ -205,7 +205,7 @@
             <w:noProof/>
             <w:webHidden/>
           </w:rPr>
-          <w:instrText xml:space="preserve"> PAGEREF _Toc242003139 \h </w:instrText>
+          <w:instrText xml:space="preserve"> PAGEREF _Toc242003180 \h </w:instrText>
         </w:r>
         <w:r>
           <w:rPr>
@@ -246,7 +246,7 @@
           <w:noProof/>
         </w:rPr>
       </w:pPr>
-      <w:hyperlink w:anchor="_Toc242003140" w:history="1">
+      <w:hyperlink w:anchor="_Toc242003181" w:history="1">
         <w:r>
           <w:rPr>
             <w:rStyle w:val="Hipervnculo"/>
@@ -274,7 +274,7 @@
             <w:noProof/>
             <w:webHidden/>
           </w:rPr>
-          <w:instrText xml:space="preserve"> PAGEREF _Toc242003140 \h </w:instrText>
+          <w:instrText xml:space="preserve"> PAGEREF _Toc242003181 \h </w:instrText>
         </w:r>
         <w:r>
           <w:rPr>
@@ -315,7 +315,7 @@
           <w:noProof/>
         </w:rPr>
       </w:pPr>
-      <w:hyperlink w:anchor="_Toc242003141" w:history="1">
+      <w:hyperlink w:anchor="_Toc242003182" w:history="1">
         <w:r>
           <w:rPr>
             <w:rStyle w:val="Hipervnculo"/>
@@ -343,7 +343,7 @@
             <w:noProof/>
             <w:webHidden/>
           </w:rPr>
-          <w:instrText xml:space="preserve"> PAGEREF _Toc242003141 \h </w:instrText>
+          <w:instrText xml:space="preserve"> PAGEREF _Toc242003182 \h </w:instrText>
         </w:r>
         <w:r>
           <w:rPr>
@@ -384,7 +384,7 @@
           <w:noProof/>
         </w:rPr>
       </w:pPr>
-      <w:hyperlink w:anchor="_Toc242003142" w:history="1">
+      <w:hyperlink w:anchor="_Toc242003183" w:history="1">
         <w:r>
           <w:rPr>
             <w:rStyle w:val="Hipervnculo"/>
@@ -412,7 +412,7 @@
             <w:noProof/>
             <w:webHidden/>
           </w:rPr>
-          <w:instrText xml:space="preserve"> PAGEREF _Toc242003142 \h </w:instrText>
+          <w:instrText xml:space="preserve"> PAGEREF _Toc242003183 \h </w:instrText>
         </w:r>
         <w:r>
           <w:rPr>
@@ -453,7 +453,7 @@
           <w:noProof/>
         </w:rPr>
       </w:pPr>
-      <w:hyperlink w:anchor="_Toc242003143" w:history="1">
+      <w:hyperlink w:anchor="_Toc242003184" w:history="1">
         <w:r>
           <w:rPr>
             <w:rStyle w:val="Hipervnculo"/>
@@ -481,7 +481,7 @@
             <w:noProof/>
             <w:webHidden/>
           </w:rPr>
-          <w:instrText xml:space="preserve"> PAGEREF _Toc242003143 \h </w:instrText>
+          <w:instrText xml:space="preserve"> PAGEREF _Toc242003184 \h </w:instrText>
         </w:r>
         <w:r>
           <w:rPr>
@@ -522,7 +522,7 @@
           <w:noProof/>
         </w:rPr>
       </w:pPr>
-      <w:hyperlink w:anchor="_Toc242003144" w:history="1">
+      <w:hyperlink w:anchor="_Toc242003185" w:history="1">
         <w:r>
           <w:rPr>
             <w:rStyle w:val="Hipervnculo"/>
@@ -550,7 +550,7 @@
             <w:noProof/>
             <w:webHidden/>
           </w:rPr>
-          <w:instrText xml:space="preserve"> PAGEREF _Toc242003144 \h </w:instrText>
+          <w:instrText xml:space="preserve"> PAGEREF _Toc242003185 \h </w:instrText>
         </w:r>
         <w:r>
           <w:rPr>
@@ -591,7 +591,7 @@
           <w:noProof/>
         </w:rPr>
       </w:pPr>
-      <w:hyperlink w:anchor="_Toc242003145" w:history="1">
+      <w:hyperlink w:anchor="_Toc242003186" w:history="1">
         <w:r>
           <w:rPr>
             <w:rStyle w:val="Hipervnculo"/>
@@ -619,7 +619,7 @@
             <w:noProof/>
             <w:webHidden/>
           </w:rPr>
-          <w:instrText xml:space="preserve"> PAGEREF _Toc242003145 \h </w:instrText>
+          <w:instrText xml:space="preserve"> PAGEREF _Toc242003186 \h </w:instrText>
         </w:r>
         <w:r>
           <w:rPr>
@@ -660,7 +660,7 @@
           <w:noProof/>
         </w:rPr>
       </w:pPr>
-      <w:hyperlink w:anchor="_Toc242003146" w:history="1">
+      <w:hyperlink w:anchor="_Toc242003187" w:history="1">
         <w:r>
           <w:rPr>
             <w:rStyle w:val="Hipervnculo"/>
@@ -688,7 +688,7 @@
             <w:noProof/>
             <w:webHidden/>
           </w:rPr>
-          <w:instrText xml:space="preserve"> PAGEREF _Toc242003146 \h </w:instrText>
+          <w:instrText xml:space="preserve"> PAGEREF _Toc242003187 \h </w:instrText>
         </w:r>
         <w:r>
           <w:rPr>
@@ -729,7 +729,7 @@
           <w:noProof/>
         </w:rPr>
       </w:pPr>
-      <w:hyperlink w:anchor="_Toc242003147" w:history="1">
+      <w:hyperlink w:anchor="_Toc242003188" w:history="1">
         <w:r>
           <w:rPr>
             <w:rStyle w:val="Hipervnculo"/>
@@ -757,7 +757,7 @@
             <w:noProof/>
             <w:webHidden/>
           </w:rPr>
-          <w:instrText xml:space="preserve"> PAGEREF _Toc242003147 \h </w:instrText>
+          <w:instrText xml:space="preserve"> PAGEREF _Toc242003188 \h </w:instrText>
         </w:r>
         <w:r>
           <w:rPr>
@@ -798,7 +798,7 @@
           <w:noProof/>
         </w:rPr>
       </w:pPr>
-      <w:hyperlink w:anchor="_Toc242003148" w:history="1">
+      <w:hyperlink w:anchor="_Toc242003189" w:history="1">
         <w:r>
           <w:rPr>
             <w:rStyle w:val="Hipervnculo"/>
@@ -826,7 +826,7 @@
             <w:noProof/>
             <w:webHidden/>
           </w:rPr>
-          <w:instrText xml:space="preserve"> PAGEREF _Toc242003148 \h </w:instrText>
+          <w:instrText xml:space="preserve"> PAGEREF _Toc242003189 \h </w:instrText>
         </w:r>
         <w:r>
           <w:rPr>
@@ -867,7 +867,7 @@
           <w:noProof/>
         </w:rPr>
       </w:pPr>
-      <w:hyperlink w:anchor="_Toc242003149" w:history="1">
+      <w:hyperlink w:anchor="_Toc242003190" w:history="1">
         <w:r>
           <w:rPr>
             <w:rStyle w:val="Hipervnculo"/>
@@ -895,7 +895,7 @@
             <w:noProof/>
             <w:webHidden/>
           </w:rPr>
-          <w:instrText xml:space="preserve"> PAGEREF _Toc242003149 \h </w:instrText>
+          <w:instrText xml:space="preserve"> PAGEREF _Toc242003190 \h </w:instrText>
         </w:r>
         <w:r>
           <w:rPr>
@@ -936,7 +936,7 @@
           <w:noProof/>
         </w:rPr>
       </w:pPr>
-      <w:hyperlink w:anchor="_Toc242003150" w:history="1">
+      <w:hyperlink w:anchor="_Toc242003191" w:history="1">
         <w:r>
           <w:rPr>
             <w:rStyle w:val="Hipervnculo"/>
@@ -964,7 +964,7 @@
             <w:noProof/>
             <w:webHidden/>
           </w:rPr>
-          <w:instrText xml:space="preserve"> PAGEREF _Toc242003150 \h </w:instrText>
+          <w:instrText xml:space="preserve"> PAGEREF _Toc242003191 \h </w:instrText>
         </w:r>
         <w:r>
           <w:rPr>
@@ -1005,7 +1005,7 @@
           <w:noProof/>
         </w:rPr>
       </w:pPr>
-      <w:hyperlink w:anchor="_Toc242003151" w:history="1">
+      <w:hyperlink w:anchor="_Toc242003192" w:history="1">
         <w:r>
           <w:rPr>
             <w:rStyle w:val="Hipervnculo"/>
@@ -1033,7 +1033,7 @@
             <w:noProof/>
             <w:webHidden/>
           </w:rPr>
-          <w:instrText xml:space="preserve"> PAGEREF _Toc242003151 \h </w:instrText>
+          <w:instrText xml:space="preserve"> PAGEREF _Toc242003192 \h </w:instrText>
         </w:r>
         <w:r>
           <w:rPr>
@@ -1074,7 +1074,7 @@
           <w:noProof/>
         </w:rPr>
       </w:pPr>
-      <w:hyperlink w:anchor="_Toc242003152" w:history="1">
+      <w:hyperlink w:anchor="_Toc242003193" w:history="1">
         <w:r>
           <w:rPr>
             <w:rStyle w:val="Hipervnculo"/>
@@ -1102,7 +1102,7 @@
             <w:noProof/>
             <w:webHidden/>
           </w:rPr>
-          <w:instrText xml:space="preserve"> PAGEREF _Toc242003152 \h </w:instrText>
+          <w:instrText xml:space="preserve"> PAGEREF _Toc242003193 \h </w:instrText>
         </w:r>
         <w:r>
           <w:rPr>
@@ -1143,7 +1143,7 @@
           <w:noProof/>
         </w:rPr>
       </w:pPr>
-      <w:hyperlink w:anchor="_Toc242003153" w:history="1">
+      <w:hyperlink w:anchor="_Toc242003194" w:history="1">
         <w:r>
           <w:rPr>
             <w:rStyle w:val="Hipervnculo"/>
@@ -1171,7 +1171,7 @@
             <w:noProof/>
             <w:webHidden/>
           </w:rPr>
-          <w:instrText xml:space="preserve"> PAGEREF _Toc242003153 \h </w:instrText>
+          <w:instrText xml:space="preserve"> PAGEREF _Toc242003194 \h </w:instrText>
         </w:r>
         <w:r>
           <w:rPr>
@@ -1212,7 +1212,7 @@
           <w:noProof/>
         </w:rPr>
       </w:pPr>
-      <w:hyperlink w:anchor="_Toc242003154" w:history="1">
+      <w:hyperlink w:anchor="_Toc242003195" w:history="1">
         <w:r>
           <w:rPr>
             <w:rStyle w:val="Hipervnculo"/>
@@ -1240,7 +1240,7 @@
             <w:noProof/>
             <w:webHidden/>
           </w:rPr>
-          <w:instrText xml:space="preserve"> PAGEREF _Toc242003154 \h </w:instrText>
+          <w:instrText xml:space="preserve"> PAGEREF _Toc242003195 \h </w:instrText>
         </w:r>
         <w:r>
           <w:rPr>
@@ -1281,7 +1281,7 @@
           <w:noProof/>
         </w:rPr>
       </w:pPr>
-      <w:hyperlink w:anchor="_Toc242003155" w:history="1">
+      <w:hyperlink w:anchor="_Toc242003196" w:history="1">
         <w:r>
           <w:rPr>
             <w:rStyle w:val="Hipervnculo"/>
@@ -1309,7 +1309,7 @@
             <w:noProof/>
             <w:webHidden/>
           </w:rPr>
-          <w:instrText xml:space="preserve"> PAGEREF _Toc242003155 \h </w:instrText>
+          <w:instrText xml:space="preserve"> PAGEREF _Toc242003196 \h </w:instrText>
         </w:r>
         <w:r>
           <w:rPr>
@@ -1350,7 +1350,7 @@
           <w:noProof/>
         </w:rPr>
       </w:pPr>
-      <w:hyperlink w:anchor="_Toc242003156" w:history="1">
+      <w:hyperlink w:anchor="_Toc242003197" w:history="1">
         <w:r>
           <w:rPr>
             <w:rStyle w:val="Hipervnculo"/>
@@ -1378,7 +1378,7 @@
             <w:noProof/>
             <w:webHidden/>
           </w:rPr>
-          <w:instrText xml:space="preserve"> PAGEREF _Toc242003156 \h </w:instrText>
+          <w:instrText xml:space="preserve"> PAGEREF _Toc242003197 \h </w:instrText>
         </w:r>
         <w:r>
           <w:rPr>
@@ -1419,7 +1419,7 @@
           <w:noProof/>
         </w:rPr>
       </w:pPr>
-      <w:hyperlink w:anchor="_Toc242003157" w:history="1">
+      <w:hyperlink w:anchor="_Toc242003198" w:history="1">
         <w:r>
           <w:rPr>
             <w:rStyle w:val="Hipervnculo"/>
@@ -1447,7 +1447,7 @@
             <w:noProof/>
             <w:webHidden/>
           </w:rPr>
-          <w:instrText xml:space="preserve"> PAGEREF _Toc242003157 \h </w:instrText>
+          <w:instrText xml:space="preserve"> PAGEREF _Toc242003198 \h </w:instrText>
         </w:r>
         <w:r>
           <w:rPr>
@@ -1488,7 +1488,7 @@
           <w:noProof/>
         </w:rPr>
       </w:pPr>
-      <w:hyperlink w:anchor="_Toc242003158" w:history="1">
+      <w:hyperlink w:anchor="_Toc242003199" w:history="1">
         <w:r>
           <w:rPr>
             <w:rStyle w:val="Hipervnculo"/>
@@ -1516,7 +1516,7 @@
             <w:noProof/>
             <w:webHidden/>
           </w:rPr>
-          <w:instrText xml:space="preserve"> PAGEREF _Toc242003158 \h </w:instrText>
+          <w:instrText xml:space="preserve"> PAGEREF _Toc242003199 \h </w:instrText>
         </w:r>
         <w:r>
           <w:rPr>
@@ -1557,7 +1557,7 @@
           <w:noProof/>
         </w:rPr>
       </w:pPr>
-      <w:hyperlink w:anchor="_Toc242003159" w:history="1">
+      <w:hyperlink w:anchor="_Toc242003200" w:history="1">
         <w:r>
           <w:rPr>
             <w:rStyle w:val="Hipervnculo"/>
@@ -1585,7 +1585,7 @@
             <w:noProof/>
             <w:webHidden/>
           </w:rPr>
-          <w:instrText xml:space="preserve"> PAGEREF _Toc242003159 \h </w:instrText>
+          <w:instrText xml:space="preserve"> PAGEREF _Toc242003200 \h </w:instrText>
         </w:r>
         <w:r>
           <w:rPr>
@@ -1626,7 +1626,7 @@
           <w:noProof/>
         </w:rPr>
       </w:pPr>
-      <w:hyperlink w:anchor="_Toc242003160" w:history="1">
+      <w:hyperlink w:anchor="_Toc242003201" w:history="1">
         <w:r>
           <w:rPr>
             <w:rStyle w:val="Hipervnculo"/>
@@ -1654,7 +1654,7 @@
             <w:noProof/>
             <w:webHidden/>
           </w:rPr>
-          <w:instrText xml:space="preserve"> PAGEREF _Toc242003160 \h </w:instrText>
+          <w:instrText xml:space="preserve"> PAGEREF _Toc242003201 \h </w:instrText>
         </w:r>
         <w:r>
           <w:rPr>
@@ -1695,7 +1695,7 @@
           <w:noProof/>
         </w:rPr>
       </w:pPr>
-      <w:hyperlink w:anchor="_Toc242003161" w:history="1">
+      <w:hyperlink w:anchor="_Toc242003202" w:history="1">
         <w:r>
           <w:rPr>
             <w:rStyle w:val="Hipervnculo"/>
@@ -1723,7 +1723,7 @@
             <w:noProof/>
             <w:webHidden/>
           </w:rPr>
-          <w:instrText xml:space="preserve"> PAGEREF _Toc242003161 \h </w:instrText>
+          <w:instrText xml:space="preserve"> PAGEREF _Toc242003202 \h </w:instrText>
         </w:r>
         <w:r>
           <w:rPr>
@@ -1764,7 +1764,7 @@
           <w:noProof/>
         </w:rPr>
       </w:pPr>
-      <w:hyperlink w:anchor="_Toc242003162" w:history="1">
+      <w:hyperlink w:anchor="_Toc242003203" w:history="1">
         <w:r>
           <w:rPr>
             <w:rStyle w:val="Hipervnculo"/>
@@ -1792,7 +1792,7 @@
             <w:noProof/>
             <w:webHidden/>
           </w:rPr>
-          <w:instrText xml:space="preserve"> PAGEREF _Toc242003162 \h </w:instrText>
+          <w:instrText xml:space="preserve"> PAGEREF _Toc242003203 \h </w:instrText>
         </w:r>
         <w:r>
           <w:rPr>
@@ -1833,7 +1833,7 @@
           <w:noProof/>
         </w:rPr>
       </w:pPr>
-      <w:hyperlink w:anchor="_Toc242003163" w:history="1">
+      <w:hyperlink w:anchor="_Toc242003204" w:history="1">
         <w:r>
           <w:rPr>
             <w:rStyle w:val="Hipervnculo"/>
@@ -1861,7 +1861,7 @@
             <w:noProof/>
             <w:webHidden/>
           </w:rPr>
-          <w:instrText xml:space="preserve"> PAGEREF _Toc242003163 \h </w:instrText>
+          <w:instrText xml:space="preserve"> PAGEREF _Toc242003204 \h </w:instrText>
         </w:r>
         <w:r>
           <w:rPr>
@@ -1902,7 +1902,7 @@
           <w:noProof/>
         </w:rPr>
       </w:pPr>
-      <w:hyperlink w:anchor="_Toc242003164" w:history="1">
+      <w:hyperlink w:anchor="_Toc242003205" w:history="1">
         <w:r>
           <w:rPr>
             <w:rStyle w:val="Hipervnculo"/>
@@ -1930,7 +1930,7 @@
             <w:noProof/>
             <w:webHidden/>
           </w:rPr>
-          <w:instrText xml:space="preserve"> PAGEREF _Toc242003164 \h </w:instrText>
+          <w:instrText xml:space="preserve"> PAGEREF _Toc242003205 \h </w:instrText>
         </w:r>
         <w:r>
           <w:rPr>
@@ -1971,7 +1971,7 @@
           <w:noProof/>
         </w:rPr>
       </w:pPr>
-      <w:hyperlink w:anchor="_Toc242003165" w:history="1">
+      <w:hyperlink w:anchor="_Toc242003206" w:history="1">
         <w:r>
           <w:rPr>
             <w:rStyle w:val="Hipervnculo"/>
@@ -1999,7 +1999,7 @@
             <w:noProof/>
             <w:webHidden/>
           </w:rPr>
-          <w:instrText xml:space="preserve"> PAGEREF _Toc242003165 \h </w:instrText>
+          <w:instrText xml:space="preserve"> PAGEREF _Toc242003206 \h </w:instrText>
         </w:r>
         <w:r>
           <w:rPr>
@@ -2040,7 +2040,7 @@
           <w:noProof/>
         </w:rPr>
       </w:pPr>
-      <w:hyperlink w:anchor="_Toc242003166" w:history="1">
+      <w:hyperlink w:anchor="_Toc242003207" w:history="1">
         <w:r>
           <w:rPr>
             <w:rStyle w:val="Hipervnculo"/>
@@ -2068,7 +2068,7 @@
             <w:noProof/>
             <w:webHidden/>
           </w:rPr>
-          <w:instrText xml:space="preserve"> PAGEREF _Toc242003166 \h </w:instrText>
+          <w:instrText xml:space="preserve"> PAGEREF _Toc242003207 \h </w:instrText>
         </w:r>
         <w:r>
           <w:rPr>
@@ -2109,7 +2109,7 @@
           <w:noProof/>
         </w:rPr>
       </w:pPr>
-      <w:hyperlink w:anchor="_Toc242003167" w:history="1">
+      <w:hyperlink w:anchor="_Toc242003208" w:history="1">
         <w:r>
           <w:rPr>
             <w:rStyle w:val="Hipervnculo"/>
@@ -2137,7 +2137,7 @@
             <w:noProof/>
             <w:webHidden/>
           </w:rPr>
-          <w:instrText xml:space="preserve"> PAGEREF _Toc242003167 \h </w:instrText>
+          <w:instrText xml:space="preserve"> PAGEREF _Toc242003208 \h </w:instrText>
         </w:r>
         <w:r>
           <w:rPr>
@@ -2178,7 +2178,7 @@
           <w:noProof/>
         </w:rPr>
       </w:pPr>
-      <w:hyperlink w:anchor="_Toc242003168" w:history="1">
+      <w:hyperlink w:anchor="_Toc242003209" w:history="1">
         <w:r>
           <w:rPr>
             <w:rStyle w:val="Hipervnculo"/>
@@ -2206,7 +2206,7 @@
             <w:noProof/>
             <w:webHidden/>
           </w:rPr>
-          <w:instrText xml:space="preserve"> PAGEREF _Toc242003168 \h </w:instrText>
+          <w:instrText xml:space="preserve"> PAGEREF _Toc242003209 \h </w:instrText>
         </w:r>
         <w:r>
           <w:rPr>
@@ -2247,7 +2247,7 @@
           <w:noProof/>
         </w:rPr>
       </w:pPr>
-      <w:hyperlink w:anchor="_Toc242003169" w:history="1">
+      <w:hyperlink w:anchor="_Toc242003210" w:history="1">
         <w:r>
           <w:rPr>
             <w:rStyle w:val="Hipervnculo"/>
@@ -2275,7 +2275,7 @@
             <w:noProof/>
             <w:webHidden/>
           </w:rPr>
-          <w:instrText xml:space="preserve"> PAGEREF _Toc242003169 \h </w:instrText>
+          <w:instrText xml:space="preserve"> PAGEREF _Toc242003210 \h </w:instrText>
         </w:r>
         <w:r>
           <w:rPr>
@@ -2316,7 +2316,7 @@
           <w:noProof/>
         </w:rPr>
       </w:pPr>
-      <w:hyperlink w:anchor="_Toc242003170" w:history="1">
+      <w:hyperlink w:anchor="_Toc242003211" w:history="1">
         <w:r>
           <w:rPr>
             <w:rStyle w:val="Hipervnculo"/>
@@ -2344,7 +2344,7 @@
             <w:noProof/>
             <w:webHidden/>
           </w:rPr>
-          <w:instrText xml:space="preserve"> PAGEREF _Toc242003170 \h </w:instrText>
+          <w:instrText xml:space="preserve"> PAGEREF _Toc242003211 \h </w:instrText>
         </w:r>
         <w:r>
           <w:rPr>
@@ -2385,7 +2385,7 @@
           <w:noProof/>
         </w:rPr>
       </w:pPr>
-      <w:hyperlink w:anchor="_Toc242003171" w:history="1">
+      <w:hyperlink w:anchor="_Toc242003212" w:history="1">
         <w:r>
           <w:rPr>
             <w:rStyle w:val="Hipervnculo"/>
@@ -2413,7 +2413,7 @@
             <w:noProof/>
             <w:webHidden/>
           </w:rPr>
-          <w:instrText xml:space="preserve"> PAGEREF _Toc242003171 \h </w:instrText>
+          <w:instrText xml:space="preserve"> PAGEREF _Toc242003212 \h </w:instrText>
         </w:r>
         <w:r>
           <w:rPr>
@@ -2454,7 +2454,7 @@
           <w:noProof/>
         </w:rPr>
       </w:pPr>
-      <w:hyperlink w:anchor="_Toc242003172" w:history="1">
+      <w:hyperlink w:anchor="_Toc242003213" w:history="1">
         <w:r>
           <w:rPr>
             <w:rStyle w:val="Hipervnculo"/>
@@ -2482,7 +2482,7 @@
             <w:noProof/>
             <w:webHidden/>
           </w:rPr>
-          <w:instrText xml:space="preserve"> PAGEREF _Toc242003172 \h </w:instrText>
+          <w:instrText xml:space="preserve"> PAGEREF _Toc242003213 \h </w:instrText>
         </w:r>
         <w:r>
           <w:rPr>
@@ -2523,7 +2523,7 @@
           <w:noProof/>
         </w:rPr>
       </w:pPr>
-      <w:hyperlink w:anchor="_Toc242003173" w:history="1">
+      <w:hyperlink w:anchor="_Toc242003214" w:history="1">
         <w:r>
           <w:rPr>
             <w:rStyle w:val="Hipervnculo"/>
@@ -2551,7 +2551,7 @@
             <w:noProof/>
             <w:webHidden/>
           </w:rPr>
-          <w:instrText xml:space="preserve"> PAGEREF _Toc242003173 \h </w:instrText>
+          <w:instrText xml:space="preserve"> PAGEREF _Toc242003214 \h </w:instrText>
         </w:r>
         <w:r>
           <w:rPr>
@@ -2592,7 +2592,7 @@
           <w:noProof/>
         </w:rPr>
       </w:pPr>
-      <w:hyperlink w:anchor="_Toc242003174" w:history="1">
+      <w:hyperlink w:anchor="_Toc242003215" w:history="1">
         <w:r>
           <w:rPr>
             <w:rStyle w:val="Hipervnculo"/>
@@ -2620,7 +2620,7 @@
             <w:noProof/>
             <w:webHidden/>
           </w:rPr>
-          <w:instrText xml:space="preserve"> PAGEREF _Toc242003174 \h </w:instrText>
+          <w:instrText xml:space="preserve"> PAGEREF _Toc242003215 \h </w:instrText>
         </w:r>
         <w:r>
           <w:rPr>
@@ -2661,7 +2661,7 @@
           <w:noProof/>
         </w:rPr>
       </w:pPr>
-      <w:hyperlink w:anchor="_Toc242003175" w:history="1">
+      <w:hyperlink w:anchor="_Toc242003216" w:history="1">
         <w:r>
           <w:rPr>
             <w:rStyle w:val="Hipervnculo"/>
@@ -2689,7 +2689,7 @@
             <w:noProof/>
             <w:webHidden/>
           </w:rPr>
-          <w:instrText xml:space="preserve"> PAGEREF _Toc242003175 \h </w:instrText>
+          <w:instrText xml:space="preserve"> PAGEREF _Toc242003216 \h </w:instrText>
         </w:r>
         <w:r>
           <w:rPr>
@@ -2730,7 +2730,7 @@
           <w:noProof/>
         </w:rPr>
       </w:pPr>
-      <w:hyperlink w:anchor="_Toc242003176" w:history="1">
+      <w:hyperlink w:anchor="_Toc242003217" w:history="1">
         <w:r>
           <w:rPr>
             <w:rStyle w:val="Hipervnculo"/>
@@ -2758,7 +2758,7 @@
             <w:noProof/>
             <w:webHidden/>
           </w:rPr>
-          <w:instrText xml:space="preserve"> PAGEREF _Toc242003176 \h </w:instrText>
+          <w:instrText xml:space="preserve"> PAGEREF _Toc242003217 \h </w:instrText>
         </w:r>
         <w:r>
           <w:rPr>
@@ -2799,7 +2799,7 @@
           <w:noProof/>
         </w:rPr>
       </w:pPr>
-      <w:hyperlink w:anchor="_Toc242003177" w:history="1">
+      <w:hyperlink w:anchor="_Toc242003218" w:history="1">
         <w:r>
           <w:rPr>
             <w:rStyle w:val="Hipervnculo"/>
@@ -2827,7 +2827,7 @@
             <w:noProof/>
             <w:webHidden/>
           </w:rPr>
-          <w:instrText xml:space="preserve"> PAGEREF _Toc242003177 \h </w:instrText>
+          <w:instrText xml:space="preserve"> PAGEREF _Toc242003218 \h </w:instrText>
         </w:r>
         <w:r>
           <w:rPr>
@@ -2868,7 +2868,7 @@
           <w:noProof/>
         </w:rPr>
       </w:pPr>
-      <w:hyperlink w:anchor="_Toc242003178" w:history="1">
+      <w:hyperlink w:anchor="_Toc242003219" w:history="1">
         <w:r>
           <w:rPr>
             <w:rStyle w:val="Hipervnculo"/>
@@ -2896,7 +2896,7 @@
             <w:noProof/>
             <w:webHidden/>
           </w:rPr>
-          <w:instrText xml:space="preserve"> PAGEREF _Toc242003178 \h </w:instrText>
+          <w:instrText xml:space="preserve"> PAGEREF _Toc242003219 \h </w:instrText>
         </w:r>
         <w:r>
           <w:rPr>
@@ -2937,7 +2937,7 @@
           <w:noProof/>
         </w:rPr>
       </w:pPr>
-      <w:hyperlink w:anchor="_Toc242003179" w:history="1">
+      <w:hyperlink w:anchor="_Toc242003220" w:history="1">
         <w:r>
           <w:rPr>
             <w:rStyle w:val="Hipervnculo"/>
@@ -2965,7 +2965,7 @@
             <w:noProof/>
             <w:webHidden/>
           </w:rPr>
-          <w:instrText xml:space="preserve"> PAGEREF _Toc242003179 \h </w:instrText>
+          <w:instrText xml:space="preserve"> PAGEREF _Toc242003220 \h </w:instrText>
         </w:r>
         <w:r>
           <w:rPr>
@@ -3006,7 +3006,7 @@
           <w:noProof/>
         </w:rPr>
       </w:pPr>
-      <w:hyperlink w:anchor="_Toc242003180" w:history="1">
+      <w:hyperlink w:anchor="_Toc242003221" w:history="1">
         <w:r>
           <w:rPr>
             <w:rStyle w:val="Hipervnculo"/>
@@ -3034,7 +3034,7 @@
             <w:noProof/>
             <w:webHidden/>
           </w:rPr>
-          <w:instrText xml:space="preserve"> PAGEREF _Toc242003180 \h </w:instrText>
+          <w:instrText xml:space="preserve"> PAGEREF _Toc242003221 \h </w:instrText>
         </w:r>
         <w:r>
           <w:rPr>
@@ -3075,7 +3075,7 @@
           <w:noProof/>
         </w:rPr>
       </w:pPr>
-      <w:hyperlink w:anchor="_Toc242003181" w:history="1">
+      <w:hyperlink w:anchor="_Toc242003222" w:history="1">
         <w:r>
           <w:rPr>
             <w:rStyle w:val="Hipervnculo"/>
@@ -3103,7 +3103,7 @@
             <w:noProof/>
             <w:webHidden/>
           </w:rPr>
-          <w:instrText xml:space="preserve"> PAGEREF _Toc242003181 \h </w:instrText>
+          <w:instrText xml:space="preserve"> PAGEREF _Toc242003222 \h </w:instrText>
         </w:r>
         <w:r>
           <w:rPr>
@@ -3148,7 +3148,7 @@
       <w:pPr>
         <w:pStyle w:val="Ttulo1"/>
       </w:pPr>
-      <w:bookmarkStart w:id="0" w:name="_Toc242003138"/>
+      <w:bookmarkStart w:id="0" w:name="_Toc242003179"/>
       <w:r>
         <w:rPr>
           <w:rFonts w:ascii="Times New Roman" w:hAnsi="Times New Roman"/>
@@ -3204,7 +3204,7 @@
       <w:pPr>
         <w:pStyle w:val="Ttulo1"/>
       </w:pPr>
-      <w:bookmarkStart w:id="1" w:name="_Toc242003139"/>
+      <w:bookmarkStart w:id="1" w:name="_Toc242003180"/>
       <w:r>
         <w:rPr>
           <w:rFonts w:ascii="Times New Roman" w:hAnsi="Times New Roman"/>
@@ -3969,7 +3969,7 @@
       <w:pPr>
         <w:pStyle w:val="Ttulo1"/>
       </w:pPr>
-      <w:bookmarkStart w:id="2" w:name="_Toc242003140"/>
+      <w:bookmarkStart w:id="2" w:name="_Toc242003181"/>
       <w:r>
         <w:rPr>
           <w:rFonts w:ascii="Times New Roman" w:hAnsi="Times New Roman"/>
@@ -3982,7 +3982,7 @@
       <w:pPr>
         <w:pStyle w:val="Ttulo2"/>
       </w:pPr>
-      <w:bookmarkStart w:id="3" w:name="_Toc242003141"/>
+      <w:bookmarkStart w:id="3" w:name="_Toc242003182"/>
       <w:r>
         <w:rPr>
           <w:rFonts w:ascii="Times New Roman" w:hAnsi="Times New Roman"/>
@@ -4044,7 +4044,7 @@
       <w:pPr>
         <w:pStyle w:val="Ttulo2"/>
       </w:pPr>
-      <w:bookmarkStart w:id="4" w:name="_Toc242003142"/>
+      <w:bookmarkStart w:id="4" w:name="_Toc242003183"/>
       <w:r>
         <w:rPr>
           <w:rFonts w:ascii="Times New Roman" w:hAnsi="Times New Roman"/>
@@ -4766,7 +4766,7 @@
       <w:pPr>
         <w:pStyle w:val="Ttulo1"/>
       </w:pPr>
-      <w:bookmarkStart w:id="5" w:name="_Toc242003143"/>
+      <w:bookmarkStart w:id="5" w:name="_Toc242003184"/>
       <w:r>
         <w:rPr>
           <w:rFonts w:ascii="Times New Roman" w:hAnsi="Times New Roman"/>
@@ -4787,7 +4787,7 @@
       <w:pPr>
         <w:pStyle w:val="Ttulo2"/>
       </w:pPr>
-      <w:bookmarkStart w:id="6" w:name="_Toc242003144"/>
+      <w:bookmarkStart w:id="6" w:name="_Toc242003185"/>
       <w:r>
         <w:rPr>
           <w:rFonts w:ascii="Times New Roman" w:hAnsi="Times New Roman"/>
@@ -4840,7 +4840,7 @@
           <w:noProof/>
         </w:rPr>
         <w:drawing>
-          <wp:inline distT="0" distB="0" distL="0" distR="0" wp14:anchorId="5F479037" wp14:editId="5774856A">
+          <wp:inline distT="0" distB="0" distL="0" distR="0" wp14:anchorId="0BF6093E" wp14:editId="78CD3A01">
             <wp:extent cx="5940000" cy="5980838"/>
             <wp:effectExtent l="0" t="0" r="0" b="0"/>
             <wp:docPr id="1" name="Picture 1"/>
@@ -4895,7 +4895,7 @@
       <w:pPr>
         <w:pStyle w:val="Ttulo2"/>
       </w:pPr>
-      <w:bookmarkStart w:id="7" w:name="_Toc242003145"/>
+      <w:bookmarkStart w:id="7" w:name="_Toc242003186"/>
       <w:r>
         <w:rPr>
           <w:rFonts w:ascii="Times New Roman" w:hAnsi="Times New Roman"/>
@@ -4949,7 +4949,7 @@
           <w:noProof/>
         </w:rPr>
         <w:drawing>
-          <wp:inline distT="0" distB="0" distL="0" distR="0" wp14:anchorId="2C2F21E1" wp14:editId="27337D92">
+          <wp:inline distT="0" distB="0" distL="0" distR="0" wp14:anchorId="74373830" wp14:editId="05738526">
             <wp:extent cx="5940000" cy="5980838"/>
             <wp:effectExtent l="0" t="0" r="0" b="0"/>
             <wp:docPr id="2" name="Picture 2"/>
@@ -5004,7 +5004,7 @@
       <w:pPr>
         <w:pStyle w:val="Ttulo2"/>
       </w:pPr>
-      <w:bookmarkStart w:id="8" w:name="_Toc242003146"/>
+      <w:bookmarkStart w:id="8" w:name="_Toc242003187"/>
       <w:r>
         <w:rPr>
           <w:rFonts w:ascii="Times New Roman" w:hAnsi="Times New Roman"/>
@@ -5058,7 +5058,7 @@
           <w:noProof/>
         </w:rPr>
         <w:drawing>
-          <wp:inline distT="0" distB="0" distL="0" distR="0" wp14:anchorId="7D6512CA" wp14:editId="298EDDE6">
+          <wp:inline distT="0" distB="0" distL="0" distR="0" wp14:anchorId="3BC7B216" wp14:editId="7707C111">
             <wp:extent cx="5940000" cy="5980838"/>
             <wp:effectExtent l="0" t="0" r="0" b="0"/>
             <wp:docPr id="3" name="Picture 3"/>
@@ -5113,7 +5113,7 @@
       <w:pPr>
         <w:pStyle w:val="Ttulo2"/>
       </w:pPr>
-      <w:bookmarkStart w:id="9" w:name="_Toc242003147"/>
+      <w:bookmarkStart w:id="9" w:name="_Toc242003188"/>
       <w:r>
         <w:rPr>
           <w:rFonts w:ascii="Times New Roman" w:hAnsi="Times New Roman"/>
@@ -5167,7 +5167,7 @@
           <w:noProof/>
         </w:rPr>
         <w:drawing>
-          <wp:inline distT="0" distB="0" distL="0" distR="0" wp14:anchorId="68E3869C" wp14:editId="7BB00881">
+          <wp:inline distT="0" distB="0" distL="0" distR="0" wp14:anchorId="7F86A986" wp14:editId="6C227FB9">
             <wp:extent cx="5940000" cy="4744575"/>
             <wp:effectExtent l="0" t="0" r="0" b="0"/>
             <wp:docPr id="4" name="Picture 4"/>
@@ -5222,7 +5222,7 @@
       <w:pPr>
         <w:pStyle w:val="Ttulo2"/>
       </w:pPr>
-      <w:bookmarkStart w:id="10" w:name="_Toc242003148"/>
+      <w:bookmarkStart w:id="10" w:name="_Toc242003189"/>
       <w:r>
         <w:rPr>
           <w:rFonts w:ascii="Times New Roman" w:hAnsi="Times New Roman"/>
@@ -5293,7 +5293,7 @@
           <w:noProof/>
         </w:rPr>
         <w:drawing>
-          <wp:inline distT="0" distB="0" distL="0" distR="0" wp14:anchorId="2B43240B" wp14:editId="49CA721E">
+          <wp:inline distT="0" distB="0" distL="0" distR="0" wp14:anchorId="028ADAC4" wp14:editId="23F73CBD">
             <wp:extent cx="5940000" cy="5980838"/>
             <wp:effectExtent l="0" t="0" r="0" b="0"/>
             <wp:docPr id="5" name="Picture 5"/>
@@ -5348,7 +5348,7 @@
       <w:pPr>
         <w:pStyle w:val="Ttulo2"/>
       </w:pPr>
-      <w:bookmarkStart w:id="11" w:name="_Toc242003149"/>
+      <w:bookmarkStart w:id="11" w:name="_Toc242003190"/>
       <w:r>
         <w:rPr>
           <w:rFonts w:ascii="Times New Roman" w:hAnsi="Times New Roman"/>
@@ -5402,7 +5402,7 @@
           <w:noProof/>
         </w:rPr>
         <w:drawing>
-          <wp:inline distT="0" distB="0" distL="0" distR="0" wp14:anchorId="7688C49C" wp14:editId="77EB7B19">
+          <wp:inline distT="0" distB="0" distL="0" distR="0" wp14:anchorId="5EE1E698" wp14:editId="1B582E16">
             <wp:extent cx="5940000" cy="5568750"/>
             <wp:effectExtent l="0" t="0" r="0" b="0"/>
             <wp:docPr id="6" name="Picture 6"/>
@@ -5457,7 +5457,7 @@
       <w:pPr>
         <w:pStyle w:val="Ttulo2"/>
       </w:pPr>
-      <w:bookmarkStart w:id="12" w:name="_Toc242003150"/>
+      <w:bookmarkStart w:id="12" w:name="_Toc242003191"/>
       <w:r>
         <w:rPr>
           <w:rFonts w:ascii="Times New Roman" w:hAnsi="Times New Roman"/>
@@ -5510,7 +5510,7 @@
           <w:noProof/>
         </w:rPr>
         <w:drawing>
-          <wp:inline distT="0" distB="0" distL="0" distR="0" wp14:anchorId="1FDE539D" wp14:editId="2F3A664F">
+          <wp:inline distT="0" distB="0" distL="0" distR="0" wp14:anchorId="20ECC5CE" wp14:editId="366D3213">
             <wp:extent cx="5940000" cy="5156662"/>
             <wp:effectExtent l="0" t="0" r="0" b="0"/>
             <wp:docPr id="7" name="Picture 7"/>
@@ -5611,7 +5611,7 @@
           <w:noProof/>
         </w:rPr>
         <w:drawing>
-          <wp:inline distT="0" distB="0" distL="0" distR="0" wp14:anchorId="6E73A7FB" wp14:editId="66004CBB">
+          <wp:inline distT="0" distB="0" distL="0" distR="0" wp14:anchorId="1626CC43" wp14:editId="6976D325">
             <wp:extent cx="5940000" cy="5156662"/>
             <wp:effectExtent l="0" t="0" r="0" b="0"/>
             <wp:docPr id="8" name="Picture 8"/>
@@ -5666,7 +5666,7 @@
       <w:pPr>
         <w:pStyle w:val="Ttulo2"/>
       </w:pPr>
-      <w:bookmarkStart w:id="13" w:name="_Toc242003151"/>
+      <w:bookmarkStart w:id="13" w:name="_Toc242003192"/>
       <w:r>
         <w:rPr>
           <w:rFonts w:ascii="Times New Roman" w:hAnsi="Times New Roman"/>
@@ -6104,7 +6104,7 @@
       <w:pPr>
         <w:pStyle w:val="Ttulo1"/>
       </w:pPr>
-      <w:bookmarkStart w:id="14" w:name="_Toc242003152"/>
+      <w:bookmarkStart w:id="14" w:name="_Toc242003193"/>
       <w:r>
         <w:rPr>
           <w:rFonts w:ascii="Times New Roman" w:hAnsi="Times New Roman"/>
@@ -7089,7 +7089,7 @@
       <w:pPr>
         <w:pStyle w:val="Ttulo2"/>
       </w:pPr>
-      <w:bookmarkStart w:id="15" w:name="_Toc242003153"/>
+      <w:bookmarkStart w:id="15" w:name="_Toc242003194"/>
       <w:r>
         <w:rPr>
           <w:rFonts w:ascii="Times New Roman" w:hAnsi="Times New Roman"/>
@@ -7155,7 +7155,7 @@
       <w:pPr>
         <w:pStyle w:val="Ttulo2"/>
       </w:pPr>
-      <w:bookmarkStart w:id="16" w:name="_Toc242003154"/>
+      <w:bookmarkStart w:id="16" w:name="_Toc242003195"/>
       <w:r>
         <w:rPr>
           <w:rFonts w:ascii="Times New Roman" w:hAnsi="Times New Roman"/>
@@ -7206,7 +7206,7 @@
       <w:pPr>
         <w:pStyle w:val="Ttulo2"/>
       </w:pPr>
-      <w:bookmarkStart w:id="17" w:name="_Toc242003155"/>
+      <w:bookmarkStart w:id="17" w:name="_Toc242003196"/>
       <w:r>
         <w:rPr>
           <w:rFonts w:ascii="Times New Roman" w:hAnsi="Times New Roman"/>
@@ -7248,7 +7248,7 @@
       <w:pPr>
         <w:pStyle w:val="Ttulo2"/>
       </w:pPr>
-      <w:bookmarkStart w:id="18" w:name="_Toc242003156"/>
+      <w:bookmarkStart w:id="18" w:name="_Toc242003197"/>
       <w:r>
         <w:rPr>
           <w:rFonts w:ascii="Times New Roman" w:hAnsi="Times New Roman"/>
@@ -7287,7 +7287,7 @@
       <w:pPr>
         <w:pStyle w:val="Ttulo2"/>
       </w:pPr>
-      <w:bookmarkStart w:id="19" w:name="_Toc242003157"/>
+      <w:bookmarkStart w:id="19" w:name="_Toc242003198"/>
       <w:r>
         <w:rPr>
           <w:rFonts w:ascii="Times New Roman" w:hAnsi="Times New Roman"/>
@@ -7308,7 +7308,7 @@
       <w:pPr>
         <w:pStyle w:val="Ttulo2"/>
       </w:pPr>
-      <w:bookmarkStart w:id="20" w:name="_Toc242003158"/>
+      <w:bookmarkStart w:id="20" w:name="_Toc242003199"/>
       <w:r>
         <w:rPr>
           <w:rFonts w:ascii="Times New Roman" w:hAnsi="Times New Roman"/>
@@ -7332,7 +7332,7 @@
       <w:pPr>
         <w:pStyle w:val="Ttulo1"/>
       </w:pPr>
-      <w:bookmarkStart w:id="21" w:name="_Toc242003159"/>
+      <w:bookmarkStart w:id="21" w:name="_Toc242003200"/>
       <w:r>
         <w:rPr>
           <w:rFonts w:ascii="Times New Roman" w:hAnsi="Times New Roman"/>
@@ -7346,7 +7346,7 @@
       <w:pPr>
         <w:pStyle w:val="Ttulo2"/>
       </w:pPr>
-      <w:bookmarkStart w:id="22" w:name="_Toc242003160"/>
+      <w:bookmarkStart w:id="22" w:name="_Toc242003201"/>
       <w:r>
         <w:rPr>
           <w:rFonts w:ascii="Times New Roman" w:hAnsi="Times New Roman"/>
@@ -7986,7 +7986,7 @@
       <w:pPr>
         <w:pStyle w:val="Ttulo2"/>
       </w:pPr>
-      <w:bookmarkStart w:id="23" w:name="_Toc242003161"/>
+      <w:bookmarkStart w:id="23" w:name="_Toc242003202"/>
       <w:r>
         <w:rPr>
           <w:rFonts w:ascii="Times New Roman" w:hAnsi="Times New Roman"/>
@@ -8383,7 +8383,7 @@
       <w:pPr>
         <w:pStyle w:val="Ttulo2"/>
       </w:pPr>
-      <w:bookmarkStart w:id="24" w:name="_Toc242003162"/>
+      <w:bookmarkStart w:id="24" w:name="_Toc242003203"/>
       <w:r>
         <w:rPr>
           <w:rFonts w:ascii="Times New Roman" w:hAnsi="Times New Roman"/>
@@ -8593,7 +8593,7 @@
       <w:pPr>
         <w:pStyle w:val="Ttulo2"/>
       </w:pPr>
-      <w:bookmarkStart w:id="25" w:name="_Toc242003163"/>
+      <w:bookmarkStart w:id="25" w:name="_Toc242003204"/>
       <w:r>
         <w:rPr>
           <w:rFonts w:ascii="Times New Roman" w:hAnsi="Times New Roman"/>
@@ -9095,7 +9095,7 @@
       <w:pPr>
         <w:pStyle w:val="Ttulo2"/>
       </w:pPr>
-      <w:bookmarkStart w:id="26" w:name="_Toc242003164"/>
+      <w:bookmarkStart w:id="26" w:name="_Toc242003205"/>
       <w:r>
         <w:rPr>
           <w:rFonts w:ascii="Times New Roman" w:hAnsi="Times New Roman"/>
@@ -9682,7 +9682,7 @@
       <w:pPr>
         <w:pStyle w:val="Ttulo2"/>
       </w:pPr>
-      <w:bookmarkStart w:id="27" w:name="_Toc242003165"/>
+      <w:bookmarkStart w:id="27" w:name="_Toc242003206"/>
       <w:r>
         <w:rPr>
           <w:rFonts w:ascii="Times New Roman" w:hAnsi="Times New Roman"/>
@@ -9807,7 +9807,7 @@
       <w:pPr>
         <w:pStyle w:val="Ttulo2"/>
       </w:pPr>
-      <w:bookmarkStart w:id="28" w:name="_Toc242003166"/>
+      <w:bookmarkStart w:id="28" w:name="_Toc242003207"/>
       <w:r>
         <w:rPr>
           <w:rFonts w:ascii="Times New Roman" w:hAnsi="Times New Roman"/>
@@ -10180,7 +10180,7 @@
       <w:pPr>
         <w:pStyle w:val="Ttulo2"/>
       </w:pPr>
-      <w:bookmarkStart w:id="29" w:name="_Toc242003167"/>
+      <w:bookmarkStart w:id="29" w:name="_Toc242003208"/>
       <w:r>
         <w:rPr>
           <w:rFonts w:ascii="Times New Roman" w:hAnsi="Times New Roman"/>
@@ -10219,7 +10219,7 @@
       <w:pPr>
         <w:pStyle w:val="Ttulo1"/>
       </w:pPr>
-      <w:bookmarkStart w:id="30" w:name="_Toc242003168"/>
+      <w:bookmarkStart w:id="30" w:name="_Toc242003209"/>
       <w:r>
         <w:rPr>
           <w:rFonts w:ascii="Times New Roman" w:hAnsi="Times New Roman"/>
@@ -10232,7 +10232,7 @@
       <w:pPr>
         <w:pStyle w:val="Ttulo2"/>
       </w:pPr>
-      <w:bookmarkStart w:id="31" w:name="_Toc242003169"/>
+      <w:bookmarkStart w:id="31" w:name="_Toc242003210"/>
       <w:r>
         <w:rPr>
           <w:rFonts w:ascii="Times New Roman" w:hAnsi="Times New Roman"/>
@@ -10274,7 +10274,7 @@
       <w:pPr>
         <w:pStyle w:val="Ttulo2"/>
       </w:pPr>
-      <w:bookmarkStart w:id="32" w:name="_Toc242003170"/>
+      <w:bookmarkStart w:id="32" w:name="_Toc242003211"/>
       <w:r>
         <w:rPr>
           <w:rFonts w:ascii="Times New Roman" w:hAnsi="Times New Roman"/>
@@ -10902,7 +10902,7 @@
       <w:pPr>
         <w:pStyle w:val="Ttulo2"/>
       </w:pPr>
-      <w:bookmarkStart w:id="33" w:name="_Toc242003171"/>
+      <w:bookmarkStart w:id="33" w:name="_Toc242003212"/>
       <w:r>
         <w:rPr>
           <w:rFonts w:ascii="Times New Roman" w:hAnsi="Times New Roman"/>
@@ -11428,7 +11428,7 @@
       <w:pPr>
         <w:pStyle w:val="Ttulo1"/>
       </w:pPr>
-      <w:bookmarkStart w:id="34" w:name="_Toc242003172"/>
+      <w:bookmarkStart w:id="34" w:name="_Toc242003213"/>
       <w:r>
         <w:rPr>
           <w:rFonts w:ascii="Times New Roman" w:hAnsi="Times New Roman"/>
@@ -11441,7 +11441,7 @@
       <w:pPr>
         <w:pStyle w:val="Ttulo2"/>
       </w:pPr>
-      <w:bookmarkStart w:id="35" w:name="_Toc242003173"/>
+      <w:bookmarkStart w:id="35" w:name="_Toc242003214"/>
       <w:r>
         <w:rPr>
           <w:rFonts w:ascii="Times New Roman" w:hAnsi="Times New Roman"/>
@@ -11462,7 +11462,7 @@
       <w:pPr>
         <w:pStyle w:val="Ttulo2"/>
       </w:pPr>
-      <w:bookmarkStart w:id="36" w:name="_Toc242003174"/>
+      <w:bookmarkStart w:id="36" w:name="_Toc242003215"/>
       <w:r>
         <w:rPr>
           <w:rFonts w:ascii="Times New Roman" w:hAnsi="Times New Roman"/>
@@ -12016,7 +12016,7 @@
       <w:pPr>
         <w:pStyle w:val="Ttulo2"/>
       </w:pPr>
-      <w:bookmarkStart w:id="37" w:name="_Toc242003175"/>
+      <w:bookmarkStart w:id="37" w:name="_Toc242003216"/>
       <w:r>
         <w:rPr>
           <w:rFonts w:ascii="Times New Roman" w:hAnsi="Times New Roman"/>
@@ -12327,7 +12327,7 @@
       <w:pPr>
         <w:pStyle w:val="Ttulo2"/>
       </w:pPr>
-      <w:bookmarkStart w:id="38" w:name="_Toc242003176"/>
+      <w:bookmarkStart w:id="38" w:name="_Toc242003217"/>
       <w:r>
         <w:rPr>
           <w:rFonts w:ascii="Times New Roman" w:hAnsi="Times New Roman"/>
@@ -13177,7 +13177,7 @@
       <w:pPr>
         <w:pStyle w:val="Ttulo1"/>
       </w:pPr>
-      <w:bookmarkStart w:id="39" w:name="_Toc242003177"/>
+      <w:bookmarkStart w:id="39" w:name="_Toc242003218"/>
       <w:r>
         <w:rPr>
           <w:rFonts w:ascii="Times New Roman" w:hAnsi="Times New Roman"/>
@@ -13190,7 +13190,7 @@
       <w:pPr>
         <w:pStyle w:val="Ttulo2"/>
       </w:pPr>
-      <w:bookmarkStart w:id="40" w:name="_Toc242003178"/>
+      <w:bookmarkStart w:id="40" w:name="_Toc242003219"/>
       <w:r>
         <w:rPr>
           <w:rFonts w:ascii="Times New Roman" w:hAnsi="Times New Roman"/>
@@ -13253,7 +13253,7 @@
       <w:pPr>
         <w:pStyle w:val="Ttulo2"/>
       </w:pPr>
-      <w:bookmarkStart w:id="41" w:name="_Toc242003179"/>
+      <w:bookmarkStart w:id="41" w:name="_Toc242003220"/>
       <w:r>
         <w:rPr>
           <w:rFonts w:ascii="Times New Roman" w:hAnsi="Times New Roman"/>
@@ -13296,7 +13296,7 @@
       <w:pPr>
         <w:pStyle w:val="Ttulo1"/>
       </w:pPr>
-      <w:bookmarkStart w:id="42" w:name="_Toc242003180"/>
+      <w:bookmarkStart w:id="42" w:name="_Toc242003221"/>
       <w:r>
         <w:rPr>
           <w:rFonts w:ascii="Times New Roman" w:hAnsi="Times New Roman"/>
@@ -13423,7 +13423,7 @@
       <w:pPr>
         <w:pStyle w:val="Ttulo1"/>
       </w:pPr>
-      <w:bookmarkStart w:id="43" w:name="_Toc242003181"/>
+      <w:bookmarkStart w:id="43" w:name="_Toc242003222"/>
       <w:r>
         <w:rPr>
           <w:rFonts w:ascii="Times New Roman" w:hAnsi="Times New Roman"/>
@@ -13865,31 +13865,31 @@
       </w:rPr>
     </w:lvl>
   </w:abstractNum>
-  <w:num w:numId="1" w16cid:durableId="1555585090">
+  <w:num w:numId="1" w16cid:durableId="1636790119">
     <w:abstractNumId w:val="8"/>
   </w:num>
-  <w:num w:numId="2" w16cid:durableId="1588224558">
+  <w:num w:numId="2" w16cid:durableId="1280796105">
     <w:abstractNumId w:val="6"/>
   </w:num>
-  <w:num w:numId="3" w16cid:durableId="102112107">
+  <w:num w:numId="3" w16cid:durableId="110174252">
     <w:abstractNumId w:val="5"/>
   </w:num>
-  <w:num w:numId="4" w16cid:durableId="265115190">
+  <w:num w:numId="4" w16cid:durableId="676421707">
     <w:abstractNumId w:val="4"/>
   </w:num>
-  <w:num w:numId="5" w16cid:durableId="574632420">
+  <w:num w:numId="5" w16cid:durableId="1602303455">
     <w:abstractNumId w:val="7"/>
   </w:num>
-  <w:num w:numId="6" w16cid:durableId="92673974">
+  <w:num w:numId="6" w16cid:durableId="526022526">
     <w:abstractNumId w:val="3"/>
   </w:num>
-  <w:num w:numId="7" w16cid:durableId="868372701">
+  <w:num w:numId="7" w16cid:durableId="11805707">
     <w:abstractNumId w:val="2"/>
   </w:num>
-  <w:num w:numId="8" w16cid:durableId="1487167598">
+  <w:num w:numId="8" w16cid:durableId="1536625399">
     <w:abstractNumId w:val="1"/>
   </w:num>
-  <w:num w:numId="9" w16cid:durableId="1506823887">
+  <w:num w:numId="9" w16cid:durableId="265231099">
     <w:abstractNumId w:val="0"/>
   </w:num>
 </w:numbering>
@@ -25285,7 +25285,7 @@
     <w:autoRedefine/>
     <w:uiPriority w:val="39"/>
     <w:unhideWhenUsed/>
-    <w:rsid w:val="00040F9B"/>
+    <w:rsid w:val="00D22597"/>
     <w:pPr>
       <w:spacing w:after="100"/>
     </w:pPr>
@@ -25297,7 +25297,7 @@
     <w:autoRedefine/>
     <w:uiPriority w:val="39"/>
     <w:unhideWhenUsed/>
-    <w:rsid w:val="00040F9B"/>
+    <w:rsid w:val="00D22597"/>
     <w:pPr>
       <w:spacing w:after="100"/>
       <w:ind w:left="240"/>
@@ -25308,7 +25308,7 @@
     <w:basedOn w:val="Fuentedeprrafopredeter"/>
     <w:uiPriority w:val="99"/>
     <w:unhideWhenUsed/>
-    <w:rsid w:val="00040F9B"/>
+    <w:rsid w:val="00D22597"/>
     <w:rPr>
       <w:color w:val="0000FF" w:themeColor="hyperlink"/>
       <w:u w:val="single"/>

</xml_diff>